<commit_message>
Update report on e-commerce data analysis and machine learning applications
</commit_message>
<xml_diff>
--- a/docs/reports/bao-cao-tien-do.docx
+++ b/docs/reports/bao-cao-tien-do.docx
@@ -841,16 +841,31 @@
           <w:szCs w:val="26"/>
           <w:lang w:val="pt-BR"/>
         </w:rPr>
-        <w:t xml:space="preserve">Điển hình cho sự dịch chuyển mang tính bước ngoặt này là công trình nghiên cứu nền tảng của Sakar và cộng sự (2019) được công bố trên tạp chí khoa học danh giá Neural Computing and Applications. Nhóm tác giả đã chứng minh bằng các thực nghiệm nghiêm ngặt rằng, những tín hiệu mua hàng thực sự của người tiêu dùng thường không nằm ở bề nổi mà ẩn sâu trong các chỉ số hành vi vi mô vô cùng phức tạp. Đó có thể là những biến số như giá trị quy đổi của một trang web (PageValues), thời gian lưu lại để xem xét thông tin chi tiết tại một sản phẩm, hay tỷ lệ dội trang (BounceRates) khi người dùng mất kiên nhẫn. Để có thể xử lý và trích xuất tri thức từ một không gian dữ liệu đa chiều, có tính phi tuyến cao và biến thiên liên tục như </w:t>
-      </w:r>
-      <w:r>
-        <w:rPr>
-          <w:sz w:val="26"/>
-          <w:szCs w:val="26"/>
-          <w:lang w:val="pt-BR"/>
-        </w:rPr>
-        <w:lastRenderedPageBreak/>
-        <w:t>vậy, các kiến trúc học máy tiên tiến đang dần thay thế hoàn toàn các mô hình thống kê truyền thống. Các thuật toán học máy tiên tiến như Random Forest hay Neural Network đã được ứng dụng rộng rãi nhờ khả năng tổng hợp hàng chục biến số hành vi cùng lúc để nhận diện và phân loại khách hàng. Nổi bật nhất trong kỷ nguyên này là công trình của Chen và Guestrin (2016), những người đã giới thiệu thuật toán XGBoost (Extreme Gradient Boosting). Thuật toán học tăng cường này nhanh chóng trở thành tiêu chuẩn công nghiệp mới nhờ khả năng tối ưu hóa hàm mất mát và kiểm soát hiện tượng quá khớp (Overfitting) vượt trội khi phân tích chuỗi hành vi phức tạp của người dùng.</w:t>
+        <w:t>Điển hình cho sự dịch chuyển mang tính bước ngoặt này là công trình nghiên cứu nền tảng của Sakar và cộng sự (2019) được công bố trên tạp chí khoa học danh giá Neural Computing and Applications</w:t>
+      </w:r>
+      <w:r>
+        <w:rPr>
+          <w:sz w:val="26"/>
+          <w:szCs w:val="26"/>
+          <w:lang w:val="pt-BR"/>
+        </w:rPr>
+        <w:t xml:space="preserve"> </w:t>
+      </w:r>
+      <w:r>
+        <w:rPr>
+          <w:sz w:val="26"/>
+          <w:szCs w:val="26"/>
+          <w:lang w:val="pt-BR"/>
+        </w:rPr>
+        <w:t>[7]</w:t>
+      </w:r>
+      <w:r>
+        <w:rPr>
+          <w:sz w:val="26"/>
+          <w:szCs w:val="26"/>
+          <w:lang w:val="pt-BR"/>
+        </w:rPr>
+        <w:t xml:space="preserve">. Nhóm tác giả đã chứng minh bằng các thực nghiệm nghiêm ngặt rằng, những tín hiệu mua hàng thực sự của người tiêu dùng thường không nằm ở bề nổi mà ẩn sâu trong các chỉ số hành vi vi mô vô cùng phức tạp. Đó có thể là những biến số như giá trị quy đổi của một trang web (PageValues), thời gian lưu lại để xem xét thông tin chi tiết tại một sản phẩm, hay tỷ lệ dội trang (BounceRates) khi người dùng mất kiên nhẫn. </w:t>
       </w:r>
     </w:p>
     <w:p>
@@ -871,23 +886,56 @@
           <w:szCs w:val="26"/>
           <w:lang w:val="pt-BR"/>
         </w:rPr>
-        <w:t>Tuy nhiên, song song với sự tiến bộ của các thuật toán mô hình hóa, một thách thức học thuật vô cùng lớn mà cả thế giới đang phải đối mặt khi xử lý dữ liệu thương mại điện tử chính là tình trạng mất cân bằng lớp nội tại của bộ dữ liệu. Dữ liệu thực tế được thu thập từ các nền tảng luôn cho thấy tỷ lệ chuyển đổi thường nằm ở mức rất thấp, dẫn đến hệ quả tất yếu là việc nhóm khách hàng có hành vi mua sắm thực sự luôn bị áp đảo hoàn toàn bởi một lớp đa số khổng lồ là những khách hàng chỉ truy cập để xem dạo. Tại thị trường Việt Nam, bối cảnh này cũng không có sự ngoại lệ. Theo các báo cáo uy tín về nền kinh tế số khu vực Đông Nam Á</w:t>
-      </w:r>
-      <w:r>
-        <w:rPr>
-          <w:sz w:val="26"/>
-          <w:szCs w:val="26"/>
-          <w:lang w:val="pt-BR"/>
-        </w:rPr>
-        <w:t xml:space="preserve"> </w:t>
-      </w:r>
-      <w:r>
-        <w:rPr>
-          <w:sz w:val="26"/>
-          <w:szCs w:val="26"/>
-          <w:lang w:val="pt-BR"/>
-        </w:rPr>
-        <w:t>như báo cáo e-Conomy SEA, quy mô thương mại điện tử tại Việt Nam đang bùng nổ mạnh mẽ với sự cạnh tranh khốc liệt của các sàn giao dịch lớn. Tuy nhiên, các công trình nghiên cứu ứng dụng Trí tuệ Nhân tạo của các doanh nghiệp bán lẻ trong nước chủ yếu vẫn chỉ dừng lại ở các bài toán bề nổi. Phổ biến nhất là việc xây dựng các hệ thống gợi ý sản phẩm dựa trên lịch sử mua hàng, hoặc phân tích cảm xúc văn bản qua bình luận, hoàn toàn khuyết thiếu những nghiên cứu chuyên sâu đi vào việc giải quyết hiện tượng thiên lệch dữ liệu này trong việc dự báo hành vi thời gian thực. Cần phải nhấn mạnh rằng, nếu chỉ sử dụng đơn thuần chỉ số độ chính xác tổng thể để huấn luyện và đánh giá trên các tập dữ liệu mất cân bằng này, hệ thống sẽ đưa ra những đánh giá sai lệch, thiên vị lớp đa số và gây hiểu lầm nghiêm trọng về hiệu năng thực tế của mô hình khi triển khai vào môi trường thực tiễn.</w:t>
+        <w:lastRenderedPageBreak/>
+        <w:t xml:space="preserve">Để có thể xử lý và trích xuất tri thức từ một không gian dữ liệu đa chiều, có tính phi tuyến cao và biến thiên liên tục như vậy, các kiến trúc học máy tiên tiến đang dần thay thế hoàn toàn các mô hình thống kê truyền thống. Các thuật toán học máy tiên tiến như Random Forest </w:t>
+      </w:r>
+      <w:r>
+        <w:rPr>
+          <w:sz w:val="26"/>
+          <w:szCs w:val="26"/>
+          <w:lang w:val="pt-BR"/>
+        </w:rPr>
+        <w:t xml:space="preserve">[1] </w:t>
+      </w:r>
+      <w:r>
+        <w:rPr>
+          <w:sz w:val="26"/>
+          <w:szCs w:val="26"/>
+          <w:lang w:val="pt-BR"/>
+        </w:rPr>
+        <w:t xml:space="preserve">hay Neural Network </w:t>
+      </w:r>
+      <w:r>
+        <w:rPr>
+          <w:sz w:val="26"/>
+          <w:szCs w:val="26"/>
+          <w:lang w:val="pt-BR"/>
+        </w:rPr>
+        <w:t xml:space="preserve">[7] </w:t>
+      </w:r>
+      <w:r>
+        <w:rPr>
+          <w:sz w:val="26"/>
+          <w:szCs w:val="26"/>
+          <w:lang w:val="pt-BR"/>
+        </w:rPr>
+        <w:t>đã được ứng dụng rộng rãi nhờ khả năng tổng hợp hàng chục biến số hành vi cùng lúc để nhận diện và phân loại khách hàng. Nổi bật nhất trong kỷ nguyên này là công trình của Chen và Guestrin (2016), những người đã giới thiệu thuật toán XGBoost (Extreme Gradient Boosting)</w:t>
+      </w:r>
+      <w:r>
+        <w:rPr>
+          <w:sz w:val="26"/>
+          <w:szCs w:val="26"/>
+          <w:lang w:val="pt-BR"/>
+        </w:rPr>
+        <w:t xml:space="preserve"> [3]</w:t>
+      </w:r>
+      <w:r>
+        <w:rPr>
+          <w:sz w:val="26"/>
+          <w:szCs w:val="26"/>
+          <w:lang w:val="pt-BR"/>
+        </w:rPr>
+        <w:t>. Thuật toán học tăng cường này nhanh chóng trở thành tiêu chuẩn công nghiệp mới nhờ khả năng tối ưu hóa hàm mất mát và kiểm soát hiện tượng quá khớp (Overfitting) vượt trội khi phân tích chuỗi hành vi phức tạp của người dùng.</w:t>
       </w:r>
     </w:p>
     <w:p>
@@ -908,16 +956,39 @@
           <w:szCs w:val="26"/>
           <w:lang w:val="pt-BR"/>
         </w:rPr>
-        <w:t xml:space="preserve">Sự thiếu hụt nghiêm trọng trong các nghiên cứu ứng dụng này càng trở nên cấp thiết hơn bao giờ hết khi đối chiếu trực tiếp với thực tiễn vận hành của các doanh nghiệp. Sự bùng nổ về số lượng người dùng internet, cùng với sự đa dạng của các nền </w:t>
-      </w:r>
-      <w:r>
-        <w:rPr>
-          <w:sz w:val="26"/>
-          <w:szCs w:val="26"/>
-          <w:lang w:val="pt-BR"/>
-        </w:rPr>
-        <w:lastRenderedPageBreak/>
-        <w:t>tảng mua sắm, đã dẫn đến một thách thức mới vô cùng khốc liệt là việc "cạnh tranh về sự chú ý". Hay nói cách khác, đó là cuộc chiến để người dùng nhận diện sản phẩm, thương hiệu và hàng hóa tiêu dùng trong một không gian mạng ngập tràn thông tin. Người dùng hiện đại ngày càng có xu hướng lướt web mua hàng trực tuyến nhiều hơn, họ dành thời gian tham khảo và so sánh cả về chất lượng lẫn giá cả một cách vô cùng kỹ lưỡng, nhưng đồng thời, họ lại ngần ngại và khó tính hơn rất nhiều trong việc ra quyết định thanh toán cuối cùng. Điều này tạo ra một nghịch lý vô cùng đau đầu đối với các nhà quản lý doanh nghiệp bán lẻ: lưu lượng truy cập đổ về website tăng trưởng mạnh mẽ, tốn kém rất nhiều chi phí duy trì hệ thống, nhưng tỷ lệ chuyển đổi chốt đơn lại không tăng trưởng tương ứng. Hậu quả của nghịch lý này là việc lãng phí nguồn lực marketing khổng lồ vào việc chạy quảng cáo và gửi khuyến mãi cho những khách hàng hoàn toàn không có nhu cầu thực sự.</w:t>
+        <w:t>Tuy nhiên, song song với sự tiến bộ của các thuật toán mô hình hóa, một thách thức học thuật vô cùng lớn mà cả thế giới đang phải đối mặt khi xử lý dữ liệu thương mại điện tử chính là tình trạng mất cân bằng lớp nội tại của bộ dữ liệu. Dữ liệu thực tế được thu thập từ các nền tảng luôn cho thấy tỷ lệ chuyển đổi thường nằm ở mức rất thấp, dẫn đến hệ quả tất yếu là việc nhóm khách hàng có hành vi mua sắm thực sự luôn bị áp đảo hoàn toàn bởi một lớp đa số khổng lồ là những khách hàng chỉ truy cập để xem dạo. Tại thị trường Việt Nam, bối cảnh này cũng không có sự ngoại lệ. Theo các báo cáo uy tín về nền kinh tế số khu vực Đông Nam Á</w:t>
+      </w:r>
+      <w:r>
+        <w:rPr>
+          <w:sz w:val="26"/>
+          <w:szCs w:val="26"/>
+          <w:lang w:val="pt-BR"/>
+        </w:rPr>
+        <w:t xml:space="preserve"> </w:t>
+      </w:r>
+      <w:r>
+        <w:rPr>
+          <w:sz w:val="26"/>
+          <w:szCs w:val="26"/>
+          <w:lang w:val="pt-BR"/>
+        </w:rPr>
+        <w:t>như báo cáo e-Conomy SEA, quy mô thương mại điện tử tại Việt Nam đang bùng nổ mạnh mẽ với sự cạnh tranh khốc liệt của các sàn giao dịch lớn. Tuy nhiên, các công trình nghiên cứu ứng dụng Trí tuệ Nhân tạo của các doanh nghiệp bán lẻ trong nước chủ yếu vẫn chỉ dừng lại ở các bài toán bề nổi. Phổ biến nhất là việc xây dựng các hệ thống gợi ý sản phẩm dựa trên lịch sử mua hàng, hoặc phân tích cảm xúc văn bản qua bình luận, hoàn toàn khuyết thiếu những nghiên cứu chuyên sâu đi vào việc giải quyết hiện tượng thiên lệch dữ liệu này trong việc dự báo hành vi thời gian thực</w:t>
+      </w:r>
+      <w:r>
+        <w:rPr>
+          <w:sz w:val="26"/>
+          <w:szCs w:val="26"/>
+          <w:lang w:val="pt-BR"/>
+        </w:rPr>
+        <w:t xml:space="preserve"> [10]</w:t>
+      </w:r>
+      <w:r>
+        <w:rPr>
+          <w:sz w:val="26"/>
+          <w:szCs w:val="26"/>
+          <w:lang w:val="pt-BR"/>
+        </w:rPr>
+        <w:t>. Cần phải nhấn mạnh rằng, nếu chỉ sử dụng đơn thuần chỉ số độ chính xác tổng thể để huấn luyện và đánh giá trên các tập dữ liệu mất cân bằng này, hệ thống sẽ đưa ra những đánh giá sai lệch, thiên vị lớp đa số và gây hiểu lầm nghiêm trọng về hiệu năng thực tế của mô hình khi triển khai vào môi trường thực tiễn.</w:t>
       </w:r>
     </w:p>
     <w:p>
@@ -938,23 +1009,16 @@
           <w:szCs w:val="26"/>
           <w:lang w:val="pt-BR"/>
         </w:rPr>
-        <w:t>Thực trạng đáng báo động này không chỉ là những suy đoán lý thuyết mà đã được phản ánh và chứng minh bằng các định lượng thống kê vô cùng rõ nét thông qua việc phân tích bộ dữ liệu thực tế về hành vi mua sắm trực tuyến được sử dụng làm cơ sở cho nghiên cứu này. Cụ thể, khi phân tích tập dữ liệu đầu vào, trong tổng số 12.330 mẫu quan sát đại diện cho các phiên truy cập độc lập của người dùng, có tới 10.422 phiên truy cập (chiếm tỷ lệ áp đảo khoảng 84,53%) là người dùng chỉ lướt xem các danh mục sản phẩm và rời đi mà không thực hiện bất kỳ một giao dịch thanh toán nào. Trong khi đó, toàn bộ hệ thống chỉ ghi nhận được vỏn vẹn 1.908 phiên truy cập (tương đương với mức 15,47%) là có mang lại doanh thu thực tế cho nền tảng. Tỷ lệ chênh lệch xấp xỉ 1:5.5 này đã đặt tập dữ liệu vào một trạng thái mất cân bằng lớp vô cùng nghiêm trọng. Những con số biết nói này là minh chứng đanh thép khẳng định rằng: nếu doanh nghiệp vẫn giữ tư duy cũ, tiếp tục duy trì các phương pháp tiếp thị truyền thống vốn dựa trên các quy tắc tĩnh hoặc nhân khẩu học đơn thuần, thì họ sẽ tiếp tục</w:t>
-      </w:r>
-      <w:r>
-        <w:rPr>
-          <w:sz w:val="26"/>
-          <w:szCs w:val="26"/>
-          <w:lang w:val="pt-BR"/>
-        </w:rPr>
-        <w:t xml:space="preserve"> đầu tư</w:t>
-      </w:r>
-      <w:r>
-        <w:rPr>
-          <w:sz w:val="26"/>
-          <w:szCs w:val="26"/>
-          <w:lang w:val="pt-BR"/>
-        </w:rPr>
-        <w:t xml:space="preserve"> một cách vô nghĩa để thu hút 85% lượng truy cập vô hình kia, thay vì dồn toàn lực để tập trung chăm sóc và tối ưu hóa trải nghiệm cho nhóm khách hàng tiềm năng vốn đã rất ít ỏi. Nếu không có sự can thiệp của công nghệ để nhận diện sớm nhóm 15,47% khách hàng giá trị này, doanh nghiệp chắc chắn sẽ đối mặt với sự thiếu hiệu quả trầm trọng và bào mòn lợi nhuận.</w:t>
+        <w:t xml:space="preserve">Sự thiếu hụt nghiêm trọng trong các nghiên cứu ứng dụng này càng trở nên cấp thiết hơn bao giờ hết khi đối chiếu trực tiếp với thực tiễn vận hành của các doanh </w:t>
+      </w:r>
+      <w:r>
+        <w:rPr>
+          <w:sz w:val="26"/>
+          <w:szCs w:val="26"/>
+          <w:lang w:val="pt-BR"/>
+        </w:rPr>
+        <w:lastRenderedPageBreak/>
+        <w:t>nghiệp. Sự bùng nổ về số lượng người dùng internet, cùng với sự đa dạng của các nền tảng mua sắm, đã dẫn đến một thách thức mới vô cùng khốc liệt là việc "cạnh tranh về sự chú ý". Hay nói cách khác, đó là cuộc chiến để người dùng nhận diện sản phẩm, thương hiệu và hàng hóa tiêu dùng trong một không gian mạng ngập tràn thông tin. Người dùng hiện đại ngày càng có xu hướng lướt web mua hàng trực tuyến nhiều hơn, họ dành thời gian tham khảo và so sánh cả về chất lượng lẫn giá cả một cách vô cùng kỹ lưỡng, nhưng đồng thời, họ lại ngần ngại và khó tính hơn rất nhiều trong việc ra quyết định thanh toán cuối cùng. Điều này tạo ra một nghịch lý vô cùng đau đầu đối với các nhà quản lý doanh nghiệp bán lẻ: lưu lượng truy cập đổ về website tăng trưởng mạnh mẽ, tốn kém rất nhiều chi phí duy trì hệ thống, nhưng tỷ lệ chuyển đổi chốt đơn lại không tăng trưởng tương ứng. Hậu quả của nghịch lý này là việc lãng phí nguồn lực marketing khổng lồ vào việc chạy quảng cáo và gửi khuyến mãi cho những khách hàng hoàn toàn không có nhu cầu thực sự.</w:t>
       </w:r>
     </w:p>
     <w:p>
@@ -975,8 +1039,154 @@
           <w:szCs w:val="26"/>
           <w:lang w:val="pt-BR"/>
         </w:rPr>
+        <w:t>Thực trạng đáng báo động này không chỉ là những suy đoán lý thuyết mà đã được phản ánh và chứng minh bằng các định lượng thống kê vô cùng rõ nét thông qua việc phân tích bộ dữ liệu thực tế về hành vi mua sắm trực tuyến được sử dụng làm cơ sở cho nghiên cứu này</w:t>
+      </w:r>
+      <w:r>
+        <w:rPr>
+          <w:sz w:val="26"/>
+          <w:szCs w:val="26"/>
+          <w:lang w:val="pt-BR"/>
+        </w:rPr>
+        <w:t xml:space="preserve"> [12]</w:t>
+      </w:r>
+      <w:r>
+        <w:rPr>
+          <w:sz w:val="26"/>
+          <w:szCs w:val="26"/>
+          <w:lang w:val="pt-BR"/>
+        </w:rPr>
+        <w:t>. Cụ thể, khi phân tích tập dữ liệu đầu vào, trong tổng số 12.330 mẫu quan sát đại diện cho các phiên truy cập độc lập của người dùng, có tới 10.422 phiên truy cập (chiếm tỷ lệ áp đảo khoảng 84,53%) là người dùng chỉ lướt xem các danh mục sản phẩm và rời đi mà không thực hiện bất kỳ một giao dịch thanh toán nào</w:t>
+      </w:r>
+      <w:r>
+        <w:rPr>
+          <w:sz w:val="26"/>
+          <w:szCs w:val="26"/>
+          <w:lang w:val="pt-BR"/>
+        </w:rPr>
+        <w:t xml:space="preserve"> [12]</w:t>
+      </w:r>
+      <w:r>
+        <w:rPr>
+          <w:sz w:val="26"/>
+          <w:szCs w:val="26"/>
+          <w:lang w:val="pt-BR"/>
+        </w:rPr>
+        <w:t>. Trong khi đó, toàn bộ hệ thống chỉ ghi nhận được vỏn vẹn 1.908 phiên truy cập (tương đương với mức 15,47%) là có mang lại doanh thu thực tế cho nền tảng</w:t>
+      </w:r>
+      <w:r>
+        <w:rPr>
+          <w:sz w:val="26"/>
+          <w:szCs w:val="26"/>
+          <w:lang w:val="pt-BR"/>
+        </w:rPr>
+        <w:t xml:space="preserve"> [12]</w:t>
+      </w:r>
+      <w:r>
+        <w:rPr>
+          <w:sz w:val="26"/>
+          <w:szCs w:val="26"/>
+          <w:lang w:val="pt-BR"/>
+        </w:rPr>
+        <w:t>. Tỷ lệ chênh lệch xấp xỉ 1:5.5 này đã đặt tập dữ liệu vào một trạng thái mất cân bằng lớp vô cùng nghiêm trọng</w:t>
+      </w:r>
+      <w:r>
+        <w:rPr>
+          <w:sz w:val="26"/>
+          <w:szCs w:val="26"/>
+          <w:lang w:val="pt-BR"/>
+        </w:rPr>
+        <w:t xml:space="preserve"> [12]</w:t>
+      </w:r>
+      <w:r>
+        <w:rPr>
+          <w:sz w:val="26"/>
+          <w:szCs w:val="26"/>
+          <w:lang w:val="pt-BR"/>
+        </w:rPr>
+        <w:t xml:space="preserve">. </w:t>
+      </w:r>
+    </w:p>
+    <w:p>
+      <w:pPr>
+        <w:pStyle w:val="NormalWeb"/>
+        <w:spacing w:before="0" w:beforeAutospacing="0" w:after="0" w:afterAutospacing="0" w:line="360" w:lineRule="auto"/>
+        <w:ind w:firstLine="567"/>
+        <w:jc w:val="both"/>
+        <w:rPr>
+          <w:sz w:val="26"/>
+          <w:szCs w:val="26"/>
+          <w:lang w:val="pt-BR"/>
+        </w:rPr>
+      </w:pPr>
+      <w:r>
+        <w:rPr>
+          <w:sz w:val="26"/>
+          <w:szCs w:val="26"/>
+          <w:lang w:val="pt-BR"/>
+        </w:rPr>
+        <w:t>Những con số biết nói này là minh chứng đanh thép khẳng định rằng: nếu doanh nghiệp vẫn giữ tư duy cũ, tiếp tục duy trì các phương pháp tiếp thị truyền thống vốn dựa trên các quy tắc tĩnh hoặc nhân khẩu học đơn thuần, thì họ sẽ tiếp tục</w:t>
+      </w:r>
+      <w:r>
+        <w:rPr>
+          <w:sz w:val="26"/>
+          <w:szCs w:val="26"/>
+          <w:lang w:val="pt-BR"/>
+        </w:rPr>
+        <w:t xml:space="preserve"> đầu tư</w:t>
+      </w:r>
+      <w:r>
+        <w:rPr>
+          <w:sz w:val="26"/>
+          <w:szCs w:val="26"/>
+          <w:lang w:val="pt-BR"/>
+        </w:rPr>
+        <w:t xml:space="preserve"> một cách vô nghĩa để thu hút 85% lượng truy cập vô hình kia, thay vì dồn toàn lực để tập trung chăm sóc và tối ưu hóa trải nghiệm cho nhóm khách hàng tiềm năng vốn đã rất ít ỏi. Nếu không có sự can thiệp của công nghệ để nhận diện sớm nhóm 15,47% khách </w:t>
+      </w:r>
+      <w:r>
+        <w:rPr>
+          <w:sz w:val="26"/>
+          <w:szCs w:val="26"/>
+          <w:lang w:val="pt-BR"/>
+        </w:rPr>
         <w:lastRenderedPageBreak/>
-        <w:t xml:space="preserve">Đứng trước khối lượng dữ liệu khổng lồ với hàng nghìn điểm chạm tương tác sinh ra mỗi giây trên hệ thống, con người hoàn toàn không thể theo dõi, tổng hợp và phân tích thủ công trong thời gian thực để đưa ra các quyết định tiếp thị chính xác. Đây chính là lúc Trí tuệ nhân tạo (AI) và các thuật toán học máy (Machine Learning) trở thành một lời giải bắt buộc mang tính sống còn, chứ không còn là một lựa chọn công nghệ mang tính chất xa xỉ để phô diễn. Các thuật toán này có khả năng nội suy các quy luật ẩn, tự động cập nhật và đưa ra dự báo xác suất mua hàng của từng cá nhân ngay trong khi họ đang điều hướng trên website, từ đó kích hoạt các chiến dịch can thiệp tức thời. Xuất phát từ nhu cầu cấp thiết trong việc tối ưu hóa chi phí vận hành, giải quyết bài toán mất cân bằng lớp trong học thuật, và mục tiêu lớn nhất là chuyển dịch từ tư duy tiếp thị đại trà sang tiếp thị chính xác, chúng em quyết định thực hiện xây dựng đề tài </w:t>
+        <w:t>hàng giá trị này, doanh nghiệp chắc chắn sẽ đối mặt với sự thiếu hiệu quả trầm trọng và bào mòn lợi nhuận.</w:t>
+      </w:r>
+    </w:p>
+    <w:p>
+      <w:pPr>
+        <w:pStyle w:val="NormalWeb"/>
+        <w:spacing w:before="0" w:beforeAutospacing="0" w:after="0" w:afterAutospacing="0" w:line="360" w:lineRule="auto"/>
+        <w:ind w:firstLine="567"/>
+        <w:jc w:val="both"/>
+        <w:rPr>
+          <w:sz w:val="26"/>
+          <w:szCs w:val="26"/>
+          <w:lang w:val="pt-BR"/>
+        </w:rPr>
+      </w:pPr>
+      <w:r>
+        <w:rPr>
+          <w:sz w:val="26"/>
+          <w:szCs w:val="26"/>
+          <w:lang w:val="pt-BR"/>
+        </w:rPr>
+        <w:t>Đứng trước khối lượng dữ liệu khổng lồ với hàng nghìn điểm chạm tương tác sinh ra mỗi giây trên hệ thống, con người hoàn toàn không thể theo dõi, tổng hợp và phân tích thủ công trong thời gian thực để đưa ra các quyết định tiếp thị chính xác. Đây chính là lúc Trí tuệ nhân tạo (AI) và các thuật toán học máy (Machine Learning) trở thành một lời giải bắt buộc mang tính sống còn, chứ không còn là một lựa chọn công nghệ mang tính chất xa xỉ để phô diễn</w:t>
+      </w:r>
+      <w:r>
+        <w:rPr>
+          <w:sz w:val="26"/>
+          <w:szCs w:val="26"/>
+          <w:lang w:val="pt-BR"/>
+        </w:rPr>
+        <w:t xml:space="preserve"> [6, 9]</w:t>
+      </w:r>
+      <w:r>
+        <w:rPr>
+          <w:sz w:val="26"/>
+          <w:szCs w:val="26"/>
+          <w:lang w:val="pt-BR"/>
+        </w:rPr>
+        <w:t xml:space="preserve">. Các thuật toán này có khả năng nội suy các quy luật ẩn, tự động cập nhật và đưa ra dự báo xác suất mua hàng của từng cá nhân ngay trong khi họ đang điều hướng trên website, từ đó kích hoạt các chiến dịch can thiệp tức thời. Xuất phát từ nhu cầu cấp thiết trong việc tối ưu hóa chi phí vận hành, giải quyết bài toán mất cân bằng lớp trong học thuật, và mục tiêu lớn nhất là chuyển dịch từ tư duy tiếp thị đại trà sang tiếp thị chính xác, chúng em quyết định thực hiện xây dựng đề tài </w:t>
       </w:r>
       <w:r>
         <w:rPr>
@@ -1182,7 +1392,7 @@
           <w:lang w:val="pt-BR" w:bidi="ar-SA"/>
           <w14:ligatures w14:val="none"/>
         </w:rPr>
-        <w:t xml:space="preserve"> để dự báo xác suất chốt đơn ngay trong phiên truy cập. Để lấp đầy khoảng trống nghiên cứu này, mục tiêu cốt lõi của đề tài là xây dựng và triển khai một hệ thống hỗ trợ ra quyết định thông minh dựa trên </w:t>
+        <w:t xml:space="preserve"> để dự báo xác suất chốt đơn ngay trong phiên truy cập</w:t>
       </w:r>
       <w:r>
         <w:rPr>
@@ -1193,7 +1403,7 @@
           <w:lang w:val="pt-BR" w:bidi="ar-SA"/>
           <w14:ligatures w14:val="none"/>
         </w:rPr>
-        <w:t>t</w:t>
+        <w:t xml:space="preserve"> </w:t>
       </w:r>
       <w:r>
         <w:rPr>
@@ -1204,7 +1414,74 @@
           <w:lang w:val="pt-BR" w:bidi="ar-SA"/>
           <w14:ligatures w14:val="none"/>
         </w:rPr>
-        <w:t>rí tuệ nhân tạo. Hệ thống này có nhiệm vụ khai phá dữ liệu hành vi của người dùng trong thời gian thực, xử lý triệt để bài toán mất cân bằng lớp tự nhiên của nền tảng, từ đó dự báo chính xác xác suất mua hàng. Từ kết quả dự báo toán học, hệ thống sẽ tự động chuyển hóa thành các tác vụ kích cầu thông minh nhằm tối ưu hóa tỷ lệ chuyển đổi và gia tăng doanh thu bền vững cho doanh nghiệp.</w:t>
+        <w:t>[1</w:t>
+      </w:r>
+      <w:r>
+        <w:rPr>
+          <w:rFonts w:ascii="Times New Roman" w:eastAsia="Times New Roman" w:hAnsi="Times New Roman" w:cs="Times New Roman"/>
+          <w:kern w:val="0"/>
+          <w:sz w:val="26"/>
+          <w:szCs w:val="26"/>
+          <w:lang w:val="pt-BR" w:bidi="ar-SA"/>
+          <w14:ligatures w14:val="none"/>
+        </w:rPr>
+        <w:t>0</w:t>
+      </w:r>
+      <w:r>
+        <w:rPr>
+          <w:rFonts w:ascii="Times New Roman" w:eastAsia="Times New Roman" w:hAnsi="Times New Roman" w:cs="Times New Roman"/>
+          <w:kern w:val="0"/>
+          <w:sz w:val="26"/>
+          <w:szCs w:val="26"/>
+          <w:lang w:val="pt-BR" w:bidi="ar-SA"/>
+          <w14:ligatures w14:val="none"/>
+        </w:rPr>
+        <w:t>]</w:t>
+      </w:r>
+      <w:r>
+        <w:rPr>
+          <w:rFonts w:ascii="Times New Roman" w:eastAsia="Times New Roman" w:hAnsi="Times New Roman" w:cs="Times New Roman"/>
+          <w:kern w:val="0"/>
+          <w:sz w:val="26"/>
+          <w:szCs w:val="26"/>
+          <w:lang w:val="pt-BR" w:bidi="ar-SA"/>
+          <w14:ligatures w14:val="none"/>
+        </w:rPr>
+        <w:t xml:space="preserve">. Để lấp đầy khoảng trống nghiên cứu này, mục tiêu cốt lõi của đề tài là xây dựng và triển khai một hệ thống hỗ trợ ra quyết định thông minh dựa trên </w:t>
+      </w:r>
+      <w:r>
+        <w:rPr>
+          <w:rFonts w:ascii="Times New Roman" w:eastAsia="Times New Roman" w:hAnsi="Times New Roman" w:cs="Times New Roman"/>
+          <w:kern w:val="0"/>
+          <w:sz w:val="26"/>
+          <w:szCs w:val="26"/>
+          <w:lang w:val="pt-BR" w:bidi="ar-SA"/>
+          <w14:ligatures w14:val="none"/>
+        </w:rPr>
+        <w:t>t</w:t>
+      </w:r>
+      <w:r>
+        <w:rPr>
+          <w:rFonts w:ascii="Times New Roman" w:eastAsia="Times New Roman" w:hAnsi="Times New Roman" w:cs="Times New Roman"/>
+          <w:kern w:val="0"/>
+          <w:sz w:val="26"/>
+          <w:szCs w:val="26"/>
+          <w:lang w:val="pt-BR" w:bidi="ar-SA"/>
+          <w14:ligatures w14:val="none"/>
+        </w:rPr>
+        <w:t xml:space="preserve">rí tuệ nhân tạo. Hệ thống này có nhiệm vụ khai phá dữ liệu hành vi của người dùng trong thời gian thực, xử lý triệt để bài toán mất cân bằng lớp tự nhiên của nền tảng, từ đó dự báo chính xác xác suất mua hàng. Từ kết quả dự báo toán học, hệ thống sẽ tự động chuyển hóa thành các tác vụ kích cầu thông </w:t>
+      </w:r>
+      <w:r>
+        <w:rPr>
+          <w:rFonts w:ascii="Times New Roman" w:eastAsia="Times New Roman" w:hAnsi="Times New Roman" w:cs="Times New Roman"/>
+          <w:kern w:val="0"/>
+          <w:sz w:val="26"/>
+          <w:szCs w:val="26"/>
+          <w:lang w:val="pt-BR" w:bidi="ar-SA"/>
+          <w14:ligatures w14:val="none"/>
+        </w:rPr>
+        <w:lastRenderedPageBreak/>
+        <w:t>minh nhằm tối ưu hóa tỷ lệ chuyển đổi và gia tăng doanh thu bền vững cho doanh nghiệp.</w:t>
       </w:r>
     </w:p>
     <w:p>
@@ -1256,7 +1533,6 @@
           <w:szCs w:val="26"/>
           <w:lang w:val="pt-BR"/>
         </w:rPr>
-        <w:lastRenderedPageBreak/>
         <w:t xml:space="preserve">Để hiện thực hóa mục tiêu tổng quát là xây dựng một hệ thống Trí tuệ Nhân tạo hỗ trợ ra quyết định toàn diện, đề tài tiến hành phân rã và thực thi 4 nhóm mục tiêu cụ thể, bám sát theo quy trình chuẩn mực của một dự án </w:t>
       </w:r>
       <w:r>
@@ -1375,7 +1651,52 @@
           <w:szCs w:val="26"/>
           <w:lang w:val="pt-BR"/>
         </w:rPr>
-        <w:t xml:space="preserve">Trước khi tiến hành mô hình hóa, hệ thống cần thấu hiểu sâu sắc cấu trúc dữ liệu đầu vào. Mục tiêu của giai đoạn này là bóc tách không gian đặc trưng đa chiều để xác định các biến số độc lập mang ý nghĩa thống kê quyết định đối với xác suất chốt đơn. </w:t>
+        <w:t>Trước khi tiến hành mô hình hóa, hệ thống cần thấu hiểu sâu sắc cấu trúc dữ liệu đầu vào. Mục tiêu của giai đoạn này là bóc tách không gian đặc trưng đa chiều để xác định các biến số độc lập mang ý nghĩa thống kê quyết định đối với xác suất chốt đơn</w:t>
+      </w:r>
+      <w:r>
+        <w:rPr>
+          <w:rFonts w:ascii="Times New Roman" w:hAnsi="Times New Roman"/>
+          <w:sz w:val="26"/>
+          <w:szCs w:val="26"/>
+          <w:lang w:val="pt-BR"/>
+        </w:rPr>
+        <w:t xml:space="preserve"> </w:t>
+      </w:r>
+      <w:r>
+        <w:rPr>
+          <w:rFonts w:ascii="Times New Roman" w:hAnsi="Times New Roman"/>
+          <w:sz w:val="26"/>
+          <w:szCs w:val="26"/>
+          <w:lang w:val="pt-BR"/>
+        </w:rPr>
+        <w:t>[1</w:t>
+      </w:r>
+      <w:r>
+        <w:rPr>
+          <w:rFonts w:ascii="Times New Roman" w:hAnsi="Times New Roman"/>
+          <w:sz w:val="26"/>
+          <w:szCs w:val="26"/>
+          <w:lang w:val="pt-BR"/>
+        </w:rPr>
+        <w:t>2</w:t>
+      </w:r>
+      <w:r>
+        <w:rPr>
+          <w:rFonts w:ascii="Times New Roman" w:hAnsi="Times New Roman"/>
+          <w:sz w:val="26"/>
+          <w:szCs w:val="26"/>
+          <w:lang w:val="pt-BR"/>
+        </w:rPr>
+        <w:t>]</w:t>
+      </w:r>
+      <w:r>
+        <w:rPr>
+          <w:rFonts w:ascii="Times New Roman" w:hAnsi="Times New Roman"/>
+          <w:sz w:val="26"/>
+          <w:szCs w:val="26"/>
+          <w:lang w:val="pt-BR"/>
+        </w:rPr>
+        <w:t xml:space="preserve">. </w:t>
       </w:r>
       <w:r>
         <w:rPr>
@@ -1472,7 +1793,31 @@
           <w:sz w:val="26"/>
           <w:szCs w:val="26"/>
         </w:rPr>
-        <w:t>).</w:t>
+        <w:t>)</w:t>
+      </w:r>
+      <w:r>
+        <w:rPr>
+          <w:rFonts w:ascii="Times New Roman" w:hAnsi="Times New Roman"/>
+          <w:sz w:val="26"/>
+          <w:szCs w:val="26"/>
+        </w:rPr>
+        <w:t xml:space="preserve"> </w:t>
+      </w:r>
+      <w:r>
+        <w:rPr>
+          <w:rFonts w:ascii="Times New Roman" w:hAnsi="Times New Roman" w:cs="Times New Roman"/>
+          <w:sz w:val="26"/>
+          <w:szCs w:val="26"/>
+        </w:rPr>
+        <w:t>[12]</w:t>
+      </w:r>
+      <w:r>
+        <w:rPr>
+          <w:rFonts w:ascii="Times New Roman" w:hAnsi="Times New Roman"/>
+          <w:sz w:val="26"/>
+          <w:szCs w:val="26"/>
+        </w:rPr>
+        <w:t>.</w:t>
       </w:r>
     </w:p>
     <w:p>
@@ -1509,6 +1854,22 @@
       </w:r>
       <w:r>
         <w:rPr>
+          <w:rFonts w:ascii="Times New Roman" w:eastAsia="Times New Roman" w:hAnsi="Times New Roman"/>
+          <w:sz w:val="26"/>
+          <w:szCs w:val="26"/>
+        </w:rPr>
+        <w:t xml:space="preserve"> </w:t>
+      </w:r>
+      <w:r>
+        <w:rPr>
+          <w:rFonts w:ascii="Times New Roman" w:hAnsi="Times New Roman" w:cs="Times New Roman"/>
+          <w:sz w:val="26"/>
+          <w:szCs w:val="26"/>
+        </w:rPr>
+        <w:t>[12]</w:t>
+      </w:r>
+      <w:r>
+        <w:rPr>
           <w:rFonts w:ascii="Times New Roman" w:hAnsi="Times New Roman"/>
           <w:sz w:val="26"/>
           <w:szCs w:val="26"/>
@@ -1538,7 +1899,31 @@
           <w:sz w:val="26"/>
           <w:szCs w:val="26"/>
         </w:rPr>
-        <w:t>Phân khúc hành vi người dùng: Tiến hành phân lớp và đối chiếu đối tượng truy cập để xây dựng chân dung khách hàng. Đo lường sự khác biệt về mức độ rủi ro rời bỏ trang và khả năng chốt đơn giữa nhóm khách hàng mới tiếp cận và nhóm khách hàng có độ trung thành cao.</w:t>
+        <w:t>Phân khúc hành vi người dùng: Tiến hành phân lớp và đối chiếu đối tượng truy cập để xây dựng chân dung khách hàng. Đo lường sự khác biệt về mức độ rủi ro rời bỏ trang và khả năng chốt đơn giữa nhóm khách hàng mới tiếp cận và nhóm khách hàng có độ trung thành cao</w:t>
+      </w:r>
+      <w:r>
+        <w:rPr>
+          <w:rFonts w:ascii="Times New Roman" w:hAnsi="Times New Roman"/>
+          <w:sz w:val="26"/>
+          <w:szCs w:val="26"/>
+        </w:rPr>
+        <w:t xml:space="preserve"> </w:t>
+      </w:r>
+      <w:r>
+        <w:rPr>
+          <w:rFonts w:ascii="Times New Roman" w:hAnsi="Times New Roman" w:cs="Times New Roman"/>
+          <w:sz w:val="26"/>
+          <w:szCs w:val="26"/>
+        </w:rPr>
+        <w:t>[12]</w:t>
+      </w:r>
+      <w:r>
+        <w:rPr>
+          <w:rFonts w:ascii="Times New Roman" w:hAnsi="Times New Roman"/>
+          <w:sz w:val="26"/>
+          <w:szCs w:val="26"/>
+        </w:rPr>
+        <w:t>.</w:t>
       </w:r>
     </w:p>
     <w:p>
@@ -1596,7 +1981,31 @@
           <w:sz w:val="26"/>
           <w:szCs w:val="26"/>
         </w:rPr>
-        <w:t>Đây là mục tiêu mang tính sống còn của đề tài nhằm giải quyết triệt để sự phân phối bất đối xứng của dữ liệu thương mại điện tử thực tế (tỷ lệ chênh lệch xấp xỉ 1:5.5 giữa lớp Không mua và lớp Mua). Các khía cạnh kỹ thuật được thực thi bao gồm:</w:t>
+        <w:t>Đây là mục tiêu mang tính sống còn của đề tài nhằm giải quyết triệt để sự phân phối bất đối xứng của dữ liệu thương mại điện tử thực tế (tỷ lệ chênh lệch xấp xỉ 1:5.5 giữa lớp Không mua và lớp Mua)</w:t>
+      </w:r>
+      <w:r>
+        <w:rPr>
+          <w:rFonts w:ascii="Times New Roman" w:hAnsi="Times New Roman"/>
+          <w:sz w:val="26"/>
+          <w:szCs w:val="26"/>
+        </w:rPr>
+        <w:t xml:space="preserve"> </w:t>
+      </w:r>
+      <w:r>
+        <w:rPr>
+          <w:rFonts w:ascii="Times New Roman" w:hAnsi="Times New Roman"/>
+          <w:sz w:val="26"/>
+          <w:szCs w:val="26"/>
+        </w:rPr>
+        <w:t>[12]</w:t>
+      </w:r>
+      <w:r>
+        <w:rPr>
+          <w:rFonts w:ascii="Times New Roman" w:hAnsi="Times New Roman"/>
+          <w:sz w:val="26"/>
+          <w:szCs w:val="26"/>
+        </w:rPr>
+        <w:t>. Các khía cạnh kỹ thuật được thực thi bao gồm:</w:t>
       </w:r>
     </w:p>
     <w:p>
@@ -1621,7 +2030,16 @@
           <w:sz w:val="26"/>
           <w:szCs w:val="26"/>
         </w:rPr>
-        <w:t xml:space="preserve">Data Cleaning &amp; Encoding: Thực hiện loại bỏ hoàn toàn các bản ghi trùng lặp để ngăn chặn hiện tượng rò rỉ thông tin khiến mô hình học vẹt. Chuyển đổi toàn bộ không gian định tính sang định lượng: sử dụng One-Hot Encoding cho các biến danh mục không có tính thứ bậc như </w:t>
+        <w:t xml:space="preserve">Data Cleaning &amp; Encoding: Thực hiện loại bỏ hoàn toàn các bản ghi trùng lặp để ngăn chặn hiện tượng rò rỉ thông tin khiến mô hình học vẹt. Chuyển đổi toàn </w:t>
+      </w:r>
+      <w:r>
+        <w:rPr>
+          <w:rFonts w:ascii="Times New Roman" w:hAnsi="Times New Roman"/>
+          <w:sz w:val="26"/>
+          <w:szCs w:val="26"/>
+        </w:rPr>
+        <w:lastRenderedPageBreak/>
+        <w:t xml:space="preserve">bộ không gian định tính sang định lượng: sử dụng One-Hot Encoding cho các biến danh mục không có tính thứ bậc như </w:t>
       </w:r>
       <w:r>
         <w:rPr>
@@ -1669,16 +2087,7 @@
           <w:sz w:val="26"/>
           <w:szCs w:val="26"/>
         </w:rPr>
-        <w:t xml:space="preserve"> để </w:t>
-      </w:r>
-      <w:r>
-        <w:rPr>
-          <w:rFonts w:ascii="Times New Roman" w:hAnsi="Times New Roman"/>
-          <w:sz w:val="26"/>
-          <w:szCs w:val="26"/>
-        </w:rPr>
-        <w:lastRenderedPageBreak/>
-        <w:t xml:space="preserve">triệt tiêu sự hiểu lầm về độ lớn; áp dụng Label Encoding cho các biến có tính chu kỳ như </w:t>
+        <w:t xml:space="preserve"> để triệt tiêu sự hiểu lầm về độ lớn; áp dụng Label Encoding cho các biến có tính chu kỳ như </w:t>
       </w:r>
       <w:r>
         <w:rPr>
@@ -1785,7 +2194,23 @@
           <w:sz w:val="26"/>
           <w:szCs w:val="26"/>
         </w:rPr>
-        <w:t xml:space="preserve">Resampling via SMOTE: Đối diện với nguy cơ mô hình dự báo bị thiên vị (Bias) lớp đa số, nghiên cứu thiết lập mục tiêu nội suy dữ liệu thiểu số bằng thuật toán SMOTE (Synthetic Minority Over-sampling Technique). Cơ chế này chỉ được áp dụng duy nhất và cô lập trên </w:t>
+        <w:t>Resampling via SMOTE: Đối diện với nguy cơ mô hình dự báo bị thiên vị (Bias) lớp đa số, nghiên cứu thiết lập mục tiêu nội suy dữ liệu thiểu số bằng thuật toán SMOTE (Synthetic Minority Over-sampling Technique)</w:t>
+      </w:r>
+      <w:r>
+        <w:rPr>
+          <w:rFonts w:ascii="Times New Roman" w:hAnsi="Times New Roman"/>
+          <w:sz w:val="26"/>
+          <w:szCs w:val="26"/>
+        </w:rPr>
+        <w:t xml:space="preserve"> [2]</w:t>
+      </w:r>
+      <w:r>
+        <w:rPr>
+          <w:rFonts w:ascii="Times New Roman" w:hAnsi="Times New Roman"/>
+          <w:sz w:val="26"/>
+          <w:szCs w:val="26"/>
+        </w:rPr>
+        <w:t xml:space="preserve">. Cơ chế này chỉ được áp dụng duy nhất và cô lập trên </w:t>
       </w:r>
       <w:r>
         <w:rPr>
@@ -1801,7 +2226,79 @@
           <w:sz w:val="26"/>
           <w:szCs w:val="26"/>
         </w:rPr>
-        <w:t>ập huấn luyện. Thay vì sao chép các mẫu cũ, SMOTE sẽ tính toán khoảng cách k-NN để tự sinh ra các điểm dữ liệu nhân tạo mới dọc theo các đoạn thẳng nối các mẫu thiểu số. Kỹ thuật này giúp tái thiết lập mật độ cân bằng cho không gian đặc trưng, cung cấp đủ thông tin để bề mặt siêu phẳng phân tách trở nên sắc nét, đảm bảo mô hình không bỏ lọt khách hàng tiềm năng.</w:t>
+        <w:t>ập huấn luyện</w:t>
+      </w:r>
+      <w:r>
+        <w:rPr>
+          <w:rFonts w:ascii="Times New Roman" w:hAnsi="Times New Roman"/>
+          <w:sz w:val="26"/>
+          <w:szCs w:val="26"/>
+        </w:rPr>
+        <w:t xml:space="preserve"> </w:t>
+      </w:r>
+      <w:r>
+        <w:rPr>
+          <w:rFonts w:ascii="Times New Roman" w:hAnsi="Times New Roman" w:cs="Times New Roman"/>
+          <w:sz w:val="26"/>
+          <w:szCs w:val="26"/>
+        </w:rPr>
+        <w:t>[2]</w:t>
+      </w:r>
+      <w:r>
+        <w:rPr>
+          <w:rFonts w:ascii="Times New Roman" w:hAnsi="Times New Roman"/>
+          <w:sz w:val="26"/>
+          <w:szCs w:val="26"/>
+        </w:rPr>
+        <w:t>. Thay vì sao chép các mẫu cũ, SMOTE sẽ tính toán khoảng cách k-NN để tự sinh ra các điểm dữ liệu nhân tạo mới dọc theo các đoạn thẳng nối các mẫu thiểu số</w:t>
+      </w:r>
+      <w:r>
+        <w:rPr>
+          <w:rFonts w:ascii="Times New Roman" w:hAnsi="Times New Roman"/>
+          <w:sz w:val="26"/>
+          <w:szCs w:val="26"/>
+        </w:rPr>
+        <w:t xml:space="preserve"> </w:t>
+      </w:r>
+      <w:r>
+        <w:rPr>
+          <w:rFonts w:ascii="Times New Roman" w:hAnsi="Times New Roman" w:cs="Times New Roman"/>
+          <w:sz w:val="26"/>
+          <w:szCs w:val="26"/>
+        </w:rPr>
+        <w:t>[2]</w:t>
+      </w:r>
+      <w:r>
+        <w:rPr>
+          <w:rFonts w:ascii="Times New Roman" w:hAnsi="Times New Roman"/>
+          <w:sz w:val="26"/>
+          <w:szCs w:val="26"/>
+        </w:rPr>
+        <w:t>. Kỹ thuật này giúp tái thiết lập mật độ cân bằng cho không gian đặc trưng, cung cấp đủ thông tin để bề mặt siêu phẳng phân tách trở nên sắc nét, đảm bảo mô hình không bỏ lọt khách hàng tiềm năng</w:t>
+      </w:r>
+      <w:r>
+        <w:rPr>
+          <w:rFonts w:ascii="Times New Roman" w:hAnsi="Times New Roman"/>
+          <w:sz w:val="26"/>
+          <w:szCs w:val="26"/>
+        </w:rPr>
+        <w:t xml:space="preserve"> </w:t>
+      </w:r>
+      <w:r>
+        <w:rPr>
+          <w:rFonts w:ascii="Times New Roman" w:hAnsi="Times New Roman" w:cs="Times New Roman"/>
+          <w:sz w:val="26"/>
+          <w:szCs w:val="26"/>
+        </w:rPr>
+        <w:t>[2]</w:t>
+      </w:r>
+      <w:r>
+        <w:rPr>
+          <w:rFonts w:ascii="Times New Roman" w:hAnsi="Times New Roman"/>
+          <w:sz w:val="26"/>
+          <w:szCs w:val="26"/>
+        </w:rPr>
+        <w:t>.</w:t>
       </w:r>
     </w:p>
     <w:p>
@@ -1912,11 +2409,67 @@
       </w:r>
       <w:r>
         <w:rPr>
-          <w:rFonts w:ascii="Times New Roman" w:hAnsi="Times New Roman"/>
-          <w:sz w:val="26"/>
-          <w:szCs w:val="26"/>
-        </w:rPr>
-        <w:t>và nền tảng học tăng cường tối ưu hóa hàm mất mát (Extreme Gradient Boosting - XGBoost).</w:t>
+          <w:rFonts w:ascii="Times New Roman" w:hAnsi="Times New Roman" w:cs="Times New Roman"/>
+          <w:sz w:val="26"/>
+          <w:szCs w:val="26"/>
+        </w:rPr>
+        <w:t>[1]</w:t>
+      </w:r>
+      <w:r>
+        <w:rPr>
+          <w:rFonts w:ascii="Times New Roman" w:hAnsi="Times New Roman" w:cs="Times New Roman"/>
+          <w:sz w:val="26"/>
+          <w:szCs w:val="26"/>
+        </w:rPr>
+        <w:t xml:space="preserve"> </w:t>
+      </w:r>
+      <w:r>
+        <w:rPr>
+          <w:rFonts w:ascii="Times New Roman" w:hAnsi="Times New Roman"/>
+          <w:sz w:val="26"/>
+          <w:szCs w:val="26"/>
+        </w:rPr>
+        <w:t>và nền tảng học tăng cường tối ưu hóa hàm mất mát (Extreme Gradient Boosting - XGBoost)</w:t>
+      </w:r>
+      <w:r>
+        <w:rPr>
+          <w:rFonts w:ascii="Times New Roman" w:hAnsi="Times New Roman"/>
+          <w:sz w:val="26"/>
+          <w:szCs w:val="26"/>
+        </w:rPr>
+        <w:t xml:space="preserve"> </w:t>
+      </w:r>
+      <w:r>
+        <w:rPr>
+          <w:rFonts w:ascii="Times New Roman" w:hAnsi="Times New Roman" w:cs="Times New Roman"/>
+          <w:sz w:val="26"/>
+          <w:szCs w:val="26"/>
+        </w:rPr>
+        <w:t>[</w:t>
+      </w:r>
+      <w:r>
+        <w:rPr>
+          <w:rFonts w:ascii="Times New Roman" w:hAnsi="Times New Roman" w:cs="Times New Roman"/>
+          <w:sz w:val="26"/>
+          <w:szCs w:val="26"/>
+        </w:rPr>
+        <w:t>3</w:t>
+      </w:r>
+      <w:r>
+        <w:rPr>
+          <w:rFonts w:ascii="Times New Roman" w:hAnsi="Times New Roman" w:cs="Times New Roman"/>
+          <w:sz w:val="26"/>
+          <w:szCs w:val="26"/>
+        </w:rPr>
+        <w:t>]</w:t>
+      </w:r>
+      <w:r>
+        <w:rPr>
+          <w:rFonts w:ascii="Times New Roman" w:hAnsi="Times New Roman"/>
+          <w:sz w:val="26"/>
+          <w:szCs w:val="26"/>
+        </w:rPr>
+        <w:t>.</w:t>
       </w:r>
     </w:p>
     <w:p>
@@ -1941,6 +2494,7 @@
           <w:sz w:val="26"/>
           <w:szCs w:val="26"/>
         </w:rPr>
+        <w:lastRenderedPageBreak/>
         <w:t xml:space="preserve">Hyperparameter Tuning: Tiến hành dò tìm không gian tham số tối ưu như độ sâu của cây </w:t>
       </w:r>
       <w:r>
@@ -1973,7 +2527,47 @@
           <w:sz w:val="26"/>
           <w:szCs w:val="26"/>
         </w:rPr>
-        <w:t xml:space="preserve"> trong XGBoost, hay số cụm </w:t>
+        <w:t xml:space="preserve"> trong XGBoost</w:t>
+      </w:r>
+      <w:r>
+        <w:rPr>
+          <w:rFonts w:ascii="Times New Roman" w:hAnsi="Times New Roman"/>
+          <w:sz w:val="26"/>
+          <w:szCs w:val="26"/>
+        </w:rPr>
+        <w:t xml:space="preserve"> </w:t>
+      </w:r>
+      <w:r>
+        <w:rPr>
+          <w:rFonts w:ascii="Times New Roman" w:hAnsi="Times New Roman" w:cs="Times New Roman"/>
+          <w:sz w:val="26"/>
+          <w:szCs w:val="26"/>
+        </w:rPr>
+        <w:t>[</w:t>
+      </w:r>
+      <w:r>
+        <w:rPr>
+          <w:rFonts w:ascii="Times New Roman" w:hAnsi="Times New Roman" w:cs="Times New Roman"/>
+          <w:sz w:val="26"/>
+          <w:szCs w:val="26"/>
+        </w:rPr>
+        <w:t>3</w:t>
+      </w:r>
+      <w:r>
+        <w:rPr>
+          <w:rFonts w:ascii="Times New Roman" w:hAnsi="Times New Roman" w:cs="Times New Roman"/>
+          <w:sz w:val="26"/>
+          <w:szCs w:val="26"/>
+        </w:rPr>
+        <w:t>]</w:t>
+      </w:r>
+      <w:r>
+        <w:rPr>
+          <w:rFonts w:ascii="Times New Roman" w:hAnsi="Times New Roman"/>
+          <w:sz w:val="26"/>
+          <w:szCs w:val="26"/>
+        </w:rPr>
+        <w:t xml:space="preserve">, hay số cụm </w:t>
       </w:r>
       <w:r>
         <w:rPr>
@@ -1989,16 +2583,7 @@
           <w:sz w:val="26"/>
           <w:szCs w:val="26"/>
         </w:rPr>
-        <w:t xml:space="preserve"> </w:t>
-      </w:r>
-      <w:r>
-        <w:rPr>
-          <w:rFonts w:ascii="Times New Roman" w:hAnsi="Times New Roman"/>
-          <w:sz w:val="26"/>
-          <w:szCs w:val="26"/>
-        </w:rPr>
-        <w:lastRenderedPageBreak/>
-        <w:t xml:space="preserve">trong K-NN nhằm cực tiểu hóa hiện tượng </w:t>
+        <w:t xml:space="preserve"> trong K-NN nhằm cực tiểu hóa hiện tượng </w:t>
       </w:r>
       <w:r>
         <w:rPr>
@@ -2103,7 +2688,47 @@
           <w:sz w:val="26"/>
           <w:szCs w:val="26"/>
         </w:rPr>
-        <w:t>iện tích dưới đường cong (AUC-ROC &gt; 0.90), đồng thời tập trung cân bằng giữa việc tìm đúng và phát hiện đủ</w:t>
+        <w:t>iện tích dưới đường cong (AUC-ROC &gt; 0.90)</w:t>
+      </w:r>
+      <w:r>
+        <w:rPr>
+          <w:rFonts w:ascii="Times New Roman" w:hAnsi="Times New Roman"/>
+          <w:sz w:val="26"/>
+          <w:szCs w:val="26"/>
+        </w:rPr>
+        <w:t xml:space="preserve"> </w:t>
+      </w:r>
+      <w:r>
+        <w:rPr>
+          <w:rFonts w:ascii="Times New Roman" w:hAnsi="Times New Roman" w:cs="Times New Roman"/>
+          <w:sz w:val="26"/>
+          <w:szCs w:val="26"/>
+        </w:rPr>
+        <w:t>[</w:t>
+      </w:r>
+      <w:r>
+        <w:rPr>
+          <w:rFonts w:ascii="Times New Roman" w:hAnsi="Times New Roman" w:cs="Times New Roman"/>
+          <w:sz w:val="26"/>
+          <w:szCs w:val="26"/>
+        </w:rPr>
+        <w:t>4</w:t>
+      </w:r>
+      <w:r>
+        <w:rPr>
+          <w:rFonts w:ascii="Times New Roman" w:hAnsi="Times New Roman" w:cs="Times New Roman"/>
+          <w:sz w:val="26"/>
+          <w:szCs w:val="26"/>
+        </w:rPr>
+        <w:t>]</w:t>
+      </w:r>
+      <w:r>
+        <w:rPr>
+          <w:rFonts w:ascii="Times New Roman" w:hAnsi="Times New Roman"/>
+          <w:sz w:val="26"/>
+          <w:szCs w:val="26"/>
+        </w:rPr>
+        <w:t>, đồng thời tập trung cân bằng giữa việc tìm đúng và phát hiện đủ</w:t>
       </w:r>
       <w:r>
         <w:rPr>
@@ -2202,55 +2827,47 @@
           <w:sz w:val="26"/>
           <w:szCs w:val="26"/>
         </w:rPr>
-        <w:t xml:space="preserve">Real-time Intervention: Khai thác năng lực của XGBoost để chấm điểm tiềm năng cho khách hàng ngay trong phiên truy cập. Xây dựng </w:t>
-      </w:r>
-      <w:r>
-        <w:rPr>
-          <w:rFonts w:ascii="Times New Roman" w:hAnsi="Times New Roman"/>
-          <w:sz w:val="26"/>
-          <w:szCs w:val="26"/>
-        </w:rPr>
-        <w:t>quy tắc</w:t>
-      </w:r>
-      <w:r>
-        <w:rPr>
-          <w:rFonts w:ascii="Times New Roman" w:hAnsi="Times New Roman"/>
-          <w:sz w:val="26"/>
-          <w:szCs w:val="26"/>
-        </w:rPr>
-        <w:t xml:space="preserve"> can thiệp: Nếu xác suất chốt đơn của người dùng được dự báo &gt; 75%, nhưng chỉ số </w:t>
-      </w:r>
-      <w:r>
-        <w:rPr>
-          <w:rFonts w:ascii="Times New Roman" w:eastAsia="Times New Roman" w:hAnsi="Times New Roman"/>
-          <w:sz w:val="26"/>
-          <w:szCs w:val="26"/>
-        </w:rPr>
-        <w:t>ExitRates</w:t>
-      </w:r>
-      <w:r>
-        <w:rPr>
-          <w:rFonts w:ascii="Times New Roman" w:hAnsi="Times New Roman"/>
-          <w:sz w:val="26"/>
-          <w:szCs w:val="26"/>
-        </w:rPr>
-        <w:t xml:space="preserve"> bắt đầu gia</w:t>
-      </w:r>
-      <w:r>
-        <w:rPr>
-          <w:rFonts w:ascii="Times New Roman" w:hAnsi="Times New Roman"/>
-          <w:sz w:val="26"/>
-          <w:szCs w:val="26"/>
-        </w:rPr>
-        <w:t xml:space="preserve"> tăng, nó </w:t>
-      </w:r>
-      <w:r>
-        <w:rPr>
-          <w:rFonts w:ascii="Times New Roman" w:hAnsi="Times New Roman"/>
-          <w:sz w:val="26"/>
-          <w:szCs w:val="26"/>
-        </w:rPr>
-        <w:t>báo hiệu ý định bỏ rơi giỏ hàng do rào cản giá cả hoặc vận chuyển, hệ thống sẽ lập tức tự động hiển thị Pop-up cấp phát mã giảm giá giới hạn thời gian để thúc đẩy hoàn tất thanh toán.</w:t>
+        <w:t>Real-time Intervention: Khai thác năng lực của XGBoost để chấm điểm tiềm năng cho khách hàng ngay trong phiên truy cập</w:t>
+      </w:r>
+      <w:r>
+        <w:rPr>
+          <w:rFonts w:ascii="Times New Roman" w:hAnsi="Times New Roman"/>
+          <w:sz w:val="26"/>
+          <w:szCs w:val="26"/>
+        </w:rPr>
+        <w:t xml:space="preserve"> </w:t>
+      </w:r>
+      <w:r>
+        <w:rPr>
+          <w:rFonts w:ascii="Times New Roman" w:hAnsi="Times New Roman" w:cs="Times New Roman"/>
+          <w:sz w:val="26"/>
+          <w:szCs w:val="26"/>
+        </w:rPr>
+        <w:t>[</w:t>
+      </w:r>
+      <w:r>
+        <w:rPr>
+          <w:rFonts w:ascii="Times New Roman" w:hAnsi="Times New Roman" w:cs="Times New Roman"/>
+          <w:sz w:val="26"/>
+          <w:szCs w:val="26"/>
+        </w:rPr>
+        <w:t>3</w:t>
+      </w:r>
+      <w:r>
+        <w:rPr>
+          <w:rFonts w:ascii="Times New Roman" w:hAnsi="Times New Roman" w:cs="Times New Roman"/>
+          <w:sz w:val="26"/>
+          <w:szCs w:val="26"/>
+        </w:rPr>
+        <w:t>]</w:t>
+      </w:r>
+      <w:r>
+        <w:rPr>
+          <w:rFonts w:ascii="Times New Roman" w:hAnsi="Times New Roman"/>
+          <w:sz w:val="26"/>
+          <w:szCs w:val="26"/>
+        </w:rPr>
+        <w:t xml:space="preserve">. </w:t>
       </w:r>
     </w:p>
     <w:p>
@@ -2275,6 +2892,79 @@
           <w:sz w:val="26"/>
           <w:szCs w:val="26"/>
         </w:rPr>
+        <w:t xml:space="preserve">Xây dựng </w:t>
+      </w:r>
+      <w:r>
+        <w:rPr>
+          <w:rFonts w:ascii="Times New Roman" w:hAnsi="Times New Roman"/>
+          <w:sz w:val="26"/>
+          <w:szCs w:val="26"/>
+        </w:rPr>
+        <w:t>quy tắc</w:t>
+      </w:r>
+      <w:r>
+        <w:rPr>
+          <w:rFonts w:ascii="Times New Roman" w:hAnsi="Times New Roman"/>
+          <w:sz w:val="26"/>
+          <w:szCs w:val="26"/>
+        </w:rPr>
+        <w:t xml:space="preserve"> can thiệp: Nếu xác suất chốt đơn của người dùng được dự báo &gt; 75%, nhưng chỉ số </w:t>
+      </w:r>
+      <w:r>
+        <w:rPr>
+          <w:rFonts w:ascii="Times New Roman" w:eastAsia="Times New Roman" w:hAnsi="Times New Roman"/>
+          <w:sz w:val="26"/>
+          <w:szCs w:val="26"/>
+        </w:rPr>
+        <w:t>ExitRates</w:t>
+      </w:r>
+      <w:r>
+        <w:rPr>
+          <w:rFonts w:ascii="Times New Roman" w:hAnsi="Times New Roman"/>
+          <w:sz w:val="26"/>
+          <w:szCs w:val="26"/>
+        </w:rPr>
+        <w:t xml:space="preserve"> bắt đầu gia</w:t>
+      </w:r>
+      <w:r>
+        <w:rPr>
+          <w:rFonts w:ascii="Times New Roman" w:hAnsi="Times New Roman"/>
+          <w:sz w:val="26"/>
+          <w:szCs w:val="26"/>
+        </w:rPr>
+        <w:t xml:space="preserve"> tăng, nó </w:t>
+      </w:r>
+      <w:r>
+        <w:rPr>
+          <w:rFonts w:ascii="Times New Roman" w:hAnsi="Times New Roman"/>
+          <w:sz w:val="26"/>
+          <w:szCs w:val="26"/>
+        </w:rPr>
+        <w:t>báo hiệu ý định bỏ rơi giỏ hàng do rào cản giá cả hoặc vận chuyển, hệ thống sẽ lập tức tự động hiển thị Pop-up cấp phát mã giảm giá giới hạn thời gian để thúc đẩy hoàn tất thanh toán.</w:t>
+      </w:r>
+    </w:p>
+    <w:p>
+      <w:pPr>
+        <w:pStyle w:val="ListParagraph"/>
+        <w:numPr>
+          <w:ilvl w:val="0"/>
+          <w:numId w:val="8"/>
+        </w:numPr>
+        <w:spacing w:after="0" w:line="360" w:lineRule="auto"/>
+        <w:ind w:left="567" w:hanging="283"/>
+        <w:jc w:val="both"/>
+        <w:rPr>
+          <w:rFonts w:ascii="Times New Roman" w:hAnsi="Times New Roman"/>
+          <w:sz w:val="26"/>
+          <w:szCs w:val="26"/>
+        </w:rPr>
+      </w:pPr>
+      <w:r>
+        <w:rPr>
+          <w:rFonts w:ascii="Times New Roman" w:hAnsi="Times New Roman"/>
+          <w:sz w:val="26"/>
+          <w:szCs w:val="26"/>
+        </w:rPr>
         <w:t>Cross-selling &amp; Up-selling: Trích xuất luật kết hợp từ thời gian lưu lại các trang danh mục. Đối với khách hàng đã bỏ sản phẩm vào giỏ</w:t>
       </w:r>
       <w:r>
@@ -2363,7 +3053,31 @@
           <w:sz w:val="26"/>
           <w:szCs w:val="26"/>
         </w:rPr>
-        <w:t>cao, hệ thống sẽ đề xuất các phiên bản sản phẩm có thông số cao cấp hơn, nhằm gia tăng quy mô giỏ hàng trung bình.</w:t>
+        <w:t>cao, hệ thống sẽ đề xuất các phiên bản sản phẩm có thông số cao cấp hơn, nhằm gia tăng quy mô giỏ hàng trung bình</w:t>
+      </w:r>
+      <w:r>
+        <w:rPr>
+          <w:rFonts w:ascii="Times New Roman" w:hAnsi="Times New Roman"/>
+          <w:sz w:val="26"/>
+          <w:szCs w:val="26"/>
+        </w:rPr>
+        <w:t xml:space="preserve"> </w:t>
+      </w:r>
+      <w:r>
+        <w:rPr>
+          <w:rFonts w:ascii="Times New Roman" w:hAnsi="Times New Roman" w:cs="Times New Roman"/>
+          <w:sz w:val="26"/>
+          <w:szCs w:val="26"/>
+        </w:rPr>
+        <w:t>[12]</w:t>
+      </w:r>
+      <w:r>
+        <w:rPr>
+          <w:rFonts w:ascii="Times New Roman" w:hAnsi="Times New Roman"/>
+          <w:sz w:val="26"/>
+          <w:szCs w:val="26"/>
+        </w:rPr>
+        <w:t>.</w:t>
       </w:r>
     </w:p>
     <w:p>
@@ -2624,7 +3338,17 @@
           <w:szCs w:val="26"/>
           <w:lang w:val="pt-BR"/>
         </w:rPr>
-        <w:t xml:space="preserve"> có giám sát. Đứng từ góc độ toán học, mục tiêu cốt lõi của bài toán là tìm ra một hàm ánh xạ </w:t>
+        <w:t xml:space="preserve"> có giám sát. Đứng từ góc độ toán </w:t>
+      </w:r>
+      <w:r>
+        <w:rPr>
+          <w:rFonts w:ascii="Times New Roman" w:hAnsi="Times New Roman"/>
+          <w:sz w:val="26"/>
+          <w:szCs w:val="26"/>
+          <w:lang w:val="pt-BR"/>
+        </w:rPr>
+        <w:lastRenderedPageBreak/>
+        <w:t xml:space="preserve">học, mục tiêu cốt lõi của bài toán là tìm ra một hàm ánh xạ </w:t>
       </w:r>
       <m:oMath>
         <m:r>
@@ -2666,7 +3390,6 @@
           <w:szCs w:val="26"/>
           <w:lang w:val="pt-BR"/>
         </w:rPr>
-        <w:lastRenderedPageBreak/>
         <w:t xml:space="preserve">Cụ thể, giả sử ta có một tập dữ liệu quan sát </w:t>
       </w:r>
       <m:oMath>
@@ -3591,6 +4314,7 @@
           <w:sz w:val="26"/>
           <w:szCs w:val="26"/>
         </w:rPr>
+        <w:lastRenderedPageBreak/>
         <w:t xml:space="preserve">Trong đó </w:t>
       </w:r>
       <m:oMath>
@@ -3757,7 +4481,6 @@
           <w:sz w:val="26"/>
           <w:szCs w:val="26"/>
         </w:rPr>
-        <w:lastRenderedPageBreak/>
         <w:t xml:space="preserve">Cơ sở toán học: Mô hình tối ưu hóa hàm mất mát Log-Likelihood (hoặc Binary Cross-Entropy) để tìm ra bộ tham số </w:t>
       </w:r>
       <m:oMath>
@@ -4261,6 +4984,7 @@
               <w:sz w:val="26"/>
               <w:szCs w:val="26"/>
             </w:rPr>
+            <w:lastRenderedPageBreak/>
             <m:t>d</m:t>
           </m:r>
           <m:d>
@@ -4474,7 +5198,6 @@
           <w:sz w:val="26"/>
           <w:szCs w:val="26"/>
         </w:rPr>
-        <w:lastRenderedPageBreak/>
         <w:t xml:space="preserve">Trong đó </w:t>
       </w:r>
       <m:oMath>
@@ -4966,7 +5689,19 @@
           <w:lang w:bidi="th-TH"/>
           <w14:ligatures w14:val="standardContextual"/>
         </w:rPr>
-        <w:t>Để giải quyết bài toán dự báo trên tập dữ liệu dạng bảng với yêu cầu độ chính xác cao, đề tài lựa chọn phương pháp XGBoost (Extreme Gradient Boosting). Đây là một thuật toán "state-of-the-art" được phát triển dựa trên nền tảng lý thuyết vững chắc của Gradient Boosting Machine (GBM).</w:t>
+        <w:t xml:space="preserve">Để giải quyết bài toán dự báo trên tập dữ liệu dạng bảng với yêu cầu độ chính xác cao, đề tài lựa chọn phương pháp XGBoost (Extreme Gradient Boosting). Đây là một </w:t>
+      </w:r>
+      <w:r>
+        <w:rPr>
+          <w:rFonts w:ascii="Times New Roman" w:eastAsiaTheme="minorHAnsi" w:hAnsi="Times New Roman"/>
+          <w:kern w:val="2"/>
+          <w:sz w:val="26"/>
+          <w:szCs w:val="26"/>
+          <w:lang w:bidi="th-TH"/>
+          <w14:ligatures w14:val="standardContextual"/>
+        </w:rPr>
+        <w:lastRenderedPageBreak/>
+        <w:t>thuật toán "state-of-the-art" được phát triển dựa trên nền tảng lý thuyết vững chắc của Gradient Boosting Machine (GBM).</w:t>
       </w:r>
     </w:p>
     <w:p>
@@ -4993,7 +5728,6 @@
           <w:sz w:val="26"/>
           <w:szCs w:val="26"/>
         </w:rPr>
-        <w:lastRenderedPageBreak/>
         <w:t>Gradient Boosting Machine (GBM)</w:t>
       </w:r>
       <w:r>
@@ -5237,6 +5971,7 @@
           <w:sz w:val="26"/>
           <w:szCs w:val="26"/>
         </w:rPr>
+        <w:lastRenderedPageBreak/>
         <w:t>scale_pos_weight</w:t>
       </w:r>
       <w:r>
@@ -5275,7 +6010,6 @@
           <w:sz w:val="26"/>
           <w:szCs w:val="26"/>
         </w:rPr>
-        <w:lastRenderedPageBreak/>
         <w:t>Các chỉ số đánh giá hiệu năng mô hình:</w:t>
       </w:r>
     </w:p>
@@ -5709,6 +6443,7 @@
           <w:szCs w:val="26"/>
           <w:lang w:val="pt-BR"/>
         </w:rPr>
+        <w:lastRenderedPageBreak/>
         <w:t>Mặc dù là thước đo phổ biến nhất, Accuracy lại hoàn toàn mất giá trị tin cậy khi</w:t>
       </w:r>
       <w:r>
@@ -5717,16 +6452,7 @@
           <w:sz w:val="26"/>
           <w:szCs w:val="26"/>
         </w:rPr>
-        <w:t xml:space="preserve"> làm việc với tập dữ liệu bất đối xứng. Giả sử tập dữ liệu có 85% khách hàng </w:t>
-      </w:r>
-      <w:r>
-        <w:rPr>
-          <w:rFonts w:ascii="Times New Roman" w:eastAsiaTheme="minorEastAsia" w:hAnsi="Times New Roman"/>
-          <w:sz w:val="26"/>
-          <w:szCs w:val="26"/>
-        </w:rPr>
-        <w:lastRenderedPageBreak/>
-        <w:t xml:space="preserve">không mua và 15% khách hàng mua. Một mô hình </w:t>
+        <w:t xml:space="preserve"> làm việc với tập dữ liệu bất đối xứng. Giả sử tập dữ liệu có 85% khách hàng không mua và 15% khách hàng mua. Một mô hình </w:t>
       </w:r>
       <w:r>
         <w:rPr>
@@ -6163,16 +6889,8 @@
           <w:sz w:val="26"/>
           <w:szCs w:val="26"/>
         </w:rPr>
-        <w:t xml:space="preserve">Về mặt thực tiễn, Precision đóng vai trò là tham số kiểm soát rủi ro tài chính. Việc cực đại hóa chỉ số này giúp doanh nghiệp khống chế tỷ lệ báo động giả, </w:t>
-      </w:r>
-      <w:r>
-        <w:rPr>
-          <w:rFonts w:ascii="Times New Roman" w:eastAsiaTheme="minorEastAsia" w:hAnsi="Times New Roman"/>
-          <w:sz w:val="26"/>
-          <w:szCs w:val="26"/>
-        </w:rPr>
         <w:lastRenderedPageBreak/>
-        <w:t>từ đó ngăn chặn sự lãng phí tài nguyên, tối ưu hóa ngân sách tiếp thị và bảo toàn biên độ lợi nhuận khi triển khai các tác vụ kích cầu tự động.</w:t>
+        <w:t>Về mặt thực tiễn, Precision đóng vai trò là tham số kiểm soát rủi ro tài chính. Việc cực đại hóa chỉ số này giúp doanh nghiệp khống chế tỷ lệ báo động giả, từ đó ngăn chặn sự lãng phí tài nguyên, tối ưu hóa ngân sách tiếp thị và bảo toàn biên độ lợi nhuận khi triển khai các tác vụ kích cầu tự động.</w:t>
       </w:r>
     </w:p>
     <w:p>
@@ -17508,7 +18226,17 @@
           <w:sz w:val="26"/>
           <w:szCs w:val="26"/>
         </w:rPr>
-        <w:t xml:space="preserve"> tăng lên. Người dùng sẵn sàng duyệt qua nhiều trang danh mục hơn và dễ bị tác động bởi các gợi ý sản phẩm liên quan, dẫn đến khả năng mua sắm ngẫu hứng cao hơn.</w:t>
+        <w:t xml:space="preserve"> tăng lên. Người dùng sẵn sàng duyệt qua nhiều trang danh mục hơn và dễ bị tác động bởi các gợi ý sản phẩm liên quan, dẫn đến khả năng mua sắm </w:t>
+      </w:r>
+      <w:bookmarkStart w:id="1" w:name="_GoBack"/>
+      <w:bookmarkEnd w:id="1"/>
+      <w:r>
+        <w:rPr>
+          <w:rFonts w:ascii="Times New Roman" w:hAnsi="Times New Roman"/>
+          <w:sz w:val="26"/>
+          <w:szCs w:val="26"/>
+        </w:rPr>
+        <w:t>ngẫu hứng cao hơn.</w:t>
       </w:r>
     </w:p>
     <w:p>
@@ -24178,17 +24906,7 @@
                 <w:szCs w:val="26"/>
                 <w:lang w:val="pt-BR"/>
               </w:rPr>
-              <w:t>35.00</w:t>
-            </w:r>
-            <w:r>
-              <w:rPr>
-                <w:rFonts w:ascii="Times New Roman" w:hAnsi="Times New Roman"/>
-                <w:bCs/>
-                <w:sz w:val="26"/>
-                <w:szCs w:val="26"/>
-                <w:lang w:val="pt-BR"/>
-              </w:rPr>
-              <w:t>%</w:t>
+              <w:t>35.00%</w:t>
             </w:r>
           </w:p>
         </w:tc>
@@ -41117,16 +41835,7 @@
           <w:szCs w:val="26"/>
           <w:lang w:val="pt-BR"/>
         </w:rPr>
-        <w:t>ng</w:t>
-      </w:r>
-      <w:r>
-        <w:rPr>
-          <w:rFonts w:ascii="Times New Roman" w:hAnsi="Times New Roman"/>
-          <w:sz w:val="26"/>
-          <w:szCs w:val="26"/>
-          <w:lang w:val="pt-BR"/>
-        </w:rPr>
-        <w:t>. Trong t</w:t>
+        <w:t>ng. Trong t</w:t>
       </w:r>
       <w:r>
         <w:rPr>
@@ -41414,16 +42123,7 @@
           <w:szCs w:val="26"/>
           <w:lang w:val="pt-BR"/>
         </w:rPr>
-        <w:t>n (Big Data)</w:t>
-      </w:r>
-      <w:r>
-        <w:rPr>
-          <w:rFonts w:ascii="Times New Roman" w:hAnsi="Times New Roman"/>
-          <w:sz w:val="26"/>
-          <w:szCs w:val="26"/>
-          <w:lang w:val="pt-BR"/>
-        </w:rPr>
-        <w:t>.</w:t>
+        <w:t>n (Big Data).</w:t>
       </w:r>
     </w:p>
     <w:p>
@@ -41989,8 +42689,6 @@
           <w:lang w:val="pt-BR"/>
         </w:rPr>
       </w:pPr>
-      <w:bookmarkStart w:id="1" w:name="_GoBack"/>
-      <w:bookmarkEnd w:id="1"/>
     </w:p>
     <w:p>
       <w:pPr>
@@ -42518,7 +43216,7 @@
               </wp:anchor>
             </w:drawing>
           </mc:Choice>
-          <mc:Fallback xmlns:w16sdtfl="http://schemas.microsoft.com/office/word/2024/wordml/sdtformatlock" xmlns:w16sdtdh="http://schemas.microsoft.com/office/word/2020/wordml/sdtdatahash" xmlns:w16du="http://schemas.microsoft.com/office/word/2023/wordml/word16du" xmlns:w16="http://schemas.microsoft.com/office/word/2018/wordml" xmlns:w16cid="http://schemas.microsoft.com/office/word/2016/wordml/cid" xmlns:w16cex="http://schemas.microsoft.com/office/word/2018/wordml/cex" xmlns:oel="http://schemas.microsoft.com/office/2019/extlst" xmlns:am3d="http://schemas.microsoft.com/office/drawing/2017/model3d" xmlns:aink="http://schemas.microsoft.com/office/drawing/2016/ink" xmlns:cx8="http://schemas.microsoft.com/office/drawing/2016/5/14/chartex" xmlns:cx7="http://schemas.microsoft.com/office/drawing/2016/5/13/chartex" xmlns:cx6="http://schemas.microsoft.com/office/drawing/2016/5/12/chartex" xmlns:cx5="http://schemas.microsoft.com/office/drawing/2016/5/11/chartex" xmlns:cx4="http://schemas.microsoft.com/office/drawing/2016/5/10/chartex" xmlns:cx3="http://schemas.microsoft.com/office/drawing/2016/5/9/chartex" xmlns:cx2="http://schemas.microsoft.com/office/drawing/2015/10/21/chartex" xmlns:cx1="http://schemas.microsoft.com/office/drawing/2015/9/8/chartex">
+          <mc:Fallback xmlns:cx1="http://schemas.microsoft.com/office/drawing/2015/9/8/chartex" xmlns:cx2="http://schemas.microsoft.com/office/drawing/2015/10/21/chartex" xmlns:cx3="http://schemas.microsoft.com/office/drawing/2016/5/9/chartex" xmlns:cx4="http://schemas.microsoft.com/office/drawing/2016/5/10/chartex" xmlns:cx5="http://schemas.microsoft.com/office/drawing/2016/5/11/chartex" xmlns:cx6="http://schemas.microsoft.com/office/drawing/2016/5/12/chartex" xmlns:cx7="http://schemas.microsoft.com/office/drawing/2016/5/13/chartex" xmlns:cx8="http://schemas.microsoft.com/office/drawing/2016/5/14/chartex" xmlns:aink="http://schemas.microsoft.com/office/drawing/2016/ink" xmlns:am3d="http://schemas.microsoft.com/office/drawing/2017/model3d" xmlns:oel="http://schemas.microsoft.com/office/2019/extlst" xmlns:w16cex="http://schemas.microsoft.com/office/word/2018/wordml/cex" xmlns:w16cid="http://schemas.microsoft.com/office/word/2016/wordml/cid" xmlns:w16="http://schemas.microsoft.com/office/word/2018/wordml" xmlns:w16du="http://schemas.microsoft.com/office/word/2023/wordml/word16du" xmlns:w16sdtdh="http://schemas.microsoft.com/office/word/2020/wordml/sdtdatahash" xmlns:w16sdtfl="http://schemas.microsoft.com/office/word/2024/wordml/sdtformatlock">
             <w:pict>
               <v:line w14:anchorId="12A36378" id="Straight Connector 1" o:spid="_x0000_s1026" style="position:absolute;z-index:251659264;visibility:visible;mso-wrap-style:square;mso-wrap-distance-left:9pt;mso-wrap-distance-top:0;mso-wrap-distance-right:9pt;mso-wrap-distance-bottom:0;mso-position-horizontal:absolute;mso-position-horizontal-relative:text;mso-position-vertical:absolute;mso-position-vertical-relative:text" from="152.55pt,8.8pt" to="280.35pt,8.8pt" o:gfxdata="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" strokecolor="#156082 [3204]" strokeweight=".5pt">
                 <v:stroke joinstyle="miter"/>
@@ -42530,549 +43228,526 @@
     </w:p>
     <w:p>
       <w:pPr>
+        <w:spacing w:line="360" w:lineRule="auto"/>
+        <w:jc w:val="center"/>
+        <w:rPr>
+          <w:rFonts w:ascii="Times New Roman" w:hAnsi="Times New Roman"/>
+          <w:b/>
+          <w:sz w:val="26"/>
+          <w:szCs w:val="26"/>
+        </w:rPr>
+      </w:pPr>
+      <w:r>
+        <w:rPr>
+          <w:rFonts w:ascii="Times New Roman" w:hAnsi="Times New Roman"/>
+          <w:b/>
+          <w:sz w:val="26"/>
+          <w:szCs w:val="26"/>
+        </w:rPr>
+        <w:t>TÀI LIỆU THAM KHẢO</w:t>
+      </w:r>
+    </w:p>
+    <w:p>
+      <w:pPr>
+        <w:pStyle w:val="NormalWeb"/>
+        <w:spacing w:line="360" w:lineRule="auto"/>
+        <w:rPr>
+          <w:sz w:val="26"/>
+          <w:szCs w:val="26"/>
+        </w:rPr>
+      </w:pPr>
+      <w:r>
+        <w:rPr>
+          <w:sz w:val="26"/>
+          <w:szCs w:val="26"/>
+        </w:rPr>
+        <w:t xml:space="preserve">[1] L. Breiman, “Random Forests,” </w:t>
+      </w:r>
+      <w:r>
+        <w:rPr>
+          <w:i/>
+          <w:iCs/>
+          <w:sz w:val="26"/>
+          <w:szCs w:val="26"/>
+        </w:rPr>
+        <w:t>Machine Learning</w:t>
+      </w:r>
+      <w:r>
+        <w:rPr>
+          <w:sz w:val="26"/>
+          <w:szCs w:val="26"/>
+        </w:rPr>
+        <w:t xml:space="preserve">, Vol. </w:t>
+      </w:r>
+      <w:r>
+        <w:rPr>
+          <w:rStyle w:val="citation-50"/>
+          <w:rFonts w:eastAsiaTheme="majorEastAsia"/>
+          <w:sz w:val="26"/>
+          <w:szCs w:val="26"/>
+        </w:rPr>
+        <w:t xml:space="preserve">45, No. 1, 2001, pp. 5-32. </w:t>
+      </w:r>
+    </w:p>
+    <w:p>
+      <w:pPr>
+        <w:pStyle w:val="NormalWeb"/>
+        <w:spacing w:line="360" w:lineRule="auto"/>
+        <w:rPr>
+          <w:sz w:val="26"/>
+          <w:szCs w:val="26"/>
+        </w:rPr>
+      </w:pPr>
+      <w:r>
+        <w:rPr>
+          <w:sz w:val="26"/>
+          <w:szCs w:val="26"/>
+        </w:rPr>
+        <w:t xml:space="preserve">[2] N. V. Chawla, K. W. Bowyer, L. O. Hall, and W. P. Kegelmeyer, “SMOTE: Synthetic Minority Over-sampling Technique,” </w:t>
+      </w:r>
+      <w:r>
+        <w:rPr>
+          <w:i/>
+          <w:iCs/>
+          <w:sz w:val="26"/>
+          <w:szCs w:val="26"/>
+        </w:rPr>
+        <w:t>Journal of Artificial Intelligence Research</w:t>
+      </w:r>
+      <w:r>
+        <w:rPr>
+          <w:sz w:val="26"/>
+          <w:szCs w:val="26"/>
+        </w:rPr>
+        <w:t xml:space="preserve">, Vol. </w:t>
+      </w:r>
+      <w:r>
+        <w:rPr>
+          <w:rStyle w:val="citation-49"/>
+          <w:rFonts w:eastAsiaTheme="majorEastAsia"/>
+          <w:sz w:val="26"/>
+          <w:szCs w:val="26"/>
+        </w:rPr>
+        <w:t xml:space="preserve">16, 2002, pp. 321-357. </w:t>
+      </w:r>
+    </w:p>
+    <w:p>
+      <w:pPr>
+        <w:pStyle w:val="NormalWeb"/>
+        <w:spacing w:line="360" w:lineRule="auto"/>
+        <w:rPr>
+          <w:sz w:val="26"/>
+          <w:szCs w:val="26"/>
+        </w:rPr>
+      </w:pPr>
+      <w:r>
+        <w:rPr>
+          <w:rStyle w:val="citation-48"/>
+          <w:rFonts w:eastAsiaTheme="majorEastAsia"/>
+          <w:sz w:val="26"/>
+          <w:szCs w:val="26"/>
+        </w:rPr>
+        <w:t xml:space="preserve">[3] T. Chen and C. Guestrin, “XGBoost: A Scalable Tree Boosting System,” </w:t>
+      </w:r>
+      <w:r>
+        <w:rPr>
+          <w:rStyle w:val="citation-48"/>
+          <w:rFonts w:eastAsiaTheme="majorEastAsia"/>
+          <w:i/>
+          <w:iCs/>
+          <w:sz w:val="26"/>
+          <w:szCs w:val="26"/>
+        </w:rPr>
+        <w:t>Proc. of the 22nd ACM SIGKDD International Conference on Knowledge Discovery and Data Mining</w:t>
+      </w:r>
+      <w:r>
+        <w:rPr>
+          <w:rStyle w:val="citation-48"/>
+          <w:rFonts w:eastAsiaTheme="majorEastAsia"/>
+          <w:sz w:val="26"/>
+          <w:szCs w:val="26"/>
+        </w:rPr>
+        <w:t xml:space="preserve">, 2016, pp. 785-794. </w:t>
+      </w:r>
+    </w:p>
+    <w:p>
+      <w:pPr>
+        <w:pStyle w:val="NormalWeb"/>
+        <w:spacing w:line="360" w:lineRule="auto"/>
+        <w:rPr>
+          <w:sz w:val="26"/>
+          <w:szCs w:val="26"/>
+        </w:rPr>
+      </w:pPr>
+      <w:r>
+        <w:rPr>
+          <w:sz w:val="26"/>
+          <w:szCs w:val="26"/>
+        </w:rPr>
+        <w:t xml:space="preserve">[4] T. Fawcett, “An introduction to ROC analysis,” </w:t>
+      </w:r>
+      <w:r>
+        <w:rPr>
+          <w:i/>
+          <w:iCs/>
+          <w:sz w:val="26"/>
+          <w:szCs w:val="26"/>
+        </w:rPr>
+        <w:t>Pattern Recognition Letters</w:t>
+      </w:r>
+      <w:r>
+        <w:rPr>
+          <w:sz w:val="26"/>
+          <w:szCs w:val="26"/>
+        </w:rPr>
+        <w:t xml:space="preserve">, Vol. </w:t>
+      </w:r>
+      <w:r>
+        <w:rPr>
+          <w:rStyle w:val="citation-47"/>
+          <w:rFonts w:eastAsiaTheme="majorEastAsia"/>
+          <w:sz w:val="26"/>
+          <w:szCs w:val="26"/>
+        </w:rPr>
+        <w:t xml:space="preserve">27, No. 8, 2006, pp. 861-874. </w:t>
+      </w:r>
+    </w:p>
+    <w:p>
+      <w:pPr>
+        <w:pStyle w:val="NormalWeb"/>
+        <w:spacing w:line="360" w:lineRule="auto"/>
+        <w:rPr>
+          <w:sz w:val="26"/>
+          <w:szCs w:val="26"/>
+        </w:rPr>
+      </w:pPr>
+      <w:r>
+        <w:rPr>
+          <w:sz w:val="26"/>
+          <w:szCs w:val="26"/>
+        </w:rPr>
+        <w:t xml:space="preserve">[5] J. H. Friedman, “Greedy function approximation: A gradient boosting machine,” </w:t>
+      </w:r>
+      <w:r>
+        <w:rPr>
+          <w:i/>
+          <w:iCs/>
+          <w:sz w:val="26"/>
+          <w:szCs w:val="26"/>
+        </w:rPr>
+        <w:t>Annals of Statistics</w:t>
+      </w:r>
+      <w:r>
+        <w:rPr>
+          <w:sz w:val="26"/>
+          <w:szCs w:val="26"/>
+        </w:rPr>
+        <w:t xml:space="preserve">, Vol. </w:t>
+      </w:r>
+      <w:r>
+        <w:rPr>
+          <w:rStyle w:val="citation-46"/>
+          <w:rFonts w:eastAsiaTheme="majorEastAsia"/>
+          <w:sz w:val="26"/>
+          <w:szCs w:val="26"/>
+        </w:rPr>
+        <w:t xml:space="preserve">31, 2001, pp. 1189-1232. </w:t>
+      </w:r>
+    </w:p>
+    <w:p>
+      <w:pPr>
+        <w:pStyle w:val="NormalWeb"/>
+        <w:spacing w:line="360" w:lineRule="auto"/>
+        <w:rPr>
+          <w:sz w:val="26"/>
+          <w:szCs w:val="26"/>
+        </w:rPr>
+      </w:pPr>
+      <w:r>
+        <w:rPr>
+          <w:rStyle w:val="citation-45"/>
+          <w:rFonts w:eastAsiaTheme="majorEastAsia"/>
+          <w:sz w:val="26"/>
+          <w:szCs w:val="26"/>
+        </w:rPr>
+        <w:t xml:space="preserve">[6] S. Russell and P. Norvig, </w:t>
+      </w:r>
+      <w:r>
+        <w:rPr>
+          <w:rStyle w:val="citation-45"/>
+          <w:rFonts w:eastAsiaTheme="majorEastAsia"/>
+          <w:i/>
+          <w:iCs/>
+          <w:sz w:val="26"/>
+          <w:szCs w:val="26"/>
+        </w:rPr>
+        <w:t>Artificial Intelligence: A Modern Approach</w:t>
+      </w:r>
+      <w:r>
+        <w:rPr>
+          <w:rStyle w:val="citation-45"/>
+          <w:rFonts w:eastAsiaTheme="majorEastAsia"/>
+          <w:sz w:val="26"/>
+          <w:szCs w:val="26"/>
+        </w:rPr>
+        <w:t xml:space="preserve">, 4th Ed., Pearson, 2020. </w:t>
+      </w:r>
+    </w:p>
+    <w:p>
+      <w:pPr>
+        <w:pStyle w:val="NormalWeb"/>
+        <w:spacing w:line="360" w:lineRule="auto"/>
+        <w:rPr>
+          <w:sz w:val="26"/>
+          <w:szCs w:val="26"/>
+        </w:rPr>
+      </w:pPr>
+      <w:r>
+        <w:rPr>
+          <w:sz w:val="26"/>
+          <w:szCs w:val="26"/>
+        </w:rPr>
+        <w:t xml:space="preserve">[7] C. O. Sakar, S. O. Polat, M. Katircioglu, and Y. Kirmizi, “Real-time prediction of online shoppers' purchasing intention using multilayer perceptron and LSTM recurrent neural networks,” </w:t>
+      </w:r>
+      <w:r>
+        <w:rPr>
+          <w:i/>
+          <w:iCs/>
+          <w:sz w:val="26"/>
+          <w:szCs w:val="26"/>
+        </w:rPr>
+        <w:t>Neural Computing and Applications</w:t>
+      </w:r>
+      <w:r>
+        <w:rPr>
+          <w:sz w:val="26"/>
+          <w:szCs w:val="26"/>
+        </w:rPr>
+        <w:t xml:space="preserve">, Vol. </w:t>
+      </w:r>
+      <w:r>
+        <w:rPr>
+          <w:rStyle w:val="citation-44"/>
+          <w:sz w:val="26"/>
+          <w:szCs w:val="26"/>
+        </w:rPr>
+        <w:t xml:space="preserve">31, No. 10, 2019, pp. 6893-6908. </w:t>
+      </w:r>
+    </w:p>
+    <w:p>
+      <w:pPr>
+        <w:pStyle w:val="NormalWeb"/>
+        <w:spacing w:line="360" w:lineRule="auto"/>
+        <w:rPr>
+          <w:sz w:val="26"/>
+          <w:szCs w:val="26"/>
+        </w:rPr>
+      </w:pPr>
+      <w:r>
+        <w:rPr>
+          <w:rStyle w:val="citation-43"/>
+          <w:rFonts w:eastAsiaTheme="majorEastAsia"/>
+          <w:sz w:val="26"/>
+          <w:szCs w:val="26"/>
+        </w:rPr>
+        <w:t xml:space="preserve">[8] Andrew Ng, </w:t>
+      </w:r>
+      <w:r>
+        <w:rPr>
+          <w:rStyle w:val="citation-43"/>
+          <w:rFonts w:eastAsiaTheme="majorEastAsia"/>
+          <w:i/>
+          <w:iCs/>
+          <w:sz w:val="26"/>
+          <w:szCs w:val="26"/>
+        </w:rPr>
+        <w:t>AI For Everyone - Trí tuệ nhân tạo dành cho mọi người</w:t>
+      </w:r>
+      <w:r>
+        <w:rPr>
+          <w:rStyle w:val="citation-43"/>
+          <w:rFonts w:eastAsiaTheme="majorEastAsia"/>
+          <w:sz w:val="26"/>
+          <w:szCs w:val="26"/>
+        </w:rPr>
+        <w:t xml:space="preserve"> (Bản dịch tiếng Việt). </w:t>
+      </w:r>
+    </w:p>
+    <w:p>
+      <w:pPr>
+        <w:pStyle w:val="NormalWeb"/>
+        <w:spacing w:line="360" w:lineRule="auto"/>
+        <w:rPr>
+          <w:sz w:val="26"/>
+          <w:szCs w:val="26"/>
+        </w:rPr>
+      </w:pPr>
+      <w:r>
+        <w:rPr>
+          <w:sz w:val="26"/>
+          <w:szCs w:val="26"/>
+        </w:rPr>
+        <w:lastRenderedPageBreak/>
+        <w:t xml:space="preserve">[9] Khoa Điện tử - Viễn thông, Trường Đại học Khoa học Tự nhiên, ĐHQG-HCM, </w:t>
+      </w:r>
+      <w:r>
+        <w:rPr>
+          <w:i/>
+          <w:iCs/>
+          <w:sz w:val="26"/>
+          <w:szCs w:val="26"/>
+        </w:rPr>
+        <w:t>Giáo trình Kỹ thuật Học máy và Hệ thống thông minh</w:t>
+      </w:r>
+      <w:r>
+        <w:rPr>
+          <w:sz w:val="26"/>
+          <w:szCs w:val="26"/>
+        </w:rPr>
+        <w:t xml:space="preserve">, TP. </w:t>
+      </w:r>
+      <w:r>
+        <w:rPr>
+          <w:rStyle w:val="citation-42"/>
+          <w:sz w:val="26"/>
+          <w:szCs w:val="26"/>
+        </w:rPr>
+        <w:t xml:space="preserve">Hồ Chí Minh: NXB Đại học Quốc gia TP.HCM, 2025. </w:t>
+      </w:r>
+    </w:p>
+    <w:p>
+      <w:pPr>
+        <w:pStyle w:val="NormalWeb"/>
+        <w:spacing w:line="360" w:lineRule="auto"/>
+        <w:rPr>
+          <w:sz w:val="26"/>
+          <w:szCs w:val="26"/>
+        </w:rPr>
+      </w:pPr>
+      <w:r>
+        <w:rPr>
+          <w:rStyle w:val="citation-41"/>
+          <w:rFonts w:eastAsiaTheme="majorEastAsia"/>
+          <w:sz w:val="26"/>
+          <w:szCs w:val="26"/>
+        </w:rPr>
+        <w:t xml:space="preserve">[10] Vũ Trọng Phụng, Đinh Trần Thi, và Nguyễn Thái Bình, “Ứng dụng các thuật toán Học máy trong việc dự báo hành vi mua hàng của người tiêu dùng trên các nền tảng thương mại điện tử,” </w:t>
+      </w:r>
+      <w:r>
+        <w:rPr>
+          <w:rStyle w:val="citation-41"/>
+          <w:rFonts w:eastAsiaTheme="majorEastAsia"/>
+          <w:i/>
+          <w:iCs/>
+          <w:sz w:val="26"/>
+          <w:szCs w:val="26"/>
+        </w:rPr>
+        <w:t>Tạp chí Khoa học và Công nghệ Việt Nam</w:t>
+      </w:r>
+      <w:r>
+        <w:rPr>
+          <w:rStyle w:val="citation-41"/>
+          <w:rFonts w:eastAsiaTheme="majorEastAsia"/>
+          <w:sz w:val="26"/>
+          <w:szCs w:val="26"/>
+        </w:rPr>
+        <w:t xml:space="preserve">, 2021. </w:t>
+      </w:r>
+    </w:p>
+    <w:p>
+      <w:pPr>
+        <w:pStyle w:val="NormalWeb"/>
+        <w:spacing w:line="360" w:lineRule="auto"/>
+        <w:rPr>
+          <w:sz w:val="26"/>
+          <w:szCs w:val="26"/>
+        </w:rPr>
+      </w:pPr>
+      <w:r>
+        <w:rPr>
+          <w:rStyle w:val="citation-40"/>
+          <w:sz w:val="26"/>
+          <w:szCs w:val="26"/>
+        </w:rPr>
+        <w:t xml:space="preserve">[11] Google Analytics Support, “Dimensions and Metrics Explorer,” trực tuyến: </w:t>
+      </w:r>
+      <w:hyperlink r:id="rId32" w:tgtFrame="_blank" w:history="1">
+        <w:r>
+          <w:rPr>
+            <w:rStyle w:val="citation-40"/>
+            <w:color w:val="0000FF"/>
+            <w:sz w:val="26"/>
+            <w:szCs w:val="26"/>
+            <w:u w:val="single"/>
+          </w:rPr>
+          <w:t>https://support.google.com/analytics</w:t>
+        </w:r>
+      </w:hyperlink>
+      <w:r>
+        <w:rPr>
+          <w:rStyle w:val="citation-40"/>
+          <w:sz w:val="26"/>
+          <w:szCs w:val="26"/>
+        </w:rPr>
+        <w:t xml:space="preserve"> (truy cập ngày 08/03/2026</w:t>
+      </w:r>
+      <w:r>
+        <w:rPr>
+          <w:rStyle w:val="citation-40"/>
+          <w:sz w:val="26"/>
+          <w:szCs w:val="26"/>
+        </w:rPr>
+        <w:t xml:space="preserve">). </w:t>
+      </w:r>
+    </w:p>
+    <w:p>
+      <w:pPr>
+        <w:pStyle w:val="NormalWeb"/>
+        <w:spacing w:line="360" w:lineRule="auto"/>
+        <w:rPr>
+          <w:sz w:val="26"/>
+          <w:szCs w:val="26"/>
+        </w:rPr>
+      </w:pPr>
+      <w:r>
+        <w:rPr>
+          <w:rStyle w:val="citation-39"/>
+          <w:sz w:val="26"/>
+          <w:szCs w:val="26"/>
+        </w:rPr>
+        <w:t xml:space="preserve">[12] UCI Machine Learning Repository, “Online Shoppers Purchasing Intention Dataset,” trực tuyến: </w:t>
+      </w:r>
+      <w:hyperlink r:id="rId33" w:tgtFrame="_blank" w:history="1">
+        <w:r>
+          <w:rPr>
+            <w:rStyle w:val="citation-39"/>
+            <w:color w:val="0000FF"/>
+            <w:sz w:val="26"/>
+            <w:szCs w:val="26"/>
+            <w:u w:val="single"/>
+          </w:rPr>
+          <w:t>https://archive.ics.uci.edu/ml</w:t>
+        </w:r>
+      </w:hyperlink>
+      <w:r>
+        <w:rPr>
+          <w:rStyle w:val="citation-39"/>
+          <w:sz w:val="26"/>
+          <w:szCs w:val="26"/>
+        </w:rPr>
+        <w:t xml:space="preserve"> (truy cập ngày 08/03/2026). </w:t>
+      </w:r>
+    </w:p>
+    <w:p>
+      <w:pPr>
         <w:pStyle w:val="NormalWeb"/>
         <w:spacing w:before="0" w:beforeAutospacing="0" w:after="0" w:afterAutospacing="0" w:line="360" w:lineRule="auto"/>
         <w:jc w:val="center"/>
         <w:rPr>
           <w:sz w:val="26"/>
           <w:szCs w:val="26"/>
-          <w:lang w:val="pt-BR"/>
-        </w:rPr>
-      </w:pPr>
-      <w:r>
-        <w:rPr>
-          <w:b/>
-          <w:bCs/>
-          <w:sz w:val="26"/>
-          <w:szCs w:val="26"/>
-          <w:lang w:val="pt-BR"/>
-        </w:rPr>
-        <w:t>TÀI LIỆU THAM KHẢO</w:t>
-      </w:r>
-    </w:p>
-    <w:p>
-      <w:pPr>
-        <w:pStyle w:val="ListParagraph"/>
-        <w:numPr>
-          <w:ilvl w:val="0"/>
-          <w:numId w:val="30"/>
-        </w:numPr>
-        <w:spacing w:after="0" w:line="360" w:lineRule="auto"/>
-        <w:ind w:left="567" w:hanging="567"/>
-        <w:jc w:val="both"/>
-        <w:rPr>
-          <w:rFonts w:ascii="Times New Roman" w:hAnsi="Times New Roman"/>
-          <w:sz w:val="26"/>
-          <w:szCs w:val="26"/>
-          <w:lang w:val="pt-BR"/>
-        </w:rPr>
-      </w:pPr>
-      <w:r>
-        <w:rPr>
-          <w:rFonts w:ascii="Times New Roman" w:hAnsi="Times New Roman"/>
-          <w:sz w:val="26"/>
-          <w:szCs w:val="26"/>
-          <w:lang w:val="pt-BR"/>
-        </w:rPr>
-        <w:t xml:space="preserve">Sakar, C. O., Polat, S. O., Katircioglu, M., &amp; Kirmizi, Y. (2019). </w:t>
-      </w:r>
-      <w:r>
-        <w:rPr>
-          <w:rFonts w:ascii="Times New Roman" w:hAnsi="Times New Roman"/>
-          <w:sz w:val="26"/>
-          <w:szCs w:val="26"/>
-        </w:rPr>
-        <w:t xml:space="preserve">"Real-time prediction of online shoppers' purchasing intention using multilayer perceptron and LSTM recurrent neural networks." </w:t>
-      </w:r>
-      <w:r>
-        <w:rPr>
-          <w:rFonts w:ascii="Times New Roman" w:hAnsi="Times New Roman"/>
-          <w:i/>
-          <w:iCs/>
-          <w:sz w:val="26"/>
-          <w:szCs w:val="26"/>
-        </w:rPr>
-        <w:t>Neural Computing and Applications</w:t>
-      </w:r>
-      <w:r>
-        <w:rPr>
-          <w:rFonts w:ascii="Times New Roman" w:hAnsi="Times New Roman"/>
-          <w:sz w:val="26"/>
-          <w:szCs w:val="26"/>
-        </w:rPr>
-        <w:t>, 31(10), 6893-6908.</w:t>
-      </w:r>
-    </w:p>
-    <w:p>
-      <w:pPr>
-        <w:pStyle w:val="ListParagraph"/>
-        <w:numPr>
-          <w:ilvl w:val="0"/>
-          <w:numId w:val="30"/>
-        </w:numPr>
-        <w:spacing w:after="0" w:line="360" w:lineRule="auto"/>
-        <w:ind w:left="567" w:hanging="567"/>
-        <w:jc w:val="both"/>
-        <w:rPr>
-          <w:rFonts w:ascii="Times New Roman" w:hAnsi="Times New Roman" w:cs="Times New Roman"/>
-          <w:sz w:val="26"/>
-          <w:szCs w:val="26"/>
-        </w:rPr>
-      </w:pPr>
-      <w:r>
-        <w:rPr>
-          <w:rFonts w:ascii="Times New Roman" w:hAnsi="Times New Roman" w:cs="Times New Roman"/>
-          <w:sz w:val="26"/>
-          <w:szCs w:val="26"/>
-        </w:rPr>
-        <w:t>Google, Temasek, and Bain &amp; Company. (2025). "e-Conomy SEA 2025: Roaring 20s: The SEA Digital Decade."</w:t>
-      </w:r>
-    </w:p>
-    <w:p>
-      <w:pPr>
-        <w:pStyle w:val="ListParagraph"/>
-        <w:numPr>
-          <w:ilvl w:val="0"/>
-          <w:numId w:val="30"/>
-        </w:numPr>
-        <w:spacing w:after="0" w:line="360" w:lineRule="auto"/>
-        <w:ind w:left="567" w:hanging="567"/>
-        <w:jc w:val="both"/>
-        <w:rPr>
-          <w:rFonts w:ascii="Times New Roman" w:hAnsi="Times New Roman" w:cs="Times New Roman"/>
-          <w:sz w:val="26"/>
-          <w:szCs w:val="26"/>
-        </w:rPr>
-      </w:pPr>
-      <w:r>
-        <w:rPr>
-          <w:rFonts w:ascii="Times New Roman" w:hAnsi="Times New Roman" w:cs="Times New Roman"/>
-          <w:sz w:val="26"/>
-          <w:szCs w:val="26"/>
-        </w:rPr>
-        <w:t>Google Analytics Support. (n.d.). "Dimensions and Metrics Explorer." Retrieved from Google Analytics Help.</w:t>
-      </w:r>
-    </w:p>
-    <w:p>
-      <w:pPr>
-        <w:pStyle w:val="ListParagraph"/>
-        <w:numPr>
-          <w:ilvl w:val="0"/>
-          <w:numId w:val="30"/>
-        </w:numPr>
-        <w:spacing w:after="0" w:line="360" w:lineRule="auto"/>
-        <w:ind w:left="567" w:hanging="567"/>
-        <w:jc w:val="both"/>
-        <w:rPr>
-          <w:rFonts w:ascii="Times New Roman" w:hAnsi="Times New Roman" w:cs="Times New Roman"/>
-          <w:sz w:val="26"/>
-          <w:szCs w:val="26"/>
-        </w:rPr>
-      </w:pPr>
-      <w:r>
-        <w:rPr>
-          <w:rFonts w:ascii="Times New Roman" w:hAnsi="Times New Roman" w:cs="Times New Roman"/>
-          <w:sz w:val="26"/>
-          <w:szCs w:val="26"/>
-          <w:lang w:val="pt-BR"/>
-        </w:rPr>
-        <w:t xml:space="preserve">Chen, T., &amp; Guestrin, C. (2016). </w:t>
-      </w:r>
-      <w:r>
-        <w:rPr>
-          <w:rFonts w:ascii="Times New Roman" w:hAnsi="Times New Roman" w:cs="Times New Roman"/>
-          <w:sz w:val="26"/>
-          <w:szCs w:val="26"/>
-        </w:rPr>
-        <w:t xml:space="preserve">"XGBoost: A scalable tree boosting system." </w:t>
-      </w:r>
-      <w:r>
-        <w:rPr>
-          <w:rFonts w:ascii="Times New Roman" w:hAnsi="Times New Roman" w:cs="Times New Roman"/>
-          <w:i/>
-          <w:iCs/>
-          <w:sz w:val="26"/>
-          <w:szCs w:val="26"/>
-        </w:rPr>
-        <w:t>Proceedings of the 22nd ACM SIGKDD International Conference on Knowledge Discovery and Data Mining</w:t>
-      </w:r>
-      <w:r>
-        <w:rPr>
-          <w:rFonts w:ascii="Times New Roman" w:hAnsi="Times New Roman" w:cs="Times New Roman"/>
-          <w:sz w:val="26"/>
-          <w:szCs w:val="26"/>
-        </w:rPr>
-        <w:t>, 785-794.</w:t>
-      </w:r>
-    </w:p>
-    <w:p>
-      <w:pPr>
-        <w:pStyle w:val="ListParagraph"/>
-        <w:numPr>
-          <w:ilvl w:val="0"/>
-          <w:numId w:val="30"/>
-        </w:numPr>
-        <w:spacing w:after="0" w:line="360" w:lineRule="auto"/>
-        <w:ind w:left="567" w:hanging="567"/>
-        <w:jc w:val="both"/>
-        <w:rPr>
-          <w:rFonts w:ascii="Times New Roman" w:hAnsi="Times New Roman" w:cs="Times New Roman"/>
-          <w:sz w:val="26"/>
-          <w:szCs w:val="26"/>
-        </w:rPr>
-      </w:pPr>
-      <w:r>
-        <w:rPr>
-          <w:rFonts w:ascii="Times New Roman" w:hAnsi="Times New Roman" w:cs="Times New Roman"/>
-          <w:sz w:val="26"/>
-          <w:szCs w:val="26"/>
-        </w:rPr>
-        <w:t xml:space="preserve">Friedman, J. H. (2001). "Greedy function approximation: a gradient boosting machine." </w:t>
-      </w:r>
-      <w:r>
-        <w:rPr>
-          <w:rFonts w:ascii="Times New Roman" w:hAnsi="Times New Roman" w:cs="Times New Roman"/>
-          <w:i/>
-          <w:iCs/>
-          <w:sz w:val="26"/>
-          <w:szCs w:val="26"/>
-        </w:rPr>
-        <w:t>Annals of Statistics</w:t>
-      </w:r>
-      <w:r>
-        <w:rPr>
-          <w:rFonts w:ascii="Times New Roman" w:hAnsi="Times New Roman" w:cs="Times New Roman"/>
-          <w:sz w:val="26"/>
-          <w:szCs w:val="26"/>
-        </w:rPr>
-        <w:t>, 1189-1232.</w:t>
-      </w:r>
-    </w:p>
-    <w:p>
-      <w:pPr>
-        <w:pStyle w:val="ListParagraph"/>
-        <w:numPr>
-          <w:ilvl w:val="0"/>
-          <w:numId w:val="30"/>
-        </w:numPr>
-        <w:spacing w:after="0" w:line="360" w:lineRule="auto"/>
-        <w:ind w:left="567" w:hanging="567"/>
-        <w:jc w:val="both"/>
-        <w:rPr>
-          <w:rFonts w:ascii="Times New Roman" w:hAnsi="Times New Roman" w:cs="Times New Roman"/>
-          <w:sz w:val="26"/>
-          <w:szCs w:val="26"/>
-        </w:rPr>
-      </w:pPr>
-      <w:r>
-        <w:rPr>
-          <w:rFonts w:ascii="Times New Roman" w:hAnsi="Times New Roman" w:cs="Times New Roman"/>
-          <w:sz w:val="26"/>
-          <w:szCs w:val="26"/>
-        </w:rPr>
-        <w:t xml:space="preserve">Breiman, L. (2001). "Random </w:t>
-      </w:r>
-      <w:r>
-        <w:rPr>
-          <w:rFonts w:ascii="Times New Roman" w:hAnsi="Times New Roman" w:cs="Times New Roman"/>
-          <w:sz w:val="26"/>
-          <w:szCs w:val="26"/>
-        </w:rPr>
-        <w:t>Forests</w:t>
-      </w:r>
-      <w:r>
-        <w:rPr>
-          <w:rFonts w:ascii="Times New Roman" w:hAnsi="Times New Roman" w:cs="Times New Roman"/>
-          <w:sz w:val="26"/>
-          <w:szCs w:val="26"/>
-        </w:rPr>
-        <w:t xml:space="preserve">." </w:t>
-      </w:r>
-      <w:r>
-        <w:rPr>
-          <w:rFonts w:ascii="Times New Roman" w:hAnsi="Times New Roman" w:cs="Times New Roman"/>
-          <w:i/>
-          <w:iCs/>
-          <w:sz w:val="26"/>
-          <w:szCs w:val="26"/>
-        </w:rPr>
-        <w:t>Machine Learning</w:t>
-      </w:r>
-      <w:r>
-        <w:rPr>
-          <w:rFonts w:ascii="Times New Roman" w:hAnsi="Times New Roman" w:cs="Times New Roman"/>
-          <w:sz w:val="26"/>
-          <w:szCs w:val="26"/>
-        </w:rPr>
-        <w:t>, 45(1), 5-32.</w:t>
-      </w:r>
-    </w:p>
-    <w:p>
-      <w:pPr>
-        <w:pStyle w:val="ListParagraph"/>
-        <w:numPr>
-          <w:ilvl w:val="0"/>
-          <w:numId w:val="30"/>
-        </w:numPr>
-        <w:spacing w:after="0" w:line="360" w:lineRule="auto"/>
-        <w:ind w:left="567" w:hanging="567"/>
-        <w:jc w:val="both"/>
-        <w:rPr>
-          <w:rFonts w:ascii="Times New Roman" w:hAnsi="Times New Roman" w:cs="Times New Roman"/>
-          <w:sz w:val="26"/>
-          <w:szCs w:val="26"/>
-        </w:rPr>
-      </w:pPr>
-      <w:r>
-        <w:rPr>
-          <w:rFonts w:ascii="Times New Roman" w:hAnsi="Times New Roman" w:cs="Times New Roman"/>
-          <w:sz w:val="26"/>
-          <w:szCs w:val="26"/>
-        </w:rPr>
-        <w:t xml:space="preserve">Cover, T., &amp; Hart, P. (1967). "Nearest neighbor pattern classification." </w:t>
-      </w:r>
-      <w:r>
-        <w:rPr>
-          <w:rFonts w:ascii="Times New Roman" w:hAnsi="Times New Roman" w:cs="Times New Roman"/>
-          <w:i/>
-          <w:iCs/>
-          <w:sz w:val="26"/>
-          <w:szCs w:val="26"/>
-        </w:rPr>
-        <w:t>IEEE Transactions on Information Theory</w:t>
-      </w:r>
-      <w:r>
-        <w:rPr>
-          <w:rFonts w:ascii="Times New Roman" w:hAnsi="Times New Roman" w:cs="Times New Roman"/>
-          <w:sz w:val="26"/>
-          <w:szCs w:val="26"/>
-        </w:rPr>
-        <w:t>, 13(1), 21-27.</w:t>
-      </w:r>
-    </w:p>
-    <w:p>
-      <w:pPr>
-        <w:pStyle w:val="ListParagraph"/>
-        <w:numPr>
-          <w:ilvl w:val="0"/>
-          <w:numId w:val="30"/>
-        </w:numPr>
-        <w:spacing w:after="0" w:line="360" w:lineRule="auto"/>
-        <w:ind w:left="567" w:hanging="567"/>
-        <w:jc w:val="both"/>
-        <w:rPr>
-          <w:rFonts w:ascii="Times New Roman" w:hAnsi="Times New Roman" w:cs="Times New Roman"/>
-          <w:sz w:val="26"/>
-          <w:szCs w:val="26"/>
-        </w:rPr>
-      </w:pPr>
-      <w:r>
-        <w:rPr>
-          <w:rFonts w:ascii="Times New Roman" w:hAnsi="Times New Roman" w:cs="Times New Roman"/>
-          <w:sz w:val="26"/>
-          <w:szCs w:val="26"/>
-        </w:rPr>
-        <w:t xml:space="preserve">Chawla, N. V., Bowyer, K. W., Hall, L. O., &amp; Kegelmeyer, W. P. (2002). "SMOTE: synthetic minority over-sampling technique." </w:t>
-      </w:r>
-      <w:r>
-        <w:rPr>
-          <w:rFonts w:ascii="Times New Roman" w:hAnsi="Times New Roman" w:cs="Times New Roman"/>
-          <w:i/>
-          <w:iCs/>
-          <w:sz w:val="26"/>
-          <w:szCs w:val="26"/>
-        </w:rPr>
-        <w:t>Journal of Artificial Intelligence Research</w:t>
-      </w:r>
-      <w:r>
-        <w:rPr>
-          <w:rFonts w:ascii="Times New Roman" w:hAnsi="Times New Roman" w:cs="Times New Roman"/>
-          <w:sz w:val="26"/>
-          <w:szCs w:val="26"/>
-        </w:rPr>
-        <w:t>, 16, 321-357.</w:t>
-      </w:r>
-    </w:p>
-    <w:p>
-      <w:pPr>
-        <w:pStyle w:val="ListParagraph"/>
-        <w:numPr>
-          <w:ilvl w:val="0"/>
-          <w:numId w:val="30"/>
-        </w:numPr>
-        <w:spacing w:after="0" w:line="360" w:lineRule="auto"/>
-        <w:ind w:left="567" w:hanging="567"/>
-        <w:jc w:val="both"/>
-        <w:rPr>
-          <w:rFonts w:ascii="Times New Roman" w:hAnsi="Times New Roman" w:cs="Times New Roman"/>
-          <w:sz w:val="26"/>
-          <w:szCs w:val="26"/>
-        </w:rPr>
-      </w:pPr>
-      <w:r>
-        <w:rPr>
-          <w:rFonts w:ascii="Times New Roman" w:hAnsi="Times New Roman" w:cs="Times New Roman"/>
-          <w:sz w:val="26"/>
-          <w:szCs w:val="26"/>
-        </w:rPr>
-        <w:t xml:space="preserve">Fawcett, T. (2006). "An introduction to ROC analysis." </w:t>
-      </w:r>
-      <w:r>
-        <w:rPr>
-          <w:rFonts w:ascii="Times New Roman" w:hAnsi="Times New Roman" w:cs="Times New Roman"/>
-          <w:i/>
-          <w:iCs/>
-          <w:sz w:val="26"/>
-          <w:szCs w:val="26"/>
-        </w:rPr>
-        <w:t>Pattern Recognition Letters</w:t>
-      </w:r>
-      <w:r>
-        <w:rPr>
-          <w:rFonts w:ascii="Times New Roman" w:hAnsi="Times New Roman" w:cs="Times New Roman"/>
-          <w:sz w:val="26"/>
-          <w:szCs w:val="26"/>
-        </w:rPr>
-        <w:t>, 27(8), 861-874.</w:t>
-      </w:r>
-    </w:p>
-    <w:p>
-      <w:pPr>
-        <w:pStyle w:val="ListParagraph"/>
-        <w:numPr>
-          <w:ilvl w:val="0"/>
-          <w:numId w:val="30"/>
-        </w:numPr>
-        <w:spacing w:after="0" w:line="360" w:lineRule="auto"/>
-        <w:ind w:left="567" w:hanging="567"/>
-        <w:jc w:val="both"/>
-        <w:rPr>
-          <w:rFonts w:ascii="Times New Roman" w:hAnsi="Times New Roman" w:cs="Times New Roman"/>
-          <w:sz w:val="26"/>
-          <w:szCs w:val="26"/>
-        </w:rPr>
-      </w:pPr>
-      <w:r>
-        <w:rPr>
-          <w:rFonts w:ascii="Times New Roman" w:hAnsi="Times New Roman" w:cs="Times New Roman"/>
-          <w:sz w:val="26"/>
-          <w:szCs w:val="26"/>
-        </w:rPr>
-        <w:t xml:space="preserve">Powers, D. M. (2011). "Evaluation: from precision, recall and F-measure to ROC, informedness, markedness and correlation." </w:t>
-      </w:r>
-      <w:r>
-        <w:rPr>
-          <w:rFonts w:ascii="Times New Roman" w:hAnsi="Times New Roman" w:cs="Times New Roman"/>
-          <w:i/>
-          <w:iCs/>
-          <w:sz w:val="26"/>
-          <w:szCs w:val="26"/>
-        </w:rPr>
-        <w:t>Journal of Machine Learning Technologies</w:t>
-      </w:r>
-      <w:r>
-        <w:rPr>
-          <w:rFonts w:ascii="Times New Roman" w:hAnsi="Times New Roman" w:cs="Times New Roman"/>
-          <w:sz w:val="26"/>
-          <w:szCs w:val="26"/>
-        </w:rPr>
-        <w:t>, 2(1), 37-63.</w:t>
-      </w:r>
-    </w:p>
-    <w:p>
-      <w:pPr>
-        <w:pStyle w:val="ListParagraph"/>
-        <w:numPr>
-          <w:ilvl w:val="0"/>
-          <w:numId w:val="30"/>
-        </w:numPr>
-        <w:spacing w:after="0" w:line="360" w:lineRule="auto"/>
-        <w:ind w:left="567" w:hanging="567"/>
-        <w:jc w:val="both"/>
-        <w:rPr>
-          <w:rFonts w:ascii="Times New Roman" w:hAnsi="Times New Roman" w:cs="Times New Roman"/>
-          <w:sz w:val="26"/>
-          <w:szCs w:val="26"/>
-        </w:rPr>
-      </w:pPr>
-      <w:r>
-        <w:rPr>
-          <w:rFonts w:ascii="Times New Roman" w:hAnsi="Times New Roman" w:cs="Times New Roman"/>
-          <w:sz w:val="26"/>
-          <w:szCs w:val="26"/>
-        </w:rPr>
-        <w:t xml:space="preserve">Vũ Trọng Phụng, Đinh Trần Thi, &amp; Nguyễn Thái Bình. (2021). "Ứng dụng các thuật toán Học máy trong việc dự báo hành vi mua hàng của người tiêu dùng </w:t>
-      </w:r>
-      <w:r>
-        <w:rPr>
-          <w:rFonts w:ascii="Times New Roman" w:hAnsi="Times New Roman" w:cs="Times New Roman"/>
-          <w:sz w:val="26"/>
-          <w:szCs w:val="26"/>
-        </w:rPr>
-        <w:lastRenderedPageBreak/>
-        <w:t xml:space="preserve">trên các nền tảng thương mại điện tử." </w:t>
-      </w:r>
-      <w:r>
-        <w:rPr>
-          <w:rFonts w:ascii="Times New Roman" w:hAnsi="Times New Roman" w:cs="Times New Roman"/>
-          <w:i/>
-          <w:iCs/>
-          <w:sz w:val="26"/>
-          <w:szCs w:val="26"/>
-        </w:rPr>
-        <w:t>Tạp chí Khoa học và Công nghệ Việt Nam</w:t>
-      </w:r>
-      <w:r>
-        <w:rPr>
-          <w:rFonts w:ascii="Times New Roman" w:hAnsi="Times New Roman" w:cs="Times New Roman"/>
-          <w:sz w:val="26"/>
-          <w:szCs w:val="26"/>
-        </w:rPr>
-        <w:t>.</w:t>
-      </w:r>
-    </w:p>
-    <w:p>
-      <w:pPr>
-        <w:pStyle w:val="ListParagraph"/>
-        <w:numPr>
-          <w:ilvl w:val="0"/>
-          <w:numId w:val="30"/>
-        </w:numPr>
-        <w:spacing w:after="0" w:line="360" w:lineRule="auto"/>
-        <w:ind w:left="567" w:hanging="567"/>
-        <w:jc w:val="both"/>
-        <w:rPr>
-          <w:rFonts w:ascii="Times New Roman" w:hAnsi="Times New Roman" w:cs="Times New Roman"/>
-          <w:sz w:val="26"/>
-          <w:szCs w:val="26"/>
-        </w:rPr>
-      </w:pPr>
-      <w:r>
-        <w:rPr>
-          <w:rFonts w:ascii="Times New Roman" w:hAnsi="Times New Roman" w:cs="Times New Roman"/>
-          <w:sz w:val="26"/>
-          <w:szCs w:val="26"/>
-        </w:rPr>
-        <w:t xml:space="preserve"> Khoa Điện tử - Viễn thông, Trường Đại học Khoa học Tự nhiên, ĐHQG-HCM. (2025). </w:t>
-      </w:r>
-      <w:r>
-        <w:rPr>
-          <w:rFonts w:ascii="Times New Roman" w:hAnsi="Times New Roman" w:cs="Times New Roman"/>
-          <w:i/>
-          <w:iCs/>
-          <w:sz w:val="26"/>
-          <w:szCs w:val="26"/>
-        </w:rPr>
-        <w:t>Giáo trình Kỹ thuật Học máy và Hệ thống thông minh</w:t>
-      </w:r>
-      <w:r>
-        <w:rPr>
-          <w:rFonts w:ascii="Times New Roman" w:hAnsi="Times New Roman" w:cs="Times New Roman"/>
-          <w:sz w:val="26"/>
-          <w:szCs w:val="26"/>
-        </w:rPr>
-        <w:t>. TP. Hồ Chí Minh: NXB Đại học Quốc gia TP.HCM.</w:t>
-      </w:r>
+        </w:rPr>
+      </w:pPr>
     </w:p>
     <w:sectPr>
       <w:pgSz w:w="11909" w:h="16834" w:code="9"/>
@@ -48441,7 +49116,6 @@
   <w:style w:type="character" w:default="1" w:styleId="DefaultParagraphFont">
     <w:name w:val="Default Paragraph Font"/>
     <w:uiPriority w:val="1"/>
-    <w:semiHidden/>
     <w:unhideWhenUsed/>
   </w:style>
   <w:style w:type="table" w:default="1" w:styleId="TableNormal">
@@ -49084,6 +49758,66 @@
     <w:basedOn w:val="DefaultParagraphFont"/>
     <w:rsid w:val="00375D82"/>
   </w:style>
+  <w:style w:type="character" w:customStyle="1" w:styleId="citation-50">
+    <w:name w:val="citation-50"/>
+    <w:basedOn w:val="DefaultParagraphFont"/>
+    <w:rsid w:val="00DA52B5"/>
+  </w:style>
+  <w:style w:type="character" w:customStyle="1" w:styleId="citation-49">
+    <w:name w:val="citation-49"/>
+    <w:basedOn w:val="DefaultParagraphFont"/>
+    <w:rsid w:val="00DA52B5"/>
+  </w:style>
+  <w:style w:type="character" w:customStyle="1" w:styleId="citation-48">
+    <w:name w:val="citation-48"/>
+    <w:basedOn w:val="DefaultParagraphFont"/>
+    <w:rsid w:val="00DA52B5"/>
+  </w:style>
+  <w:style w:type="character" w:customStyle="1" w:styleId="citation-47">
+    <w:name w:val="citation-47"/>
+    <w:basedOn w:val="DefaultParagraphFont"/>
+    <w:rsid w:val="00DA52B5"/>
+  </w:style>
+  <w:style w:type="character" w:customStyle="1" w:styleId="citation-46">
+    <w:name w:val="citation-46"/>
+    <w:basedOn w:val="DefaultParagraphFont"/>
+    <w:rsid w:val="00DA52B5"/>
+  </w:style>
+  <w:style w:type="character" w:customStyle="1" w:styleId="citation-45">
+    <w:name w:val="citation-45"/>
+    <w:basedOn w:val="DefaultParagraphFont"/>
+    <w:rsid w:val="00DA52B5"/>
+  </w:style>
+  <w:style w:type="character" w:customStyle="1" w:styleId="citation-44">
+    <w:name w:val="citation-44"/>
+    <w:basedOn w:val="DefaultParagraphFont"/>
+    <w:rsid w:val="00DA52B5"/>
+  </w:style>
+  <w:style w:type="character" w:customStyle="1" w:styleId="citation-43">
+    <w:name w:val="citation-43"/>
+    <w:basedOn w:val="DefaultParagraphFont"/>
+    <w:rsid w:val="00DA52B5"/>
+  </w:style>
+  <w:style w:type="character" w:customStyle="1" w:styleId="citation-42">
+    <w:name w:val="citation-42"/>
+    <w:basedOn w:val="DefaultParagraphFont"/>
+    <w:rsid w:val="00DA52B5"/>
+  </w:style>
+  <w:style w:type="character" w:customStyle="1" w:styleId="citation-41">
+    <w:name w:val="citation-41"/>
+    <w:basedOn w:val="DefaultParagraphFont"/>
+    <w:rsid w:val="00DA52B5"/>
+  </w:style>
+  <w:style w:type="character" w:customStyle="1" w:styleId="citation-40">
+    <w:name w:val="citation-40"/>
+    <w:basedOn w:val="DefaultParagraphFont"/>
+    <w:rsid w:val="00DA52B5"/>
+  </w:style>
+  <w:style w:type="character" w:customStyle="1" w:styleId="citation-39">
+    <w:name w:val="citation-39"/>
+    <w:basedOn w:val="DefaultParagraphFont"/>
+    <w:rsid w:val="00DA52B5"/>
+  </w:style>
 </w:styles>
 </file>
 
@@ -49387,7 +50121,7 @@
 </file>
 
 <file path=customXml/itemProps1.xml><?xml version="1.0" encoding="utf-8"?>
-<ds:datastoreItem xmlns:ds="http://schemas.openxmlformats.org/officeDocument/2006/customXml" ds:itemID="{5B879C41-49E7-44D9-AA66-BDC2E4D3964D}">
+<ds:datastoreItem xmlns:ds="http://schemas.openxmlformats.org/officeDocument/2006/customXml" ds:itemID="{AA402605-6CAE-4649-8ED5-A0589F9D29CA}">
   <ds:schemaRefs>
     <ds:schemaRef ds:uri="http://schemas.openxmlformats.org/officeDocument/2006/bibliography"/>
   </ds:schemaRefs>

</xml_diff>

<commit_message>
Update references in the report on machine learning applications in e-commerce
</commit_message>
<xml_diff>
--- a/docs/reports/bao-cao-tien-do.docx
+++ b/docs/reports/bao-cao-tien-do.docx
@@ -18226,17 +18226,7 @@
           <w:sz w:val="26"/>
           <w:szCs w:val="26"/>
         </w:rPr>
-        <w:t xml:space="preserve"> tăng lên. Người dùng sẵn sàng duyệt qua nhiều trang danh mục hơn và dễ bị tác động bởi các gợi ý sản phẩm liên quan, dẫn đến khả năng mua sắm </w:t>
-      </w:r>
-      <w:bookmarkStart w:id="1" w:name="_GoBack"/>
-      <w:bookmarkEnd w:id="1"/>
-      <w:r>
-        <w:rPr>
-          <w:rFonts w:ascii="Times New Roman" w:hAnsi="Times New Roman"/>
-          <w:sz w:val="26"/>
-          <w:szCs w:val="26"/>
-        </w:rPr>
-        <w:t>ngẫu hứng cao hơn.</w:t>
+        <w:t xml:space="preserve"> tăng lên. Người dùng sẵn sàng duyệt qua nhiều trang danh mục hơn và dễ bị tác động bởi các gợi ý sản phẩm liên quan, dẫn đến khả năng mua sắm ngẫu hứng cao hơn.</w:t>
       </w:r>
     </w:p>
     <w:p>
@@ -43148,6 +43138,8 @@
         <w:t>.</w:t>
       </w:r>
     </w:p>
+    <w:bookmarkStart w:id="1" w:name="_GoBack"/>
+    <w:bookmarkEnd w:id="1"/>
     <w:p>
       <w:pPr>
         <w:pStyle w:val="NormalWeb"/>
@@ -43216,7 +43208,7 @@
               </wp:anchor>
             </w:drawing>
           </mc:Choice>
-          <mc:Fallback xmlns:cx1="http://schemas.microsoft.com/office/drawing/2015/9/8/chartex" xmlns:cx2="http://schemas.microsoft.com/office/drawing/2015/10/21/chartex" xmlns:cx3="http://schemas.microsoft.com/office/drawing/2016/5/9/chartex" xmlns:cx4="http://schemas.microsoft.com/office/drawing/2016/5/10/chartex" xmlns:cx5="http://schemas.microsoft.com/office/drawing/2016/5/11/chartex" xmlns:cx6="http://schemas.microsoft.com/office/drawing/2016/5/12/chartex" xmlns:cx7="http://schemas.microsoft.com/office/drawing/2016/5/13/chartex" xmlns:cx8="http://schemas.microsoft.com/office/drawing/2016/5/14/chartex" xmlns:aink="http://schemas.microsoft.com/office/drawing/2016/ink" xmlns:am3d="http://schemas.microsoft.com/office/drawing/2017/model3d" xmlns:oel="http://schemas.microsoft.com/office/2019/extlst" xmlns:w16cex="http://schemas.microsoft.com/office/word/2018/wordml/cex" xmlns:w16cid="http://schemas.microsoft.com/office/word/2016/wordml/cid" xmlns:w16="http://schemas.microsoft.com/office/word/2018/wordml" xmlns:w16du="http://schemas.microsoft.com/office/word/2023/wordml/word16du" xmlns:w16sdtdh="http://schemas.microsoft.com/office/word/2020/wordml/sdtdatahash" xmlns:w16sdtfl="http://schemas.microsoft.com/office/word/2024/wordml/sdtformatlock">
+          <mc:Fallback xmlns:w16sdtfl="http://schemas.microsoft.com/office/word/2024/wordml/sdtformatlock" xmlns:w16sdtdh="http://schemas.microsoft.com/office/word/2020/wordml/sdtdatahash" xmlns:w16du="http://schemas.microsoft.com/office/word/2023/wordml/word16du" xmlns:w16="http://schemas.microsoft.com/office/word/2018/wordml" xmlns:w16cid="http://schemas.microsoft.com/office/word/2016/wordml/cid" xmlns:w16cex="http://schemas.microsoft.com/office/word/2018/wordml/cex" xmlns:oel="http://schemas.microsoft.com/office/2019/extlst" xmlns:am3d="http://schemas.microsoft.com/office/drawing/2017/model3d" xmlns:aink="http://schemas.microsoft.com/office/drawing/2016/ink" xmlns:cx8="http://schemas.microsoft.com/office/drawing/2016/5/14/chartex" xmlns:cx7="http://schemas.microsoft.com/office/drawing/2016/5/13/chartex" xmlns:cx6="http://schemas.microsoft.com/office/drawing/2016/5/12/chartex" xmlns:cx5="http://schemas.microsoft.com/office/drawing/2016/5/11/chartex" xmlns:cx4="http://schemas.microsoft.com/office/drawing/2016/5/10/chartex" xmlns:cx3="http://schemas.microsoft.com/office/drawing/2016/5/9/chartex" xmlns:cx2="http://schemas.microsoft.com/office/drawing/2015/10/21/chartex" xmlns:cx1="http://schemas.microsoft.com/office/drawing/2015/9/8/chartex">
             <w:pict>
               <v:line w14:anchorId="12A36378" id="Straight Connector 1" o:spid="_x0000_s1026" style="position:absolute;z-index:251659264;visibility:visible;mso-wrap-style:square;mso-wrap-distance-left:9pt;mso-wrap-distance-top:0;mso-wrap-distance-right:9pt;mso-wrap-distance-bottom:0;mso-position-horizontal:absolute;mso-position-horizontal-relative:text;mso-position-vertical:absolute;mso-position-vertical-relative:text" from="152.55pt,8.8pt" to="280.35pt,8.8pt" o:gfxdata="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" strokecolor="#156082 [3204]" strokeweight=".5pt">
                 <v:stroke joinstyle="miter"/>
@@ -43249,505 +43241,1526 @@
     </w:p>
     <w:p>
       <w:pPr>
-        <w:pStyle w:val="NormalWeb"/>
+        <w:pStyle w:val="Bibliography"/>
         <w:spacing w:line="360" w:lineRule="auto"/>
-        <w:rPr>
-          <w:sz w:val="26"/>
-          <w:szCs w:val="26"/>
-        </w:rPr>
-      </w:pPr>
-      <w:r>
-        <w:rPr>
-          <w:sz w:val="26"/>
-          <w:szCs w:val="26"/>
-        </w:rPr>
-        <w:t xml:space="preserve">[1] L. Breiman, “Random Forests,” </w:t>
-      </w:r>
-      <w:r>
-        <w:rPr>
+        <w:jc w:val="both"/>
+        <w:rPr>
+          <w:rFonts w:ascii="Times New Roman" w:hAnsi="Times New Roman"/>
+          <w:sz w:val="26"/>
+          <w:szCs w:val="26"/>
+        </w:rPr>
+      </w:pPr>
+      <w:r>
+        <w:rPr>
+          <w:rFonts w:ascii="Times New Roman" w:hAnsi="Times New Roman"/>
+          <w:b/>
+          <w:sz w:val="26"/>
+          <w:szCs w:val="26"/>
+        </w:rPr>
+        <w:fldChar w:fldCharType="begin"/>
+      </w:r>
+      <w:r>
+        <w:rPr>
+          <w:rFonts w:ascii="Times New Roman" w:hAnsi="Times New Roman"/>
+          <w:b/>
+          <w:sz w:val="26"/>
+          <w:szCs w:val="26"/>
+        </w:rPr>
+        <w:instrText xml:space="preserve"> ADDIN ZOTERO_BIBL {"uncited":[],"omitted":[],"custom":[]} CSL_BIBLIOGRAPHY </w:instrText>
+      </w:r>
+      <w:r>
+        <w:rPr>
+          <w:rFonts w:ascii="Times New Roman" w:hAnsi="Times New Roman"/>
+          <w:b/>
+          <w:sz w:val="26"/>
+          <w:szCs w:val="26"/>
+        </w:rPr>
+        <w:fldChar w:fldCharType="separate"/>
+      </w:r>
+      <w:r>
+        <w:rPr>
+          <w:rFonts w:ascii="Times New Roman" w:hAnsi="Times New Roman"/>
+          <w:sz w:val="26"/>
+          <w:szCs w:val="26"/>
+        </w:rPr>
+        <w:t>[1]</w:t>
+      </w:r>
+      <w:r>
+        <w:rPr>
+          <w:rFonts w:ascii="Times New Roman" w:hAnsi="Times New Roman"/>
+          <w:sz w:val="26"/>
+          <w:szCs w:val="26"/>
+        </w:rPr>
+        <w:tab/>
+        <w:t xml:space="preserve">B. W. Yap, K. A. Rani, H. A. A. Rahman, S. Fong, Z. Khairudin, and N. N. Abdullah, “An Application of Oversampling, Undersampling, Bagging and Boosting in Handling Imbalanced Datasets,” in </w:t>
+      </w:r>
+      <w:r>
+        <w:rPr>
+          <w:rFonts w:ascii="Times New Roman" w:hAnsi="Times New Roman"/>
           <w:i/>
           <w:iCs/>
           <w:sz w:val="26"/>
           <w:szCs w:val="26"/>
         </w:rPr>
-        <w:t>Machine Learning</w:t>
-      </w:r>
-      <w:r>
-        <w:rPr>
-          <w:sz w:val="26"/>
-          <w:szCs w:val="26"/>
-        </w:rPr>
-        <w:t xml:space="preserve">, Vol. </w:t>
-      </w:r>
-      <w:r>
-        <w:rPr>
-          <w:rStyle w:val="citation-50"/>
-          <w:rFonts w:eastAsiaTheme="majorEastAsia"/>
-          <w:sz w:val="26"/>
-          <w:szCs w:val="26"/>
-        </w:rPr>
-        <w:t xml:space="preserve">45, No. 1, 2001, pp. 5-32. </w:t>
-      </w:r>
-    </w:p>
-    <w:p>
-      <w:pPr>
-        <w:pStyle w:val="NormalWeb"/>
+        <w:t>Proceedings of the First International Conference on Advanced Data and Information Engineering (DaEng-2013)</w:t>
+      </w:r>
+      <w:r>
+        <w:rPr>
+          <w:rFonts w:ascii="Times New Roman" w:hAnsi="Times New Roman"/>
+          <w:sz w:val="26"/>
+          <w:szCs w:val="26"/>
+        </w:rPr>
+        <w:t>, vol. 285, T. Herawan, M. M. Deris, and J. Abawajy, Eds., in Lecture Notes in Electrical Engineering, vol. 285. , Singapore: Springer Singapore, 2014, pp. 13–22. doi: 10.1007/978-981-4585-18-7_2.</w:t>
+      </w:r>
+    </w:p>
+    <w:p>
+      <w:pPr>
+        <w:pStyle w:val="Bibliography"/>
         <w:spacing w:line="360" w:lineRule="auto"/>
-        <w:rPr>
-          <w:sz w:val="26"/>
-          <w:szCs w:val="26"/>
-        </w:rPr>
-      </w:pPr>
-      <w:r>
-        <w:rPr>
-          <w:sz w:val="26"/>
-          <w:szCs w:val="26"/>
-        </w:rPr>
-        <w:t xml:space="preserve">[2] N. V. Chawla, K. W. Bowyer, L. O. Hall, and W. P. Kegelmeyer, “SMOTE: Synthetic Minority Over-sampling Technique,” </w:t>
-      </w:r>
-      <w:r>
-        <w:rPr>
+        <w:jc w:val="both"/>
+        <w:rPr>
+          <w:rFonts w:ascii="Times New Roman" w:hAnsi="Times New Roman"/>
+          <w:sz w:val="26"/>
+          <w:szCs w:val="26"/>
+        </w:rPr>
+      </w:pPr>
+      <w:r>
+        <w:rPr>
+          <w:rFonts w:ascii="Times New Roman" w:hAnsi="Times New Roman"/>
+          <w:sz w:val="26"/>
+          <w:szCs w:val="26"/>
+        </w:rPr>
+        <w:t>[2]</w:t>
+      </w:r>
+      <w:r>
+        <w:rPr>
+          <w:rFonts w:ascii="Times New Roman" w:hAnsi="Times New Roman"/>
+          <w:sz w:val="26"/>
+          <w:szCs w:val="26"/>
+        </w:rPr>
+        <w:tab/>
+        <w:t xml:space="preserve">T. Fawcett, “An introduction to ROC analysis,” </w:t>
+      </w:r>
+      <w:r>
+        <w:rPr>
+          <w:rFonts w:ascii="Times New Roman" w:hAnsi="Times New Roman"/>
           <w:i/>
           <w:iCs/>
           <w:sz w:val="26"/>
           <w:szCs w:val="26"/>
         </w:rPr>
-        <w:t>Journal of Artificial Intelligence Research</w:t>
-      </w:r>
-      <w:r>
-        <w:rPr>
-          <w:sz w:val="26"/>
-          <w:szCs w:val="26"/>
-        </w:rPr>
-        <w:t xml:space="preserve">, Vol. </w:t>
-      </w:r>
-      <w:r>
-        <w:rPr>
-          <w:rStyle w:val="citation-49"/>
-          <w:rFonts w:eastAsiaTheme="majorEastAsia"/>
-          <w:sz w:val="26"/>
-          <w:szCs w:val="26"/>
-        </w:rPr>
-        <w:t xml:space="preserve">16, 2002, pp. 321-357. </w:t>
-      </w:r>
-    </w:p>
-    <w:p>
-      <w:pPr>
-        <w:pStyle w:val="NormalWeb"/>
+        <w:t>Pattern Recognit. Lett.</w:t>
+      </w:r>
+      <w:r>
+        <w:rPr>
+          <w:rFonts w:ascii="Times New Roman" w:hAnsi="Times New Roman"/>
+          <w:sz w:val="26"/>
+          <w:szCs w:val="26"/>
+        </w:rPr>
+        <w:t>, vol. 27, no. 8, pp. 861–874, 2006.</w:t>
+      </w:r>
+    </w:p>
+    <w:p>
+      <w:pPr>
+        <w:pStyle w:val="Bibliography"/>
         <w:spacing w:line="360" w:lineRule="auto"/>
-        <w:rPr>
-          <w:sz w:val="26"/>
-          <w:szCs w:val="26"/>
-        </w:rPr>
-      </w:pPr>
-      <w:r>
-        <w:rPr>
-          <w:rStyle w:val="citation-48"/>
-          <w:rFonts w:eastAsiaTheme="majorEastAsia"/>
-          <w:sz w:val="26"/>
-          <w:szCs w:val="26"/>
-        </w:rPr>
-        <w:t xml:space="preserve">[3] T. Chen and C. Guestrin, “XGBoost: A Scalable Tree Boosting System,” </w:t>
-      </w:r>
-      <w:r>
-        <w:rPr>
-          <w:rStyle w:val="citation-48"/>
-          <w:rFonts w:eastAsiaTheme="majorEastAsia"/>
+        <w:jc w:val="both"/>
+        <w:rPr>
+          <w:rFonts w:ascii="Times New Roman" w:hAnsi="Times New Roman"/>
+          <w:sz w:val="26"/>
+          <w:szCs w:val="26"/>
+        </w:rPr>
+      </w:pPr>
+      <w:r>
+        <w:rPr>
+          <w:rFonts w:ascii="Times New Roman" w:hAnsi="Times New Roman"/>
+          <w:sz w:val="26"/>
+          <w:szCs w:val="26"/>
+        </w:rPr>
+        <w:t>[3]</w:t>
+      </w:r>
+      <w:r>
+        <w:rPr>
+          <w:rFonts w:ascii="Times New Roman" w:hAnsi="Times New Roman"/>
+          <w:sz w:val="26"/>
+          <w:szCs w:val="26"/>
+        </w:rPr>
+        <w:tab/>
+        <w:t xml:space="preserve">R. Fedorko, Š. Kráľ, and I. Fedorko, “Artificial Intelligence and Machine Learning in the Context of E-commerce: A Literature Review,” in </w:t>
+      </w:r>
+      <w:r>
+        <w:rPr>
+          <w:rFonts w:ascii="Times New Roman" w:hAnsi="Times New Roman"/>
           <w:i/>
           <w:iCs/>
           <w:sz w:val="26"/>
           <w:szCs w:val="26"/>
         </w:rPr>
-        <w:t>Proc. of the 22nd ACM SIGKDD International Conference on Knowledge Discovery and Data Mining</w:t>
-      </w:r>
-      <w:r>
-        <w:rPr>
-          <w:rStyle w:val="citation-48"/>
-          <w:rFonts w:eastAsiaTheme="majorEastAsia"/>
-          <w:sz w:val="26"/>
-          <w:szCs w:val="26"/>
-        </w:rPr>
-        <w:t xml:space="preserve">, 2016, pp. 785-794. </w:t>
-      </w:r>
-    </w:p>
-    <w:p>
-      <w:pPr>
-        <w:pStyle w:val="NormalWeb"/>
+        <w:t>Communication and Intelligent Systems</w:t>
+      </w:r>
+      <w:r>
+        <w:rPr>
+          <w:rFonts w:ascii="Times New Roman" w:hAnsi="Times New Roman"/>
+          <w:sz w:val="26"/>
+          <w:szCs w:val="26"/>
+        </w:rPr>
+        <w:t>, vol. 461, H. Sharma, V. Shrivastava, K. Kumari Bharti, and L. Wang, Eds., in Lecture Notes in Networks and Systems, vol. 461. , Singapore: Springer Nature Singapore, 2022, pp. 1067–1082. doi: 10.1007/978-981-19-2130-8_82.</w:t>
+      </w:r>
+    </w:p>
+    <w:p>
+      <w:pPr>
+        <w:pStyle w:val="Bibliography"/>
         <w:spacing w:line="360" w:lineRule="auto"/>
-        <w:rPr>
-          <w:sz w:val="26"/>
-          <w:szCs w:val="26"/>
-        </w:rPr>
-      </w:pPr>
-      <w:r>
-        <w:rPr>
-          <w:sz w:val="26"/>
-          <w:szCs w:val="26"/>
-        </w:rPr>
-        <w:t xml:space="preserve">[4] T. Fawcett, “An introduction to ROC analysis,” </w:t>
-      </w:r>
-      <w:r>
-        <w:rPr>
+        <w:jc w:val="both"/>
+        <w:rPr>
+          <w:rFonts w:ascii="Times New Roman" w:hAnsi="Times New Roman"/>
+          <w:sz w:val="26"/>
+          <w:szCs w:val="26"/>
+        </w:rPr>
+      </w:pPr>
+      <w:r>
+        <w:rPr>
+          <w:rFonts w:ascii="Times New Roman" w:hAnsi="Times New Roman"/>
+          <w:sz w:val="26"/>
+          <w:szCs w:val="26"/>
+        </w:rPr>
+        <w:t>[4]</w:t>
+      </w:r>
+      <w:r>
+        <w:rPr>
+          <w:rFonts w:ascii="Times New Roman" w:hAnsi="Times New Roman"/>
+          <w:sz w:val="26"/>
+          <w:szCs w:val="26"/>
+        </w:rPr>
+        <w:tab/>
+        <w:t xml:space="preserve">G. Chodak, “Artificial Intelligence in E-Commerce,” in </w:t>
+      </w:r>
+      <w:r>
+        <w:rPr>
+          <w:rFonts w:ascii="Times New Roman" w:hAnsi="Times New Roman"/>
           <w:i/>
           <w:iCs/>
           <w:sz w:val="26"/>
           <w:szCs w:val="26"/>
         </w:rPr>
-        <w:t>Pattern Recognition Letters</w:t>
-      </w:r>
-      <w:r>
-        <w:rPr>
-          <w:sz w:val="26"/>
-          <w:szCs w:val="26"/>
-        </w:rPr>
-        <w:t xml:space="preserve">, Vol. </w:t>
-      </w:r>
-      <w:r>
-        <w:rPr>
-          <w:rStyle w:val="citation-47"/>
-          <w:rFonts w:eastAsiaTheme="majorEastAsia"/>
-          <w:sz w:val="26"/>
-          <w:szCs w:val="26"/>
-        </w:rPr>
-        <w:t xml:space="preserve">27, No. 8, 2006, pp. 861-874. </w:t>
-      </w:r>
-    </w:p>
-    <w:p>
-      <w:pPr>
-        <w:pStyle w:val="NormalWeb"/>
+        <w:t>The Future of E-commerce</w:t>
+      </w:r>
+      <w:r>
+        <w:rPr>
+          <w:rFonts w:ascii="Times New Roman" w:hAnsi="Times New Roman"/>
+          <w:sz w:val="26"/>
+          <w:szCs w:val="26"/>
+        </w:rPr>
+        <w:t>, Cham: Springer Nature Switzerland, 2024, pp. 187–233. doi: 10.1007/978-3-031-55225-0_7.</w:t>
+      </w:r>
+    </w:p>
+    <w:p>
+      <w:pPr>
+        <w:pStyle w:val="Bibliography"/>
         <w:spacing w:line="360" w:lineRule="auto"/>
-        <w:rPr>
-          <w:sz w:val="26"/>
-          <w:szCs w:val="26"/>
-        </w:rPr>
-      </w:pPr>
-      <w:r>
-        <w:rPr>
-          <w:sz w:val="26"/>
-          <w:szCs w:val="26"/>
-        </w:rPr>
-        <w:t xml:space="preserve">[5] J. H. Friedman, “Greedy function approximation: A gradient boosting machine,” </w:t>
-      </w:r>
-      <w:r>
-        <w:rPr>
+        <w:jc w:val="both"/>
+        <w:rPr>
+          <w:rFonts w:ascii="Times New Roman" w:hAnsi="Times New Roman"/>
+          <w:sz w:val="26"/>
+          <w:szCs w:val="26"/>
+        </w:rPr>
+      </w:pPr>
+      <w:r>
+        <w:rPr>
+          <w:rFonts w:ascii="Times New Roman" w:hAnsi="Times New Roman"/>
+          <w:sz w:val="26"/>
+          <w:szCs w:val="26"/>
+        </w:rPr>
+        <w:t>[5]</w:t>
+      </w:r>
+      <w:r>
+        <w:rPr>
+          <w:rFonts w:ascii="Times New Roman" w:hAnsi="Times New Roman"/>
+          <w:sz w:val="26"/>
+          <w:szCs w:val="26"/>
+        </w:rPr>
+        <w:tab/>
+        <w:t xml:space="preserve">R. E. Bawack, S. F. Wamba, K. D. A. Carillo, and S. Akter, “Artificial intelligence in E-Commerce: a bibliometric study and literature review,” </w:t>
+      </w:r>
+      <w:r>
+        <w:rPr>
+          <w:rFonts w:ascii="Times New Roman" w:hAnsi="Times New Roman"/>
           <w:i/>
           <w:iCs/>
           <w:sz w:val="26"/>
           <w:szCs w:val="26"/>
         </w:rPr>
-        <w:t>Annals of Statistics</w:t>
-      </w:r>
-      <w:r>
-        <w:rPr>
-          <w:sz w:val="26"/>
-          <w:szCs w:val="26"/>
-        </w:rPr>
-        <w:t xml:space="preserve">, Vol. </w:t>
-      </w:r>
-      <w:r>
-        <w:rPr>
-          <w:rStyle w:val="citation-46"/>
-          <w:rFonts w:eastAsiaTheme="majorEastAsia"/>
-          <w:sz w:val="26"/>
-          <w:szCs w:val="26"/>
-        </w:rPr>
-        <w:t xml:space="preserve">31, 2001, pp. 1189-1232. </w:t>
-      </w:r>
-    </w:p>
-    <w:p>
-      <w:pPr>
-        <w:pStyle w:val="NormalWeb"/>
+        <w:t>Electron. Mark.</w:t>
+      </w:r>
+      <w:r>
+        <w:rPr>
+          <w:rFonts w:ascii="Times New Roman" w:hAnsi="Times New Roman"/>
+          <w:sz w:val="26"/>
+          <w:szCs w:val="26"/>
+        </w:rPr>
+        <w:t>, vol. 32, no. 1, pp. 297–338, Mar. 2022, doi: 10.1007/s12525-022-00537-z.</w:t>
+      </w:r>
+    </w:p>
+    <w:p>
+      <w:pPr>
+        <w:pStyle w:val="Bibliography"/>
         <w:spacing w:line="360" w:lineRule="auto"/>
-        <w:rPr>
-          <w:sz w:val="26"/>
-          <w:szCs w:val="26"/>
-        </w:rPr>
-      </w:pPr>
-      <w:r>
-        <w:rPr>
-          <w:rStyle w:val="citation-45"/>
-          <w:rFonts w:eastAsiaTheme="majorEastAsia"/>
-          <w:sz w:val="26"/>
-          <w:szCs w:val="26"/>
-        </w:rPr>
-        <w:t xml:space="preserve">[6] S. Russell and P. Norvig, </w:t>
-      </w:r>
-      <w:r>
-        <w:rPr>
-          <w:rStyle w:val="citation-45"/>
-          <w:rFonts w:eastAsiaTheme="majorEastAsia"/>
+        <w:jc w:val="both"/>
+        <w:rPr>
+          <w:rFonts w:ascii="Times New Roman" w:hAnsi="Times New Roman"/>
+          <w:sz w:val="26"/>
+          <w:szCs w:val="26"/>
+        </w:rPr>
+      </w:pPr>
+      <w:r>
+        <w:rPr>
+          <w:rFonts w:ascii="Times New Roman" w:hAnsi="Times New Roman"/>
+          <w:sz w:val="26"/>
+          <w:szCs w:val="26"/>
+        </w:rPr>
+        <w:t>[6]</w:t>
+      </w:r>
+      <w:r>
+        <w:rPr>
+          <w:rFonts w:ascii="Times New Roman" w:hAnsi="Times New Roman"/>
+          <w:sz w:val="26"/>
+          <w:szCs w:val="26"/>
+        </w:rPr>
+        <w:tab/>
+        <w:t xml:space="preserve">R. Fedorko, Š. Kráľ, and R. Bačík, “Artificial Intelligence in E-commerce: A Literature Review,” in </w:t>
+      </w:r>
+      <w:r>
+        <w:rPr>
+          <w:rFonts w:ascii="Times New Roman" w:hAnsi="Times New Roman"/>
           <w:i/>
           <w:iCs/>
           <w:sz w:val="26"/>
           <w:szCs w:val="26"/>
         </w:rPr>
-        <w:t>Artificial Intelligence: A Modern Approach</w:t>
-      </w:r>
-      <w:r>
-        <w:rPr>
-          <w:rStyle w:val="citation-45"/>
-          <w:rFonts w:eastAsiaTheme="majorEastAsia"/>
-          <w:sz w:val="26"/>
-          <w:szCs w:val="26"/>
-        </w:rPr>
-        <w:t xml:space="preserve">, 4th Ed., Pearson, 2020. </w:t>
-      </w:r>
-    </w:p>
-    <w:p>
-      <w:pPr>
-        <w:pStyle w:val="NormalWeb"/>
+        <w:t>Congress on Intelligent Systems</w:t>
+      </w:r>
+      <w:r>
+        <w:rPr>
+          <w:rFonts w:ascii="Times New Roman" w:hAnsi="Times New Roman"/>
+          <w:sz w:val="26"/>
+          <w:szCs w:val="26"/>
+        </w:rPr>
+        <w:t xml:space="preserve">, vol. 111, M. Saraswat, H. Sharma, K. Balachandran, J. H. Kim, and J. C. Bansal, Eds., in Lecture Notes on Data Engineering and Communications Technologies, vol. 111. , Singapore: </w:t>
+      </w:r>
+      <w:r>
+        <w:rPr>
+          <w:rFonts w:ascii="Times New Roman" w:hAnsi="Times New Roman"/>
+          <w:sz w:val="26"/>
+          <w:szCs w:val="26"/>
+        </w:rPr>
+        <w:lastRenderedPageBreak/>
+        <w:t>Springer Nature Singapore, 2022, pp. 677–689. doi: 10.1007/978-981-16-9113-3_50.</w:t>
+      </w:r>
+    </w:p>
+    <w:p>
+      <w:pPr>
+        <w:pStyle w:val="Bibliography"/>
         <w:spacing w:line="360" w:lineRule="auto"/>
-        <w:rPr>
-          <w:sz w:val="26"/>
-          <w:szCs w:val="26"/>
-        </w:rPr>
-      </w:pPr>
-      <w:r>
-        <w:rPr>
-          <w:sz w:val="26"/>
-          <w:szCs w:val="26"/>
-        </w:rPr>
-        <w:t xml:space="preserve">[7] C. O. Sakar, S. O. Polat, M. Katircioglu, and Y. Kirmizi, “Real-time prediction of online shoppers' purchasing intention using multilayer perceptron and LSTM recurrent neural networks,” </w:t>
-      </w:r>
-      <w:r>
-        <w:rPr>
+        <w:jc w:val="both"/>
+        <w:rPr>
+          <w:rFonts w:ascii="Times New Roman" w:hAnsi="Times New Roman"/>
+          <w:sz w:val="26"/>
+          <w:szCs w:val="26"/>
+        </w:rPr>
+      </w:pPr>
+      <w:r>
+        <w:rPr>
+          <w:rFonts w:ascii="Times New Roman" w:hAnsi="Times New Roman"/>
+          <w:sz w:val="26"/>
+          <w:szCs w:val="26"/>
+        </w:rPr>
+        <w:t>[7]</w:t>
+      </w:r>
+      <w:r>
+        <w:rPr>
+          <w:rFonts w:ascii="Times New Roman" w:hAnsi="Times New Roman"/>
+          <w:sz w:val="26"/>
+          <w:szCs w:val="26"/>
+        </w:rPr>
+        <w:tab/>
+        <w:t xml:space="preserve">S. Russell and P. Norvig, </w:t>
+      </w:r>
+      <w:r>
+        <w:rPr>
+          <w:rFonts w:ascii="Times New Roman" w:hAnsi="Times New Roman"/>
           <w:i/>
           <w:iCs/>
           <w:sz w:val="26"/>
           <w:szCs w:val="26"/>
         </w:rPr>
-        <w:t>Neural Computing and Applications</w:t>
-      </w:r>
-      <w:r>
-        <w:rPr>
-          <w:sz w:val="26"/>
-          <w:szCs w:val="26"/>
-        </w:rPr>
-        <w:t xml:space="preserve">, Vol. </w:t>
-      </w:r>
-      <w:r>
-        <w:rPr>
-          <w:rStyle w:val="citation-44"/>
-          <w:sz w:val="26"/>
-          <w:szCs w:val="26"/>
-        </w:rPr>
-        <w:t xml:space="preserve">31, No. 10, 2019, pp. 6893-6908. </w:t>
-      </w:r>
-    </w:p>
-    <w:p>
-      <w:pPr>
-        <w:pStyle w:val="NormalWeb"/>
+        <w:t>Artificial Intelligence: A Modern Approach</w:t>
+      </w:r>
+      <w:r>
+        <w:rPr>
+          <w:rFonts w:ascii="Times New Roman" w:hAnsi="Times New Roman"/>
+          <w:sz w:val="26"/>
+          <w:szCs w:val="26"/>
+        </w:rPr>
+        <w:t>, 4th ed. Pearson, 2020.</w:t>
+      </w:r>
+    </w:p>
+    <w:p>
+      <w:pPr>
+        <w:pStyle w:val="Bibliography"/>
         <w:spacing w:line="360" w:lineRule="auto"/>
-        <w:rPr>
-          <w:sz w:val="26"/>
-          <w:szCs w:val="26"/>
-        </w:rPr>
-      </w:pPr>
-      <w:r>
-        <w:rPr>
-          <w:rStyle w:val="citation-43"/>
-          <w:rFonts w:eastAsiaTheme="majorEastAsia"/>
-          <w:sz w:val="26"/>
-          <w:szCs w:val="26"/>
-        </w:rPr>
-        <w:t xml:space="preserve">[8] Andrew Ng, </w:t>
-      </w:r>
-      <w:r>
-        <w:rPr>
-          <w:rStyle w:val="citation-43"/>
-          <w:rFonts w:eastAsiaTheme="majorEastAsia"/>
+        <w:jc w:val="both"/>
+        <w:rPr>
+          <w:rFonts w:ascii="Times New Roman" w:hAnsi="Times New Roman"/>
+          <w:sz w:val="26"/>
+          <w:szCs w:val="26"/>
+        </w:rPr>
+      </w:pPr>
+      <w:r>
+        <w:rPr>
+          <w:rFonts w:ascii="Times New Roman" w:hAnsi="Times New Roman"/>
+          <w:sz w:val="26"/>
+          <w:szCs w:val="26"/>
+        </w:rPr>
+        <w:t>[8]</w:t>
+      </w:r>
+      <w:r>
+        <w:rPr>
+          <w:rFonts w:ascii="Times New Roman" w:hAnsi="Times New Roman"/>
+          <w:sz w:val="26"/>
+          <w:szCs w:val="26"/>
+        </w:rPr>
+        <w:tab/>
+        <w:t xml:space="preserve">R. E. Bucklin and C. Sismeiro, “Click here for Internet insight: Advances in clickstream data analysis in marketing,” </w:t>
+      </w:r>
+      <w:r>
+        <w:rPr>
+          <w:rFonts w:ascii="Times New Roman" w:hAnsi="Times New Roman"/>
           <w:i/>
           <w:iCs/>
           <w:sz w:val="26"/>
           <w:szCs w:val="26"/>
         </w:rPr>
-        <w:t>AI For Everyone - Trí tuệ nhân tạo dành cho mọi người</w:t>
-      </w:r>
-      <w:r>
-        <w:rPr>
-          <w:rStyle w:val="citation-43"/>
-          <w:rFonts w:eastAsiaTheme="majorEastAsia"/>
-          <w:sz w:val="26"/>
-          <w:szCs w:val="26"/>
-        </w:rPr>
-        <w:t xml:space="preserve"> (Bản dịch tiếng Việt). </w:t>
-      </w:r>
-    </w:p>
-    <w:p>
-      <w:pPr>
-        <w:pStyle w:val="NormalWeb"/>
+        <w:t>J. Interact. Mark.</w:t>
+      </w:r>
+      <w:r>
+        <w:rPr>
+          <w:rFonts w:ascii="Times New Roman" w:hAnsi="Times New Roman"/>
+          <w:sz w:val="26"/>
+          <w:szCs w:val="26"/>
+        </w:rPr>
+        <w:t>, vol. 23, no. 1, pp. 35–48, 2009.</w:t>
+      </w:r>
+    </w:p>
+    <w:p>
+      <w:pPr>
+        <w:pStyle w:val="Bibliography"/>
         <w:spacing w:line="360" w:lineRule="auto"/>
-        <w:rPr>
-          <w:sz w:val="26"/>
-          <w:szCs w:val="26"/>
-        </w:rPr>
-      </w:pPr>
-      <w:r>
-        <w:rPr>
-          <w:sz w:val="26"/>
-          <w:szCs w:val="26"/>
-        </w:rPr>
-        <w:lastRenderedPageBreak/>
-        <w:t xml:space="preserve">[9] Khoa Điện tử - Viễn thông, Trường Đại học Khoa học Tự nhiên, ĐHQG-HCM, </w:t>
-      </w:r>
-      <w:r>
-        <w:rPr>
+        <w:jc w:val="both"/>
+        <w:rPr>
+          <w:rFonts w:ascii="Times New Roman" w:hAnsi="Times New Roman"/>
+          <w:sz w:val="26"/>
+          <w:szCs w:val="26"/>
+        </w:rPr>
+      </w:pPr>
+      <w:r>
+        <w:rPr>
+          <w:rFonts w:ascii="Times New Roman" w:hAnsi="Times New Roman"/>
+          <w:sz w:val="26"/>
+          <w:szCs w:val="26"/>
+        </w:rPr>
+        <w:t>[9]</w:t>
+      </w:r>
+      <w:r>
+        <w:rPr>
+          <w:rFonts w:ascii="Times New Roman" w:hAnsi="Times New Roman"/>
+          <w:sz w:val="26"/>
+          <w:szCs w:val="26"/>
+        </w:rPr>
+        <w:tab/>
+        <w:t xml:space="preserve">A. Kumar, G. Kabra, E. K. Mussada, M. K. Dash, and P. S. Rana, “Combined artificial bee colony algorithm and machine learning techniques for prediction of online consumer repurchase intention,” </w:t>
+      </w:r>
+      <w:r>
+        <w:rPr>
+          <w:rFonts w:ascii="Times New Roman" w:hAnsi="Times New Roman"/>
           <w:i/>
           <w:iCs/>
           <w:sz w:val="26"/>
           <w:szCs w:val="26"/>
         </w:rPr>
-        <w:t>Giáo trình Kỹ thuật Học máy và Hệ thống thông minh</w:t>
-      </w:r>
-      <w:r>
-        <w:rPr>
-          <w:sz w:val="26"/>
-          <w:szCs w:val="26"/>
-        </w:rPr>
-        <w:t xml:space="preserve">, TP. </w:t>
-      </w:r>
-      <w:r>
-        <w:rPr>
-          <w:rStyle w:val="citation-42"/>
-          <w:sz w:val="26"/>
-          <w:szCs w:val="26"/>
-        </w:rPr>
-        <w:t xml:space="preserve">Hồ Chí Minh: NXB Đại học Quốc gia TP.HCM, 2025. </w:t>
-      </w:r>
-    </w:p>
-    <w:p>
-      <w:pPr>
-        <w:pStyle w:val="NormalWeb"/>
+        <w:t>Neural Comput. Appl.</w:t>
+      </w:r>
+      <w:r>
+        <w:rPr>
+          <w:rFonts w:ascii="Times New Roman" w:hAnsi="Times New Roman"/>
+          <w:sz w:val="26"/>
+          <w:szCs w:val="26"/>
+        </w:rPr>
+        <w:t>, vol. 31, no. S2, pp. 877–890, Feb. 2019, doi: 10.1007/s00521-017-3047-z.</w:t>
+      </w:r>
+    </w:p>
+    <w:p>
+      <w:pPr>
+        <w:pStyle w:val="Bibliography"/>
         <w:spacing w:line="360" w:lineRule="auto"/>
-        <w:rPr>
-          <w:sz w:val="26"/>
-          <w:szCs w:val="26"/>
-        </w:rPr>
-      </w:pPr>
-      <w:r>
-        <w:rPr>
-          <w:rStyle w:val="citation-41"/>
-          <w:rFonts w:eastAsiaTheme="majorEastAsia"/>
-          <w:sz w:val="26"/>
-          <w:szCs w:val="26"/>
-        </w:rPr>
-        <w:t xml:space="preserve">[10] Vũ Trọng Phụng, Đinh Trần Thi, và Nguyễn Thái Bình, “Ứng dụng các thuật toán Học máy trong việc dự báo hành vi mua hàng của người tiêu dùng trên các nền tảng thương mại điện tử,” </w:t>
-      </w:r>
-      <w:r>
-        <w:rPr>
-          <w:rStyle w:val="citation-41"/>
-          <w:rFonts w:eastAsiaTheme="majorEastAsia"/>
+        <w:jc w:val="both"/>
+        <w:rPr>
+          <w:rFonts w:ascii="Times New Roman" w:hAnsi="Times New Roman"/>
+          <w:sz w:val="26"/>
+          <w:szCs w:val="26"/>
+        </w:rPr>
+      </w:pPr>
+      <w:r>
+        <w:rPr>
+          <w:rFonts w:ascii="Times New Roman" w:hAnsi="Times New Roman"/>
+          <w:sz w:val="26"/>
+          <w:szCs w:val="26"/>
+        </w:rPr>
+        <w:t>[10]</w:t>
+      </w:r>
+      <w:r>
+        <w:rPr>
+          <w:rFonts w:ascii="Times New Roman" w:hAnsi="Times New Roman"/>
+          <w:sz w:val="26"/>
+          <w:szCs w:val="26"/>
+        </w:rPr>
+        <w:tab/>
+        <w:t xml:space="preserve">A. Amin </w:t>
+      </w:r>
+      <w:r>
+        <w:rPr>
+          <w:rFonts w:ascii="Times New Roman" w:hAnsi="Times New Roman"/>
           <w:i/>
           <w:iCs/>
           <w:sz w:val="26"/>
           <w:szCs w:val="26"/>
         </w:rPr>
-        <w:t>Tạp chí Khoa học và Công nghệ Việt Nam</w:t>
-      </w:r>
-      <w:r>
-        <w:rPr>
-          <w:rStyle w:val="citation-41"/>
-          <w:rFonts w:eastAsiaTheme="majorEastAsia"/>
-          <w:sz w:val="26"/>
-          <w:szCs w:val="26"/>
-        </w:rPr>
-        <w:t xml:space="preserve">, 2021. </w:t>
-      </w:r>
-    </w:p>
-    <w:p>
-      <w:pPr>
-        <w:pStyle w:val="NormalWeb"/>
+        <w:t>et al.</w:t>
+      </w:r>
+      <w:r>
+        <w:rPr>
+          <w:rFonts w:ascii="Times New Roman" w:hAnsi="Times New Roman"/>
+          <w:sz w:val="26"/>
+          <w:szCs w:val="26"/>
+        </w:rPr>
+        <w:t xml:space="preserve">, “Comparing Oversampling Techniques to Handle the Class Imbalance Problem: A Customer Churn Prediction Case Study,” </w:t>
+      </w:r>
+      <w:r>
+        <w:rPr>
+          <w:rFonts w:ascii="Times New Roman" w:hAnsi="Times New Roman"/>
+          <w:i/>
+          <w:iCs/>
+          <w:sz w:val="26"/>
+          <w:szCs w:val="26"/>
+        </w:rPr>
+        <w:t>IEEE Access</w:t>
+      </w:r>
+      <w:r>
+        <w:rPr>
+          <w:rFonts w:ascii="Times New Roman" w:hAnsi="Times New Roman"/>
+          <w:sz w:val="26"/>
+          <w:szCs w:val="26"/>
+        </w:rPr>
+        <w:t>, vol. 4, pp. 7940–7957, 2016, doi: 10.1109/ACCESS.2016.2619719.</w:t>
+      </w:r>
+    </w:p>
+    <w:p>
+      <w:pPr>
+        <w:pStyle w:val="Bibliography"/>
         <w:spacing w:line="360" w:lineRule="auto"/>
-        <w:rPr>
-          <w:sz w:val="26"/>
-          <w:szCs w:val="26"/>
-        </w:rPr>
-      </w:pPr>
-      <w:r>
-        <w:rPr>
-          <w:rStyle w:val="citation-40"/>
-          <w:sz w:val="26"/>
-          <w:szCs w:val="26"/>
-        </w:rPr>
-        <w:t xml:space="preserve">[11] Google Analytics Support, “Dimensions and Metrics Explorer,” trực tuyến: </w:t>
-      </w:r>
-      <w:hyperlink r:id="rId32" w:tgtFrame="_blank" w:history="1">
-        <w:r>
-          <w:rPr>
-            <w:rStyle w:val="citation-40"/>
-            <w:color w:val="0000FF"/>
-            <w:sz w:val="26"/>
-            <w:szCs w:val="26"/>
-            <w:u w:val="single"/>
-          </w:rPr>
-          <w:t>https://support.google.com/analytics</w:t>
-        </w:r>
-      </w:hyperlink>
-      <w:r>
-        <w:rPr>
-          <w:rStyle w:val="citation-40"/>
-          <w:sz w:val="26"/>
-          <w:szCs w:val="26"/>
-        </w:rPr>
-        <w:t xml:space="preserve"> (truy cập ngày 08/03/2026</w:t>
-      </w:r>
-      <w:r>
-        <w:rPr>
-          <w:rStyle w:val="citation-40"/>
-          <w:sz w:val="26"/>
-          <w:szCs w:val="26"/>
-        </w:rPr>
-        <w:t xml:space="preserve">). </w:t>
-      </w:r>
-    </w:p>
-    <w:p>
-      <w:pPr>
-        <w:pStyle w:val="NormalWeb"/>
+        <w:jc w:val="both"/>
+        <w:rPr>
+          <w:rFonts w:ascii="Times New Roman" w:hAnsi="Times New Roman"/>
+          <w:sz w:val="26"/>
+          <w:szCs w:val="26"/>
+        </w:rPr>
+      </w:pPr>
+      <w:r>
+        <w:rPr>
+          <w:rFonts w:ascii="Times New Roman" w:hAnsi="Times New Roman"/>
+          <w:sz w:val="26"/>
+          <w:szCs w:val="26"/>
+        </w:rPr>
+        <w:t>[11]</w:t>
+      </w:r>
+      <w:r>
+        <w:rPr>
+          <w:rFonts w:ascii="Times New Roman" w:hAnsi="Times New Roman"/>
+          <w:sz w:val="26"/>
+          <w:szCs w:val="26"/>
+        </w:rPr>
+        <w:tab/>
+        <w:t xml:space="preserve">M. Mujahid </w:t>
+      </w:r>
+      <w:r>
+        <w:rPr>
+          <w:rFonts w:ascii="Times New Roman" w:hAnsi="Times New Roman"/>
+          <w:i/>
+          <w:iCs/>
+          <w:sz w:val="26"/>
+          <w:szCs w:val="26"/>
+        </w:rPr>
+        <w:t>et al.</w:t>
+      </w:r>
+      <w:r>
+        <w:rPr>
+          <w:rFonts w:ascii="Times New Roman" w:hAnsi="Times New Roman"/>
+          <w:sz w:val="26"/>
+          <w:szCs w:val="26"/>
+        </w:rPr>
+        <w:t xml:space="preserve">, “Data oversampling and imbalanced datasets: an investigation of performance for machine learning and feature engineering,” </w:t>
+      </w:r>
+      <w:r>
+        <w:rPr>
+          <w:rFonts w:ascii="Times New Roman" w:hAnsi="Times New Roman"/>
+          <w:i/>
+          <w:iCs/>
+          <w:sz w:val="26"/>
+          <w:szCs w:val="26"/>
+        </w:rPr>
+        <w:t>J. Big Data</w:t>
+      </w:r>
+      <w:r>
+        <w:rPr>
+          <w:rFonts w:ascii="Times New Roman" w:hAnsi="Times New Roman"/>
+          <w:sz w:val="26"/>
+          <w:szCs w:val="26"/>
+        </w:rPr>
+        <w:t>, vol. 11, no. 1, p. 87, Jun. 2024, doi: 10.1186/s40537-024-00943-4.</w:t>
+      </w:r>
+    </w:p>
+    <w:p>
+      <w:pPr>
+        <w:pStyle w:val="Bibliography"/>
         <w:spacing w:line="360" w:lineRule="auto"/>
-        <w:rPr>
-          <w:sz w:val="26"/>
-          <w:szCs w:val="26"/>
-        </w:rPr>
-      </w:pPr>
-      <w:r>
-        <w:rPr>
-          <w:rStyle w:val="citation-39"/>
-          <w:sz w:val="26"/>
-          <w:szCs w:val="26"/>
-        </w:rPr>
-        <w:t xml:space="preserve">[12] UCI Machine Learning Repository, “Online Shoppers Purchasing Intention Dataset,” trực tuyến: </w:t>
-      </w:r>
-      <w:hyperlink r:id="rId33" w:tgtFrame="_blank" w:history="1">
-        <w:r>
-          <w:rPr>
-            <w:rStyle w:val="citation-39"/>
-            <w:color w:val="0000FF"/>
-            <w:sz w:val="26"/>
-            <w:szCs w:val="26"/>
-            <w:u w:val="single"/>
-          </w:rPr>
-          <w:t>https://archive.ics.uci.edu/ml</w:t>
-        </w:r>
-      </w:hyperlink>
-      <w:r>
-        <w:rPr>
-          <w:rStyle w:val="citation-39"/>
-          <w:sz w:val="26"/>
-          <w:szCs w:val="26"/>
-        </w:rPr>
-        <w:t xml:space="preserve"> (truy cập ngày 08/03/2026). </w:t>
-      </w:r>
-    </w:p>
-    <w:p>
-      <w:pPr>
-        <w:pStyle w:val="NormalWeb"/>
-        <w:spacing w:before="0" w:beforeAutospacing="0" w:after="0" w:afterAutospacing="0" w:line="360" w:lineRule="auto"/>
-        <w:jc w:val="center"/>
-        <w:rPr>
-          <w:sz w:val="26"/>
-          <w:szCs w:val="26"/>
-        </w:rPr>
-      </w:pPr>
+        <w:jc w:val="both"/>
+        <w:rPr>
+          <w:rFonts w:ascii="Times New Roman" w:hAnsi="Times New Roman"/>
+          <w:sz w:val="26"/>
+          <w:szCs w:val="26"/>
+        </w:rPr>
+      </w:pPr>
+      <w:r>
+        <w:rPr>
+          <w:rFonts w:ascii="Times New Roman" w:hAnsi="Times New Roman"/>
+          <w:sz w:val="26"/>
+          <w:szCs w:val="26"/>
+        </w:rPr>
+        <w:t>[12]</w:t>
+      </w:r>
+      <w:r>
+        <w:rPr>
+          <w:rFonts w:ascii="Times New Roman" w:hAnsi="Times New Roman"/>
+          <w:sz w:val="26"/>
+          <w:szCs w:val="26"/>
+        </w:rPr>
+        <w:tab/>
+        <w:t>Support G. A., “Dimensions and Metrics Explorer.” [Online]. Available: https://support.google.com/analytics</w:t>
+      </w:r>
+    </w:p>
+    <w:p>
+      <w:pPr>
+        <w:pStyle w:val="Bibliography"/>
+        <w:spacing w:line="360" w:lineRule="auto"/>
+        <w:jc w:val="both"/>
+        <w:rPr>
+          <w:rFonts w:ascii="Times New Roman" w:hAnsi="Times New Roman"/>
+          <w:sz w:val="26"/>
+          <w:szCs w:val="26"/>
+        </w:rPr>
+      </w:pPr>
+      <w:r>
+        <w:rPr>
+          <w:rFonts w:ascii="Times New Roman" w:hAnsi="Times New Roman"/>
+          <w:sz w:val="26"/>
+          <w:szCs w:val="26"/>
+        </w:rPr>
+        <w:t>[13]</w:t>
+      </w:r>
+      <w:r>
+        <w:rPr>
+          <w:rFonts w:ascii="Times New Roman" w:hAnsi="Times New Roman"/>
+          <w:sz w:val="26"/>
+          <w:szCs w:val="26"/>
+        </w:rPr>
+        <w:tab/>
+        <w:t xml:space="preserve">A. Arora, Sakshi, and U. Gupta, “Ensemble Learning for Enhanced Prediction of Online Shoppers’ Intention on Oversampling-Based Reconstructed Data,” in </w:t>
+      </w:r>
+      <w:r>
+        <w:rPr>
+          <w:rFonts w:ascii="Times New Roman" w:hAnsi="Times New Roman"/>
+          <w:i/>
+          <w:iCs/>
+          <w:sz w:val="26"/>
+          <w:szCs w:val="26"/>
+        </w:rPr>
+        <w:t>International Conference on Innovative Computing and Communications</w:t>
+      </w:r>
+      <w:r>
+        <w:rPr>
+          <w:rFonts w:ascii="Times New Roman" w:hAnsi="Times New Roman"/>
+          <w:sz w:val="26"/>
+          <w:szCs w:val="26"/>
+        </w:rPr>
+        <w:t>, vol. 731, A. E. Hassanien, O. Castillo, S. Anand, and A. Jaiswal, Eds., in Lecture Notes in Networks and Systems, vol. 731. , Singapore: Springer Nature Singapore, 2024, pp. 741–752. doi: 10.1007/978-981-99-4071-4_57.</w:t>
+      </w:r>
+    </w:p>
+    <w:p>
+      <w:pPr>
+        <w:pStyle w:val="Bibliography"/>
+        <w:spacing w:line="360" w:lineRule="auto"/>
+        <w:jc w:val="both"/>
+        <w:rPr>
+          <w:rFonts w:ascii="Times New Roman" w:hAnsi="Times New Roman"/>
+          <w:sz w:val="26"/>
+          <w:szCs w:val="26"/>
+        </w:rPr>
+      </w:pPr>
+      <w:r>
+        <w:rPr>
+          <w:rFonts w:ascii="Times New Roman" w:hAnsi="Times New Roman"/>
+          <w:sz w:val="26"/>
+          <w:szCs w:val="26"/>
+        </w:rPr>
+        <w:t>[14]</w:t>
+      </w:r>
+      <w:r>
+        <w:rPr>
+          <w:rFonts w:ascii="Times New Roman" w:hAnsi="Times New Roman"/>
+          <w:sz w:val="26"/>
+          <w:szCs w:val="26"/>
+        </w:rPr>
+        <w:tab/>
+        <w:t xml:space="preserve">J. H. Friedman, “Greedy function approximation: A gradient boosting machine,” </w:t>
+      </w:r>
+      <w:r>
+        <w:rPr>
+          <w:rFonts w:ascii="Times New Roman" w:hAnsi="Times New Roman"/>
+          <w:i/>
+          <w:iCs/>
+          <w:sz w:val="26"/>
+          <w:szCs w:val="26"/>
+        </w:rPr>
+        <w:t>Ann. Stat.</w:t>
+      </w:r>
+      <w:r>
+        <w:rPr>
+          <w:rFonts w:ascii="Times New Roman" w:hAnsi="Times New Roman"/>
+          <w:sz w:val="26"/>
+          <w:szCs w:val="26"/>
+        </w:rPr>
+        <w:t>, vol. 31, pp. 1189–1232, 2001.</w:t>
+      </w:r>
+    </w:p>
+    <w:p>
+      <w:pPr>
+        <w:pStyle w:val="Bibliography"/>
+        <w:spacing w:line="360" w:lineRule="auto"/>
+        <w:jc w:val="both"/>
+        <w:rPr>
+          <w:rFonts w:ascii="Times New Roman" w:hAnsi="Times New Roman"/>
+          <w:sz w:val="26"/>
+          <w:szCs w:val="26"/>
+        </w:rPr>
+      </w:pPr>
+      <w:r>
+        <w:rPr>
+          <w:rFonts w:ascii="Times New Roman" w:hAnsi="Times New Roman"/>
+          <w:sz w:val="26"/>
+          <w:szCs w:val="26"/>
+        </w:rPr>
+        <w:t>[15]</w:t>
+      </w:r>
+      <w:r>
+        <w:rPr>
+          <w:rFonts w:ascii="Times New Roman" w:hAnsi="Times New Roman"/>
+          <w:sz w:val="26"/>
+          <w:szCs w:val="26"/>
+        </w:rPr>
+        <w:tab/>
+        <w:t xml:space="preserve">S. Ahsain and M. Ait Kbir, “Improving Model Performance of the Prediction of Online Shopping Using Oversampling and Feature Selection,” in </w:t>
+      </w:r>
+      <w:r>
+        <w:rPr>
+          <w:rFonts w:ascii="Times New Roman" w:hAnsi="Times New Roman"/>
+          <w:i/>
+          <w:iCs/>
+          <w:sz w:val="26"/>
+          <w:szCs w:val="26"/>
+        </w:rPr>
+        <w:t>International Conference on Advanced Intelligent Systems for Sustainable Development</w:t>
+      </w:r>
+      <w:r>
+        <w:rPr>
+          <w:rFonts w:ascii="Times New Roman" w:hAnsi="Times New Roman"/>
+          <w:sz w:val="26"/>
+          <w:szCs w:val="26"/>
+        </w:rPr>
+        <w:t xml:space="preserve">, vol. 637, J. Kacprzyk, M. Ezziyyani, and V. E. Balas, Eds., in Lecture Notes in </w:t>
+      </w:r>
+      <w:r>
+        <w:rPr>
+          <w:rFonts w:ascii="Times New Roman" w:hAnsi="Times New Roman"/>
+          <w:sz w:val="26"/>
+          <w:szCs w:val="26"/>
+        </w:rPr>
+        <w:lastRenderedPageBreak/>
+        <w:t>Networks and Systems, vol. 637. , Cham: Springer Nature Switzerland, 2023, pp. 578–586. doi: 10.1007/978-3-031-26384-2_50.</w:t>
+      </w:r>
+    </w:p>
+    <w:p>
+      <w:pPr>
+        <w:pStyle w:val="Bibliography"/>
+        <w:spacing w:line="360" w:lineRule="auto"/>
+        <w:jc w:val="both"/>
+        <w:rPr>
+          <w:rFonts w:ascii="Times New Roman" w:hAnsi="Times New Roman"/>
+          <w:sz w:val="26"/>
+          <w:szCs w:val="26"/>
+        </w:rPr>
+      </w:pPr>
+      <w:r>
+        <w:rPr>
+          <w:rFonts w:ascii="Times New Roman" w:hAnsi="Times New Roman"/>
+          <w:sz w:val="26"/>
+          <w:szCs w:val="26"/>
+        </w:rPr>
+        <w:t>[16]</w:t>
+      </w:r>
+      <w:r>
+        <w:rPr>
+          <w:rFonts w:ascii="Times New Roman" w:hAnsi="Times New Roman"/>
+          <w:sz w:val="26"/>
+          <w:szCs w:val="26"/>
+        </w:rPr>
+        <w:tab/>
+      </w:r>
+      <w:r>
+        <w:rPr>
+          <w:rFonts w:ascii="Times New Roman" w:hAnsi="Times New Roman"/>
+          <w:i/>
+          <w:iCs/>
+          <w:sz w:val="26"/>
+          <w:szCs w:val="26"/>
+        </w:rPr>
+        <w:t>Khoa Điện tử - Viễn thông, Trường Đại học Khoa học Tự nhiên, ĐHQG-HCM, Giáo trình Kỹ thuật Học máy và Hệ thống thông minh, TP</w:t>
+      </w:r>
+      <w:r>
+        <w:rPr>
+          <w:rFonts w:ascii="Times New Roman" w:hAnsi="Times New Roman"/>
+          <w:sz w:val="26"/>
+          <w:szCs w:val="26"/>
+        </w:rPr>
+        <w:t>. Hồ Chí Minh: NXB Đại học Quốc gia TP.HCM, 2025.</w:t>
+      </w:r>
+    </w:p>
+    <w:p>
+      <w:pPr>
+        <w:pStyle w:val="Bibliography"/>
+        <w:spacing w:line="360" w:lineRule="auto"/>
+        <w:jc w:val="both"/>
+        <w:rPr>
+          <w:rFonts w:ascii="Times New Roman" w:hAnsi="Times New Roman"/>
+          <w:sz w:val="26"/>
+          <w:szCs w:val="26"/>
+        </w:rPr>
+      </w:pPr>
+      <w:r>
+        <w:rPr>
+          <w:rFonts w:ascii="Times New Roman" w:hAnsi="Times New Roman"/>
+          <w:sz w:val="26"/>
+          <w:szCs w:val="26"/>
+        </w:rPr>
+        <w:t>[17]</w:t>
+      </w:r>
+      <w:r>
+        <w:rPr>
+          <w:rFonts w:ascii="Times New Roman" w:hAnsi="Times New Roman"/>
+          <w:sz w:val="26"/>
+          <w:szCs w:val="26"/>
+        </w:rPr>
+        <w:tab/>
+        <w:t xml:space="preserve">Md. S. Satu and S. F. Islam, “Modeling online customer purchase intention behavior applying different feature engineering and classification techniques,” </w:t>
+      </w:r>
+      <w:r>
+        <w:rPr>
+          <w:rFonts w:ascii="Times New Roman" w:hAnsi="Times New Roman"/>
+          <w:i/>
+          <w:iCs/>
+          <w:sz w:val="26"/>
+          <w:szCs w:val="26"/>
+        </w:rPr>
+        <w:t>Discov. Artif. Intell.</w:t>
+      </w:r>
+      <w:r>
+        <w:rPr>
+          <w:rFonts w:ascii="Times New Roman" w:hAnsi="Times New Roman"/>
+          <w:sz w:val="26"/>
+          <w:szCs w:val="26"/>
+        </w:rPr>
+        <w:t>, vol. 3, no. 1, p. 36, Nov. 2023, doi: 10.1007/s44163-023-00086-0.</w:t>
+      </w:r>
+    </w:p>
+    <w:p>
+      <w:pPr>
+        <w:pStyle w:val="Bibliography"/>
+        <w:spacing w:line="360" w:lineRule="auto"/>
+        <w:jc w:val="both"/>
+        <w:rPr>
+          <w:rFonts w:ascii="Times New Roman" w:hAnsi="Times New Roman"/>
+          <w:sz w:val="26"/>
+          <w:szCs w:val="26"/>
+        </w:rPr>
+      </w:pPr>
+      <w:r>
+        <w:rPr>
+          <w:rFonts w:ascii="Times New Roman" w:hAnsi="Times New Roman"/>
+          <w:sz w:val="26"/>
+          <w:szCs w:val="26"/>
+        </w:rPr>
+        <w:t>[18]</w:t>
+      </w:r>
+      <w:r>
+        <w:rPr>
+          <w:rFonts w:ascii="Times New Roman" w:hAnsi="Times New Roman"/>
+          <w:sz w:val="26"/>
+          <w:szCs w:val="26"/>
+        </w:rPr>
+        <w:tab/>
+        <w:t>J. MacQueen, “Multivariate observations,” 1967.</w:t>
+      </w:r>
+    </w:p>
+    <w:p>
+      <w:pPr>
+        <w:pStyle w:val="Bibliography"/>
+        <w:spacing w:line="360" w:lineRule="auto"/>
+        <w:jc w:val="both"/>
+        <w:rPr>
+          <w:rFonts w:ascii="Times New Roman" w:hAnsi="Times New Roman"/>
+          <w:sz w:val="26"/>
+          <w:szCs w:val="26"/>
+        </w:rPr>
+      </w:pPr>
+      <w:r>
+        <w:rPr>
+          <w:rFonts w:ascii="Times New Roman" w:hAnsi="Times New Roman"/>
+          <w:sz w:val="26"/>
+          <w:szCs w:val="26"/>
+        </w:rPr>
+        <w:t>[19]</w:t>
+      </w:r>
+      <w:r>
+        <w:rPr>
+          <w:rFonts w:ascii="Times New Roman" w:hAnsi="Times New Roman"/>
+          <w:sz w:val="26"/>
+          <w:szCs w:val="26"/>
+        </w:rPr>
+        <w:tab/>
+        <w:t xml:space="preserve">T. Cover and P. Hart, “Nearest neighbor pattern classification,” </w:t>
+      </w:r>
+      <w:r>
+        <w:rPr>
+          <w:rFonts w:ascii="Times New Roman" w:hAnsi="Times New Roman"/>
+          <w:i/>
+          <w:iCs/>
+          <w:sz w:val="26"/>
+          <w:szCs w:val="26"/>
+        </w:rPr>
+        <w:t>IEEE Trans. Inf. Theory</w:t>
+      </w:r>
+      <w:r>
+        <w:rPr>
+          <w:rFonts w:ascii="Times New Roman" w:hAnsi="Times New Roman"/>
+          <w:sz w:val="26"/>
+          <w:szCs w:val="26"/>
+        </w:rPr>
+        <w:t>, vol. 13, no. 1, pp. 21–27, 1967.</w:t>
+      </w:r>
+    </w:p>
+    <w:p>
+      <w:pPr>
+        <w:pStyle w:val="Bibliography"/>
+        <w:spacing w:line="360" w:lineRule="auto"/>
+        <w:jc w:val="both"/>
+        <w:rPr>
+          <w:rFonts w:ascii="Times New Roman" w:hAnsi="Times New Roman"/>
+          <w:sz w:val="26"/>
+          <w:szCs w:val="26"/>
+        </w:rPr>
+      </w:pPr>
+      <w:r>
+        <w:rPr>
+          <w:rFonts w:ascii="Times New Roman" w:hAnsi="Times New Roman"/>
+          <w:sz w:val="26"/>
+          <w:szCs w:val="26"/>
+        </w:rPr>
+        <w:t>[20]</w:t>
+      </w:r>
+      <w:r>
+        <w:rPr>
+          <w:rFonts w:ascii="Times New Roman" w:hAnsi="Times New Roman"/>
+          <w:sz w:val="26"/>
+          <w:szCs w:val="26"/>
+        </w:rPr>
+        <w:tab/>
+        <w:t>U. C. I. M. L. Repository, “Online Shoppers Purchasing Intention Dataset.” [Online]. Available: https://archive.ics.uci.edu/ml</w:t>
+      </w:r>
+    </w:p>
+    <w:p>
+      <w:pPr>
+        <w:pStyle w:val="Bibliography"/>
+        <w:spacing w:line="360" w:lineRule="auto"/>
+        <w:jc w:val="both"/>
+        <w:rPr>
+          <w:rFonts w:ascii="Times New Roman" w:hAnsi="Times New Roman"/>
+          <w:sz w:val="26"/>
+          <w:szCs w:val="26"/>
+        </w:rPr>
+      </w:pPr>
+      <w:r>
+        <w:rPr>
+          <w:rFonts w:ascii="Times New Roman" w:hAnsi="Times New Roman"/>
+          <w:sz w:val="26"/>
+          <w:szCs w:val="26"/>
+        </w:rPr>
+        <w:t>[21]</w:t>
+      </w:r>
+      <w:r>
+        <w:rPr>
+          <w:rFonts w:ascii="Times New Roman" w:hAnsi="Times New Roman"/>
+          <w:sz w:val="26"/>
+          <w:szCs w:val="26"/>
+        </w:rPr>
+        <w:tab/>
+        <w:t xml:space="preserve">D. Poel and W. Buckinx, “Predicting online-purchasing behaviour at an electronic-commerce web site using clickstream data,” </w:t>
+      </w:r>
+      <w:r>
+        <w:rPr>
+          <w:rFonts w:ascii="Times New Roman" w:hAnsi="Times New Roman"/>
+          <w:i/>
+          <w:iCs/>
+          <w:sz w:val="26"/>
+          <w:szCs w:val="26"/>
+        </w:rPr>
+        <w:t>J. Bus. Res.</w:t>
+      </w:r>
+      <w:r>
+        <w:rPr>
+          <w:rFonts w:ascii="Times New Roman" w:hAnsi="Times New Roman"/>
+          <w:sz w:val="26"/>
+          <w:szCs w:val="26"/>
+        </w:rPr>
+        <w:t>, vol. 58, no. 9, pp. 1173–1180, 2005.</w:t>
+      </w:r>
+    </w:p>
+    <w:p>
+      <w:pPr>
+        <w:pStyle w:val="Bibliography"/>
+        <w:spacing w:line="360" w:lineRule="auto"/>
+        <w:jc w:val="both"/>
+        <w:rPr>
+          <w:rFonts w:ascii="Times New Roman" w:hAnsi="Times New Roman"/>
+          <w:sz w:val="26"/>
+          <w:szCs w:val="26"/>
+        </w:rPr>
+      </w:pPr>
+      <w:r>
+        <w:rPr>
+          <w:rFonts w:ascii="Times New Roman" w:hAnsi="Times New Roman"/>
+          <w:sz w:val="26"/>
+          <w:szCs w:val="26"/>
+        </w:rPr>
+        <w:t>[22]</w:t>
+      </w:r>
+      <w:r>
+        <w:rPr>
+          <w:rFonts w:ascii="Times New Roman" w:hAnsi="Times New Roman"/>
+          <w:sz w:val="26"/>
+          <w:szCs w:val="26"/>
+        </w:rPr>
+        <w:tab/>
+        <w:t xml:space="preserve">F. Waldmann, G. Nápoles, and Y. Salgueiro, “Prediction of cart abandonment using imbalanced clickstream data in online shopping,” </w:t>
+      </w:r>
+      <w:r>
+        <w:rPr>
+          <w:rFonts w:ascii="Times New Roman" w:hAnsi="Times New Roman"/>
+          <w:i/>
+          <w:iCs/>
+          <w:sz w:val="26"/>
+          <w:szCs w:val="26"/>
+        </w:rPr>
+        <w:t>Electron. Commer. Res.</w:t>
+      </w:r>
+      <w:r>
+        <w:rPr>
+          <w:rFonts w:ascii="Times New Roman" w:hAnsi="Times New Roman"/>
+          <w:sz w:val="26"/>
+          <w:szCs w:val="26"/>
+        </w:rPr>
+        <w:t>, Jul. 2025, doi: 10.1007/s10660-025-10021-3.</w:t>
+      </w:r>
+    </w:p>
+    <w:p>
+      <w:pPr>
+        <w:pStyle w:val="Bibliography"/>
+        <w:spacing w:line="360" w:lineRule="auto"/>
+        <w:jc w:val="both"/>
+        <w:rPr>
+          <w:rFonts w:ascii="Times New Roman" w:hAnsi="Times New Roman"/>
+          <w:sz w:val="26"/>
+          <w:szCs w:val="26"/>
+        </w:rPr>
+      </w:pPr>
+      <w:r>
+        <w:rPr>
+          <w:rFonts w:ascii="Times New Roman" w:hAnsi="Times New Roman"/>
+          <w:sz w:val="26"/>
+          <w:szCs w:val="26"/>
+        </w:rPr>
+        <w:t>[23]</w:t>
+      </w:r>
+      <w:r>
+        <w:rPr>
+          <w:rFonts w:ascii="Times New Roman" w:hAnsi="Times New Roman"/>
+          <w:sz w:val="26"/>
+          <w:szCs w:val="26"/>
+        </w:rPr>
+        <w:tab/>
+        <w:t xml:space="preserve">L. Breiman, “Random Forests,” </w:t>
+      </w:r>
+      <w:r>
+        <w:rPr>
+          <w:rFonts w:ascii="Times New Roman" w:hAnsi="Times New Roman"/>
+          <w:i/>
+          <w:iCs/>
+          <w:sz w:val="26"/>
+          <w:szCs w:val="26"/>
+        </w:rPr>
+        <w:t>Mach. Learn.</w:t>
+      </w:r>
+      <w:r>
+        <w:rPr>
+          <w:rFonts w:ascii="Times New Roman" w:hAnsi="Times New Roman"/>
+          <w:sz w:val="26"/>
+          <w:szCs w:val="26"/>
+        </w:rPr>
+        <w:t>, vol. 45, no. 1, pp. 5–32, 2001.</w:t>
+      </w:r>
+    </w:p>
+    <w:p>
+      <w:pPr>
+        <w:pStyle w:val="Bibliography"/>
+        <w:spacing w:line="360" w:lineRule="auto"/>
+        <w:jc w:val="both"/>
+        <w:rPr>
+          <w:rFonts w:ascii="Times New Roman" w:hAnsi="Times New Roman"/>
+          <w:sz w:val="26"/>
+          <w:szCs w:val="26"/>
+        </w:rPr>
+      </w:pPr>
+      <w:r>
+        <w:rPr>
+          <w:rFonts w:ascii="Times New Roman" w:hAnsi="Times New Roman"/>
+          <w:sz w:val="26"/>
+          <w:szCs w:val="26"/>
+        </w:rPr>
+        <w:t>[24]</w:t>
+      </w:r>
+      <w:r>
+        <w:rPr>
+          <w:rFonts w:ascii="Times New Roman" w:hAnsi="Times New Roman"/>
+          <w:sz w:val="26"/>
+          <w:szCs w:val="26"/>
+        </w:rPr>
+        <w:tab/>
+        <w:t xml:space="preserve">C. O. Sakar, S. O. Polat, M. Katircioglu, and Y. Kirmizi, “Real-time prediction of online shoppers’ purchasing intention using multilayer perceptron and LSTM recurrent neural networks,” </w:t>
+      </w:r>
+      <w:r>
+        <w:rPr>
+          <w:rFonts w:ascii="Times New Roman" w:hAnsi="Times New Roman"/>
+          <w:i/>
+          <w:iCs/>
+          <w:sz w:val="26"/>
+          <w:szCs w:val="26"/>
+        </w:rPr>
+        <w:t>Neural Comput. Appl.</w:t>
+      </w:r>
+      <w:r>
+        <w:rPr>
+          <w:rFonts w:ascii="Times New Roman" w:hAnsi="Times New Roman"/>
+          <w:sz w:val="26"/>
+          <w:szCs w:val="26"/>
+        </w:rPr>
+        <w:t>, vol. 31, no. 10, pp. 6893–6908, 2019.</w:t>
+      </w:r>
+    </w:p>
+    <w:p>
+      <w:pPr>
+        <w:pStyle w:val="Bibliography"/>
+        <w:spacing w:line="360" w:lineRule="auto"/>
+        <w:jc w:val="both"/>
+        <w:rPr>
+          <w:rFonts w:ascii="Times New Roman" w:hAnsi="Times New Roman"/>
+          <w:sz w:val="26"/>
+          <w:szCs w:val="26"/>
+        </w:rPr>
+      </w:pPr>
+      <w:r>
+        <w:rPr>
+          <w:rFonts w:ascii="Times New Roman" w:hAnsi="Times New Roman"/>
+          <w:sz w:val="26"/>
+          <w:szCs w:val="26"/>
+        </w:rPr>
+        <w:t>[25]</w:t>
+      </w:r>
+      <w:r>
+        <w:rPr>
+          <w:rFonts w:ascii="Times New Roman" w:hAnsi="Times New Roman"/>
+          <w:sz w:val="26"/>
+          <w:szCs w:val="26"/>
+        </w:rPr>
+        <w:tab/>
+        <w:t xml:space="preserve">S. Gochhait </w:t>
+      </w:r>
+      <w:r>
+        <w:rPr>
+          <w:rFonts w:ascii="Times New Roman" w:hAnsi="Times New Roman"/>
+          <w:i/>
+          <w:iCs/>
+          <w:sz w:val="26"/>
+          <w:szCs w:val="26"/>
+        </w:rPr>
+        <w:t>et al.</w:t>
+      </w:r>
+      <w:r>
+        <w:rPr>
+          <w:rFonts w:ascii="Times New Roman" w:hAnsi="Times New Roman"/>
+          <w:sz w:val="26"/>
+          <w:szCs w:val="26"/>
+        </w:rPr>
+        <w:t xml:space="preserve">, “Role of Artificial Intelligence (AI) in Understanding the Behavior Pattern: A Study on E-Commerce,” in </w:t>
+      </w:r>
+      <w:r>
+        <w:rPr>
+          <w:rFonts w:ascii="Times New Roman" w:hAnsi="Times New Roman"/>
+          <w:i/>
+          <w:iCs/>
+          <w:sz w:val="26"/>
+          <w:szCs w:val="26"/>
+        </w:rPr>
+        <w:t>ICDSMLA 2019</w:t>
+      </w:r>
+      <w:r>
+        <w:rPr>
+          <w:rFonts w:ascii="Times New Roman" w:hAnsi="Times New Roman"/>
+          <w:sz w:val="26"/>
+          <w:szCs w:val="26"/>
+        </w:rPr>
+        <w:t>, vol. 601, A. Kumar, M. Paprzycki, and V. K. Gunjan, Eds., in Lecture Notes in Electrical Engineering, vol. 601. , Singapore: Springer Singapore, 2020, pp. 1600–1606. doi: 10.1007/978-981-15-1420-3_166.</w:t>
+      </w:r>
+    </w:p>
+    <w:p>
+      <w:pPr>
+        <w:pStyle w:val="Bibliography"/>
+        <w:spacing w:line="360" w:lineRule="auto"/>
+        <w:jc w:val="both"/>
+        <w:rPr>
+          <w:rFonts w:ascii="Times New Roman" w:hAnsi="Times New Roman"/>
+          <w:sz w:val="26"/>
+          <w:szCs w:val="26"/>
+        </w:rPr>
+      </w:pPr>
+      <w:r>
+        <w:rPr>
+          <w:rFonts w:ascii="Times New Roman" w:hAnsi="Times New Roman"/>
+          <w:sz w:val="26"/>
+          <w:szCs w:val="26"/>
+        </w:rPr>
+        <w:lastRenderedPageBreak/>
+        <w:t>[26]</w:t>
+      </w:r>
+      <w:r>
+        <w:rPr>
+          <w:rFonts w:ascii="Times New Roman" w:hAnsi="Times New Roman"/>
+          <w:sz w:val="26"/>
+          <w:szCs w:val="26"/>
+        </w:rPr>
+        <w:tab/>
+        <w:t xml:space="preserve">N. V. Chawla, K. W. Bowyer, L. O. Hall, and W. P. Kegelmeyer, “SMOTE: Synthetic Minority Over-sampling Technique,” </w:t>
+      </w:r>
+      <w:r>
+        <w:rPr>
+          <w:rFonts w:ascii="Times New Roman" w:hAnsi="Times New Roman"/>
+          <w:i/>
+          <w:iCs/>
+          <w:sz w:val="26"/>
+          <w:szCs w:val="26"/>
+        </w:rPr>
+        <w:t>J. Artif. Intell. Res.</w:t>
+      </w:r>
+      <w:r>
+        <w:rPr>
+          <w:rFonts w:ascii="Times New Roman" w:hAnsi="Times New Roman"/>
+          <w:sz w:val="26"/>
+          <w:szCs w:val="26"/>
+        </w:rPr>
+        <w:t>, vol. 16, pp. 321–357, 2002.</w:t>
+      </w:r>
+    </w:p>
+    <w:p>
+      <w:pPr>
+        <w:pStyle w:val="Bibliography"/>
+        <w:spacing w:line="360" w:lineRule="auto"/>
+        <w:jc w:val="both"/>
+        <w:rPr>
+          <w:rFonts w:ascii="Times New Roman" w:hAnsi="Times New Roman"/>
+          <w:sz w:val="26"/>
+          <w:szCs w:val="26"/>
+        </w:rPr>
+      </w:pPr>
+      <w:r>
+        <w:rPr>
+          <w:rFonts w:ascii="Times New Roman" w:hAnsi="Times New Roman"/>
+          <w:sz w:val="26"/>
+          <w:szCs w:val="26"/>
+        </w:rPr>
+        <w:t>[27]</w:t>
+      </w:r>
+      <w:r>
+        <w:rPr>
+          <w:rFonts w:ascii="Times New Roman" w:hAnsi="Times New Roman"/>
+          <w:sz w:val="26"/>
+          <w:szCs w:val="26"/>
+        </w:rPr>
+        <w:tab/>
+        <w:t xml:space="preserve">X. Shi, “The Application of Machine Learning in Online Purchasing Intention Prediction,” in </w:t>
+      </w:r>
+      <w:r>
+        <w:rPr>
+          <w:rFonts w:ascii="Times New Roman" w:hAnsi="Times New Roman"/>
+          <w:i/>
+          <w:iCs/>
+          <w:sz w:val="26"/>
+          <w:szCs w:val="26"/>
+        </w:rPr>
+        <w:t>2021 6th International Conference on Big Data and Computing</w:t>
+      </w:r>
+      <w:r>
+        <w:rPr>
+          <w:rFonts w:ascii="Times New Roman" w:hAnsi="Times New Roman"/>
+          <w:sz w:val="26"/>
+          <w:szCs w:val="26"/>
+        </w:rPr>
+        <w:t>, Shenzhen China: ACM, May 2021, pp. 21–29. doi: 10.1145/3469968.3469972.</w:t>
+      </w:r>
+    </w:p>
+    <w:p>
+      <w:pPr>
+        <w:pStyle w:val="Bibliography"/>
+        <w:spacing w:line="360" w:lineRule="auto"/>
+        <w:jc w:val="both"/>
+        <w:rPr>
+          <w:rFonts w:ascii="Times New Roman" w:hAnsi="Times New Roman"/>
+          <w:sz w:val="26"/>
+          <w:szCs w:val="26"/>
+        </w:rPr>
+      </w:pPr>
+      <w:r>
+        <w:rPr>
+          <w:rFonts w:ascii="Times New Roman" w:hAnsi="Times New Roman"/>
+          <w:sz w:val="26"/>
+          <w:szCs w:val="26"/>
+        </w:rPr>
+        <w:t>[28]</w:t>
+      </w:r>
+      <w:r>
+        <w:rPr>
+          <w:rFonts w:ascii="Times New Roman" w:hAnsi="Times New Roman"/>
+          <w:sz w:val="26"/>
+          <w:szCs w:val="26"/>
+        </w:rPr>
+        <w:tab/>
+        <w:t xml:space="preserve">N. Japkowicz and S. Stephen, “The class imbalance problem: A systematic study1,” </w:t>
+      </w:r>
+      <w:r>
+        <w:rPr>
+          <w:rFonts w:ascii="Times New Roman" w:hAnsi="Times New Roman"/>
+          <w:i/>
+          <w:iCs/>
+          <w:sz w:val="26"/>
+          <w:szCs w:val="26"/>
+        </w:rPr>
+        <w:t>Intell. Data Anal.</w:t>
+      </w:r>
+      <w:r>
+        <w:rPr>
+          <w:rFonts w:ascii="Times New Roman" w:hAnsi="Times New Roman"/>
+          <w:sz w:val="26"/>
+          <w:szCs w:val="26"/>
+        </w:rPr>
+        <w:t>, vol. 6, no. 5, pp. 429–449, Nov. 2002, doi: 10.3233/IDA-2002-6504.</w:t>
+      </w:r>
+    </w:p>
+    <w:p>
+      <w:pPr>
+        <w:pStyle w:val="Bibliography"/>
+        <w:spacing w:line="360" w:lineRule="auto"/>
+        <w:jc w:val="both"/>
+        <w:rPr>
+          <w:rFonts w:ascii="Times New Roman" w:hAnsi="Times New Roman"/>
+          <w:sz w:val="26"/>
+          <w:szCs w:val="26"/>
+        </w:rPr>
+      </w:pPr>
+      <w:r>
+        <w:rPr>
+          <w:rFonts w:ascii="Times New Roman" w:hAnsi="Times New Roman"/>
+          <w:sz w:val="26"/>
+          <w:szCs w:val="26"/>
+        </w:rPr>
+        <w:t>[29]</w:t>
+      </w:r>
+      <w:r>
+        <w:rPr>
+          <w:rFonts w:ascii="Times New Roman" w:hAnsi="Times New Roman"/>
+          <w:sz w:val="26"/>
+          <w:szCs w:val="26"/>
+        </w:rPr>
+        <w:tab/>
+        <w:t xml:space="preserve">J. Davis and M. Goadrich, “The relationship between Precision-Recall and ROC curves,” in </w:t>
+      </w:r>
+      <w:r>
+        <w:rPr>
+          <w:rFonts w:ascii="Times New Roman" w:hAnsi="Times New Roman"/>
+          <w:i/>
+          <w:iCs/>
+          <w:sz w:val="26"/>
+          <w:szCs w:val="26"/>
+        </w:rPr>
+        <w:t>Proceedings of the 23rd international conference on Machine learning  - ICML ’06</w:t>
+      </w:r>
+      <w:r>
+        <w:rPr>
+          <w:rFonts w:ascii="Times New Roman" w:hAnsi="Times New Roman"/>
+          <w:sz w:val="26"/>
+          <w:szCs w:val="26"/>
+        </w:rPr>
+        <w:t>, Pittsburgh, Pennsylvania: ACM Press, 2006, pp. 233–240. doi: 10.1145/1143844.1143874.</w:t>
+      </w:r>
+    </w:p>
+    <w:p>
+      <w:pPr>
+        <w:pStyle w:val="Bibliography"/>
+        <w:spacing w:line="360" w:lineRule="auto"/>
+        <w:jc w:val="both"/>
+        <w:rPr>
+          <w:rFonts w:ascii="Times New Roman" w:hAnsi="Times New Roman"/>
+          <w:sz w:val="26"/>
+          <w:szCs w:val="26"/>
+        </w:rPr>
+      </w:pPr>
+      <w:r>
+        <w:rPr>
+          <w:rFonts w:ascii="Times New Roman" w:hAnsi="Times New Roman"/>
+          <w:sz w:val="26"/>
+          <w:szCs w:val="26"/>
+        </w:rPr>
+        <w:t>[30]</w:t>
+      </w:r>
+      <w:r>
+        <w:rPr>
+          <w:rFonts w:ascii="Times New Roman" w:hAnsi="Times New Roman"/>
+          <w:sz w:val="26"/>
+          <w:szCs w:val="26"/>
+        </w:rPr>
+        <w:tab/>
+        <w:t xml:space="preserve">Ngân L. T. B. and Phụng T. K., “Xây dựng mô hình dự đoán điểm chạm của khách hàng dựa trên dữ liệu hành trình mua sắm trực tuyến,” </w:t>
+      </w:r>
+      <w:r>
+        <w:rPr>
+          <w:rFonts w:ascii="Times New Roman" w:hAnsi="Times New Roman"/>
+          <w:i/>
+          <w:iCs/>
+          <w:sz w:val="26"/>
+          <w:szCs w:val="26"/>
+        </w:rPr>
+        <w:t>Tạp Chí Nghiên Cứu Tài Chính - Mark.</w:t>
+      </w:r>
+      <w:r>
+        <w:rPr>
+          <w:rFonts w:ascii="Times New Roman" w:hAnsi="Times New Roman"/>
+          <w:sz w:val="26"/>
+          <w:szCs w:val="26"/>
+        </w:rPr>
+        <w:t>, vol. 16, no. 6, pp. 42–54, Jan. 2026, doi: 10.52932/jfmr.v16i06.882.</w:t>
+      </w:r>
+    </w:p>
+    <w:p>
+      <w:pPr>
+        <w:pStyle w:val="Bibliography"/>
+        <w:spacing w:line="360" w:lineRule="auto"/>
+        <w:jc w:val="both"/>
+        <w:rPr>
+          <w:rFonts w:ascii="Times New Roman" w:hAnsi="Times New Roman"/>
+          <w:sz w:val="26"/>
+          <w:szCs w:val="26"/>
+        </w:rPr>
+      </w:pPr>
+      <w:r>
+        <w:rPr>
+          <w:rFonts w:ascii="Times New Roman" w:hAnsi="Times New Roman"/>
+          <w:sz w:val="26"/>
+          <w:szCs w:val="26"/>
+        </w:rPr>
+        <w:t>[31]</w:t>
+      </w:r>
+      <w:r>
+        <w:rPr>
+          <w:rFonts w:ascii="Times New Roman" w:hAnsi="Times New Roman"/>
+          <w:sz w:val="26"/>
+          <w:szCs w:val="26"/>
+        </w:rPr>
+        <w:tab/>
+        <w:t xml:space="preserve">T. Chen and C. Guestrin, “XGBoost: A Scalable Tree Boosting System,” in </w:t>
+      </w:r>
+      <w:r>
+        <w:rPr>
+          <w:rFonts w:ascii="Times New Roman" w:hAnsi="Times New Roman"/>
+          <w:i/>
+          <w:iCs/>
+          <w:sz w:val="26"/>
+          <w:szCs w:val="26"/>
+        </w:rPr>
+        <w:t>Proc. of the 22nd ACM SIGKDD International Conference on Knowledge Discovery and Data Mining</w:t>
+      </w:r>
+      <w:r>
+        <w:rPr>
+          <w:rFonts w:ascii="Times New Roman" w:hAnsi="Times New Roman"/>
+          <w:sz w:val="26"/>
+          <w:szCs w:val="26"/>
+        </w:rPr>
+        <w:t>, 2016, pp. 785–794.</w:t>
+      </w:r>
+    </w:p>
+    <w:p>
+      <w:pPr>
+        <w:spacing w:line="360" w:lineRule="auto"/>
+        <w:jc w:val="both"/>
+        <w:rPr>
+          <w:rFonts w:ascii="Times New Roman" w:hAnsi="Times New Roman"/>
+          <w:b/>
+          <w:sz w:val="26"/>
+          <w:szCs w:val="26"/>
+        </w:rPr>
+      </w:pPr>
+      <w:r>
+        <w:rPr>
+          <w:rFonts w:ascii="Times New Roman" w:hAnsi="Times New Roman"/>
+          <w:b/>
+          <w:sz w:val="26"/>
+          <w:szCs w:val="26"/>
+        </w:rPr>
+        <w:fldChar w:fldCharType="end"/>
+      </w:r>
     </w:p>
     <w:sectPr>
       <w:pgSz w:w="11909" w:h="16834" w:code="9"/>
@@ -49818,6 +50831,32 @@
     <w:basedOn w:val="DefaultParagraphFont"/>
     <w:rsid w:val="00DA52B5"/>
   </w:style>
+  <w:style w:type="character" w:styleId="Hyperlink">
+    <w:name w:val="Hyperlink"/>
+    <w:basedOn w:val="DefaultParagraphFont"/>
+    <w:uiPriority w:val="99"/>
+    <w:semiHidden/>
+    <w:unhideWhenUsed/>
+    <w:rsid w:val="00ED4F1C"/>
+    <w:rPr>
+      <w:color w:val="0000FF"/>
+      <w:u w:val="single"/>
+    </w:rPr>
+  </w:style>
+  <w:style w:type="paragraph" w:styleId="Bibliography">
+    <w:name w:val="Bibliography"/>
+    <w:basedOn w:val="Normal"/>
+    <w:next w:val="Normal"/>
+    <w:uiPriority w:val="37"/>
+    <w:unhideWhenUsed/>
+    <w:rsid w:val="00993052"/>
+    <w:pPr>
+      <w:tabs>
+        <w:tab w:val="left" w:pos="504"/>
+      </w:tabs>
+      <w:ind w:left="504" w:hanging="504"/>
+    </w:pPr>
+  </w:style>
 </w:styles>
 </file>
 
@@ -50121,7 +51160,7 @@
 </file>
 
 <file path=customXml/itemProps1.xml><?xml version="1.0" encoding="utf-8"?>
-<ds:datastoreItem xmlns:ds="http://schemas.openxmlformats.org/officeDocument/2006/customXml" ds:itemID="{AA402605-6CAE-4649-8ED5-A0589F9D29CA}">
+<ds:datastoreItem xmlns:ds="http://schemas.openxmlformats.org/officeDocument/2006/customXml" ds:itemID="{7C67C685-083D-4663-8BFB-189DDA384FC6}">
   <ds:schemaRefs>
     <ds:schemaRef ds:uri="http://schemas.openxmlformats.org/officeDocument/2006/bibliography"/>
   </ds:schemaRefs>

</xml_diff>